<commit_message>
docs: identify independent author and acknowledge undergraduate education
</commit_message>
<xml_diff>
--- a/docs/论文/补天多轮经验机制-IEEE.docx
+++ b/docs/论文/补天多轮经验机制-IEEE.docx
@@ -46,7 +46,7 @@
           <w:sz w:val="20"/>
           <w:szCs w:val="20"/>
         </w:rPr>
-        <w:t xml:space="preserve">作者及单位：待填写</w:t>
+        <w:t xml:space="preserve">许伟｜独立研究者，中国｜盐城工学院工学学士</w:t>
       </w:r>
     </w:p>
     <w:p>
@@ -77,6 +77,41 @@
           <w:szCs w:val="18"/>
         </w:rPr>
         <w:t xml:space="preserve">关键词—智能体记忆；版本约束；经验复用；多轮实验；消融分析</w:t>
+      </w:r>
+    </w:p>
+    <w:p>
+      <w:pPr>
+        <w:pStyle w:val="Heading2"/>
+        <w:keepNext/>
+        <w:keepLines/>
+        <w:spacing w:after="70" w:before="140"/>
+        <w:jc w:val="center"/>
+      </w:pPr>
+      <w:r>
+        <w:rPr>
+          <w:rFonts w:ascii="Times New Roman" w:cs="Times New Roman" w:eastAsia="黑体" w:hAnsi="Times New Roman"/>
+          <w:b/>
+          <w:bCs/>
+          <w:color w:val="000000"/>
+          <w:sz w:val="20"/>
+          <w:szCs w:val="20"/>
+        </w:rPr>
+        <w:t xml:space="preserve">作者与致谢</w:t>
+      </w:r>
+    </w:p>
+    <w:p>
+      <w:pPr>
+        <w:spacing w:after="40" w:line="240" w:lineRule="auto"/>
+        <w:ind w:firstLine="400"/>
+      </w:pPr>
+      <w:r>
+        <w:rPr>
+          <w:rFonts w:ascii="Times New Roman" w:cs="Times New Roman" w:eastAsia="宋体" w:hAnsi="Times New Roman"/>
+          <w:color w:val="000000"/>
+          <w:sz w:val="18"/>
+          <w:szCs w:val="18"/>
+        </w:rPr>
+        <w:t xml:space="preserve">作者许伟，盐城工学院工学学士。本研究于毕业后独立开展，研究设计、实验执行、数据分析和论文撰写均由作者完成。感谢盐城工学院在学习期间提供的实验室环境、课程训练和知识培养，这些经历为本文研究提供了基础。本文观点、实验结果和结论由作者本人负责，不代表盐城工学院或任何相关实验室的立场。</w:t>
       </w:r>
     </w:p>
     <w:p>

</xml_diff>

<commit_message>
research: explain epistemology implementation and host AI evidence limits
</commit_message>
<xml_diff>
--- a/docs/论文/补天多轮经验机制-IEEE.docx
+++ b/docs/论文/补天多轮经验机制-IEEE.docx
@@ -3492,7 +3492,7 @@
           <w:sz w:val="22"/>
           <w:szCs w:val="22"/>
         </w:rPr>
-        <w:t xml:space="preserve">VI. 讨论与有效性威胁</w:t>
+        <w:t xml:space="preserve">VI. 哲学指导与实现约束</w:t>
       </w:r>
     </w:p>
     <w:p>
@@ -3507,7 +3507,7 @@
           <w:sz w:val="20"/>
           <w:szCs w:val="20"/>
         </w:rPr>
-        <w:t xml:space="preserve">机制收益来自规则复用、版本准入和持久连续性，依赖当前版本已知、源规则可靠及预算充分。断源日程和同构任务会影响效应大小；完全可用资料下，强索引可能与完整策略同样正确且更便宜。独立统计单元只有10个种子，bootstrap区间不能消除分布偏差。条件循环平衡不等于随机盲测，本地时延也受缓存和调度影响。真实用户表达、模糊实体识别、隐式版本变化、恶意来源和自由文本推理均未测试。本研究没有调用大模型，不能证明模型幻觉降低、理解增强或参数自进化。</w:t>
+        <w:t xml:space="preserve">本文以实践—认识—再实践组织经验机制。语言模型输出、权威文章和直觉首先形成待检验主张，实践产生带条件的支持，反例要求修订而不是删除。这里的哲学指导是设计准则，不代替统计证据。来源事件、environment、版本与验收结果分别对应主张的依据、适用范围和检验条件；candidate与warm的区别对应未经实践和已有支持的区别；disputed及版本父链对应反例保护与认识修正。数据库条数、调用次数、文字长度不能独立作为认识增长指标。</w:t>
       </w:r>
     </w:p>
     <w:p>
@@ -3522,7 +3522,7 @@
           <w:sz w:val="20"/>
           <w:szCs w:val="20"/>
         </w:rPr>
-        <w:t xml:space="preserve">经验可为后训练提供候选，但还需要独立准确性复核、去重、隐私处理、训练协议及遗忘评估。用户使用量只有在新增有效独立证据时才增加信息，重复错误可能强化偏差。模型参数容量与隐藏信息保留、监督与幻觉、涌现与思维学习等命题的条件数学讨论保留在配套理论长稿；本实验不提供模型训练证据，不能把条件解释写成已证实结论。</w:t>
+        <w:t xml:space="preserve">认知螺旋在工程上的可测定义为：新输入下复用已检验规则，在条件变化后重新取证，并在后续实践中减少错误或重复劳动。冷启动、稳定复用、显式漂移、断源与重启分别检验这些环节。控制变量和消融用于排查替代解释，unknown用于保留未知。源读取减少而本地时延增加说明方法具有代价边界；不能以哲学叙述排除负结果。当前实验未覆盖自主归纳、隐式语义漂移、置信校准和全部争议处理，哲学目标不能被当成已实现或已验证的事实。</w:t>
       </w:r>
     </w:p>
     <w:p>
@@ -3542,7 +3542,293 @@
           <w:sz w:val="22"/>
           <w:szCs w:val="22"/>
         </w:rPr>
-        <w:t xml:space="preserve">VII. 结论</w:t>
+        <w:t xml:space="preserve">VII. 详细算法实现</w:t>
+      </w:r>
+    </w:p>
+    <w:p>
+      <w:pPr>
+        <w:pStyle w:val="Heading2"/>
+        <w:keepNext/>
+        <w:keepLines/>
+        <w:spacing w:after="70" w:before="140"/>
+      </w:pPr>
+      <w:r>
+        <w:rPr>
+          <w:rFonts w:ascii="Times New Roman" w:cs="Times New Roman" w:eastAsia="黑体" w:hAnsi="Times New Roman"/>
+          <w:b/>
+          <w:bCs/>
+          <w:color w:val="000000"/>
+          <w:sz w:val="20"/>
+          <w:szCs w:val="20"/>
+        </w:rPr>
+        <w:t xml:space="preserve">A. 数据结构与版本提交</w:t>
+      </w:r>
+    </w:p>
+    <w:p>
+      <w:pPr>
+        <w:spacing w:after="40" w:line="240" w:lineRule="auto"/>
+        <w:ind w:firstLine="400"/>
+      </w:pPr>
+      <w:r>
+        <w:rPr>
+          <w:rFonts w:ascii="Times New Roman" w:cs="Times New Roman" w:eastAsia="宋体" w:hAnsi="Times New Roman"/>
+          <w:color w:val="000000"/>
+          <w:sz w:val="20"/>
+          <w:szCs w:val="20"/>
+        </w:rPr>
+        <w:t xml:space="preserve">MemoryStore使用SQLite、WAL和busy_timeout。memories保存当前内容、状态、confidence、weight、环境与source_event_ids；memory_versions保存递增序号、parent_version_id、历史正文、evidence_refs及change_reason；practice_observations保存观察独立键、结果与证据引用，practice_evidence保存摘要去重关系。召回日志和冲突记录独立保存。FTS5表存在，但研究使用的recall_for_decision走LIKE候选路径，不能将其描述为向量检索或假定具有对数查询复杂度。</w:t>
+      </w:r>
+    </w:p>
+    <w:p>
+      <w:pPr>
+        <w:spacing w:after="40" w:line="240" w:lineRule="auto"/>
+        <w:ind w:firstLine="400"/>
+      </w:pPr>
+      <w:r>
+        <w:rPr>
+          <w:rFonts w:ascii="Times New Roman" w:cs="Times New Roman" w:eastAsia="宋体" w:hAnsi="Times New Roman"/>
+          <w:color w:val="000000"/>
+          <w:sz w:val="20"/>
+          <w:szCs w:val="20"/>
+        </w:rPr>
+        <w:t xml:space="preserve">put在SAVEPOINT内同时更新当前记录、全文索引和历史版本。默认父节点为同一经验最新版本；显式父节点必须存在且属于当前memory_id。warm/hot必须带来源事件，来源真实性检查还依赖调用者是否提供source_validator。异常回滚保存点。audit_version_chain按序检查版本连续、父链连接、证据列表类型及最新内容一致性。结构审计不证明正文语义正确。正常服务重开与断电、事务中途崩溃是不同验证对象，本文仅验证前者。</w:t>
+      </w:r>
+    </w:p>
+    <w:p>
+      <w:pPr>
+        <w:pStyle w:val="Heading2"/>
+        <w:keepNext/>
+        <w:keepLines/>
+        <w:spacing w:after="70" w:before="140"/>
+      </w:pPr>
+      <w:r>
+        <w:rPr>
+          <w:rFonts w:ascii="Times New Roman" w:cs="Times New Roman" w:eastAsia="黑体" w:hAnsi="Times New Roman"/>
+          <w:b/>
+          <w:bCs/>
+          <w:color w:val="000000"/>
+          <w:sz w:val="20"/>
+          <w:szCs w:val="20"/>
+        </w:rPr>
+        <w:t xml:space="preserve">B. 算法2：独立实践反馈</w:t>
+      </w:r>
+    </w:p>
+    <w:p>
+      <w:pPr>
+        <w:spacing w:after="40" w:line="240" w:lineRule="auto"/>
+        <w:ind w:firstLine="400"/>
+      </w:pPr>
+      <w:r>
+        <w:rPr>
+          <w:rFonts w:ascii="Times New Roman" w:cs="Times New Roman" w:eastAsia="宋体" w:hAnsi="Times New Roman"/>
+          <w:color w:val="000000"/>
+          <w:sz w:val="20"/>
+          <w:szCs w:val="20"/>
+        </w:rPr>
+        <w:t xml:space="preserve">record_practice_outcome接受success、failure、unknown；independent_key不能为空，success必须有evidence_ref。BEGIN IMMEDIATE后检查观察唯一键、重复成功引用及证据摘要；若提供expected_content_hash，还检查审核期间正文未变化。不存在经验则创建candidate，随后插入实践观察并统计成功数s、失败数f。candidate或pending_validation仅在s≥2且f=0时进入warm；成熟经验遇failure进入disputed并降低confidence、weight。合并来源后put生成新版本、更新技能统计并提交；异常整体回滚。该去重不等同统计独立性，两次成功阈值也不是普遍正确性定理。</w:t>
+      </w:r>
+    </w:p>
+    <w:p>
+      <w:pPr>
+        <w:pStyle w:val="Heading2"/>
+        <w:keepNext/>
+        <w:keepLines/>
+        <w:spacing w:after="70" w:before="140"/>
+      </w:pPr>
+      <w:r>
+        <w:rPr>
+          <w:rFonts w:ascii="Times New Roman" w:cs="Times New Roman" w:eastAsia="黑体" w:hAnsi="Times New Roman"/>
+          <w:b/>
+          <w:bCs/>
+          <w:color w:val="000000"/>
+          <w:sz w:val="20"/>
+          <w:szCs w:val="20"/>
+        </w:rPr>
+        <w:t xml:space="preserve">C. 召回、准入与执行边界</w:t>
+      </w:r>
+    </w:p>
+    <w:p>
+      <w:pPr>
+        <w:spacing w:after="40" w:line="240" w:lineRule="auto"/>
+        <w:ind w:firstLine="400"/>
+      </w:pPr>
+      <w:r>
+        <w:rPr>
+          <w:rFonts w:ascii="Times New Roman" w:cs="Times New Roman" w:eastAsia="宋体" w:hAnsi="Times New Roman"/>
+          <w:color w:val="000000"/>
+          <w:sz w:val="20"/>
+          <w:szCs w:val="20"/>
+        </w:rPr>
+        <w:t xml:space="preserve">ButianService.compose_context先检查task访问权限，再创建ContextComposer、获取成员记忆，在finally关闭句柄。上下文按层和预算组织。研究parse_context逐行寻找RULE后缀并解析JSON，检查实体及版本，仅唯一匹配才用于solve；解析失败、截断、零匹配和冲突都触发源回退，源不可用则unknown。生产服务负责候选，宿主负责版本准入，求解器负责输出计算。LIKE匹配保守为O(ML)，解析为O(B)，历史审计为O(V)，实际常数由实测耗时反映。</w:t>
+      </w:r>
+    </w:p>
+    <w:p>
+      <w:pPr>
+        <w:pStyle w:val="Heading2"/>
+        <w:keepNext/>
+        <w:keepLines/>
+        <w:spacing w:after="70" w:before="140"/>
+      </w:pPr>
+      <w:r>
+        <w:rPr>
+          <w:rFonts w:ascii="Times New Roman" w:cs="Times New Roman" w:eastAsia="黑体" w:hAnsi="Times New Roman"/>
+          <w:b/>
+          <w:bCs/>
+          <w:color w:val="000000"/>
+          <w:sz w:val="20"/>
+          <w:szCs w:val="20"/>
+        </w:rPr>
+        <w:t xml:space="preserve">D. 主实验未覆盖完整生命周期</w:t>
+      </w:r>
+    </w:p>
+    <w:p>
+      <w:pPr>
+        <w:spacing w:after="40" w:line="240" w:lineRule="auto"/>
+        <w:ind w:firstLine="400"/>
+      </w:pPr>
+      <w:r>
+        <w:rPr>
+          <w:rFonts w:ascii="Times New Roman" w:cs="Times New Roman" w:eastAsia="宋体" w:hAnsi="Times New Roman"/>
+          <w:color w:val="000000"/>
+          <w:sz w:val="20"/>
+          <w:szCs w:val="20"/>
+        </w:rPr>
+        <w:t xml:space="preserve">Runner.remember在读到准确合成源后追加evidence_recorded事件，并直接put为warm、confidence=1.0。这是已验证契约的实验适配器，未走完整record_practice_outcome独立实践升级。因此10080次执行支持已知规则的复用、版本准入和持久性，不证明模型自主提出经验、两次独立实践、审核和争议修订全部通过。首次答案在反馈前冻结，错误纠正不覆盖原wrong。新输入每轮改变，写入规则而非当前答案。完整闭环需要另行覆盖生产实践接口与宿主真实行动。</w:t>
+      </w:r>
+    </w:p>
+    <w:p>
+      <w:pPr>
+        <w:pStyle w:val="Heading1"/>
+        <w:keepNext/>
+        <w:keepLines/>
+        <w:spacing w:after="70" w:before="140"/>
+        <w:jc w:val="center"/>
+      </w:pPr>
+      <w:r>
+        <w:rPr>
+          <w:rFonts w:ascii="Times New Roman" w:cs="Times New Roman" w:eastAsia="黑体" w:hAnsi="Times New Roman"/>
+          <w:b/>
+          <w:bCs/>
+          <w:color w:val="000000"/>
+          <w:sz w:val="22"/>
+          <w:szCs w:val="22"/>
+        </w:rPr>
+        <w:t xml:space="preserve">VIII. 宿主AI实测证据与缺口</w:t>
+      </w:r>
+    </w:p>
+    <w:p>
+      <w:pPr>
+        <w:spacing w:after="40" w:line="240" w:lineRule="auto"/>
+        <w:ind w:firstLine="400"/>
+      </w:pPr>
+      <w:r>
+        <w:rPr>
+          <w:rFonts w:ascii="Times New Roman" w:cs="Times New Roman" w:eastAsia="宋体" w:hAnsi="Times New Roman"/>
+          <w:color w:val="000000"/>
+          <w:sz w:val="20"/>
+          <w:szCs w:val="20"/>
+        </w:rPr>
+        <w:t xml:space="preserve">实测分为两个层次。机制层真实调用生产SQLite与上下文接口，不需要模型即可测持久性、资料访问和版本行为；宿主AI层则必须记录模型接收上下文后的真实回答或行动，才能检验AI任务收益。10080次主实验属于前者，模型调用为零。项目另有当前会话宿主AI的15条非盲作答记录，因此不能笼统写成全部研究没有大模型参与。两类证据不能合并样本量，也不能用机制样本数替代AI回答实验。</w:t>
+      </w:r>
+    </w:p>
+    <w:p>
+      <w:pPr>
+        <w:spacing w:after="40" w:line="240" w:lineRule="auto"/>
+        <w:ind w:firstLine="400"/>
+      </w:pPr>
+      <w:r>
+        <w:rPr>
+          <w:rFonts w:ascii="Times New Roman" w:cs="Times New Roman" w:eastAsia="宋体" w:hAnsi="Times New Roman"/>
+          <w:color w:val="000000"/>
+          <w:sz w:val="20"/>
+          <w:szCs w:val="20"/>
+        </w:rPr>
+        <w:t xml:space="preserve">agent-responses.json的execution_kind为actual_model，capture_method为current_agent_authored_tool_payload，prior_answer_exposure为true，model_calls与cost均未知。五类任务各B0/B1/B2回答涉及压力、迁移、版本冲突、统计区间及恢复。记录说明真实宿主参与过探索，但存在先前答案暴露，B2仅召回上下文，未完成实践升级与恢复生命周期。15条回答不等于15次独立模型调用，不能估计经验净收益，也不能以关键词评分代替客观任务校验。</w:t>
+      </w:r>
+    </w:p>
+    <w:p>
+      <w:pPr>
+        <w:spacing w:after="40" w:line="240" w:lineRule="auto"/>
+        <w:ind w:firstLine="400"/>
+      </w:pPr>
+      <w:r>
+        <w:rPr>
+          <w:rFonts w:ascii="Times New Roman" w:cs="Times New Roman" w:eastAsia="宋体" w:hAnsi="Times New Roman"/>
+          <w:color w:val="000000"/>
+          <w:sz w:val="20"/>
+          <w:szCs w:val="20"/>
+        </w:rPr>
+        <w:t xml:space="preserve">确认性实验应在同一宿主AI上逐轮保存可见输入、生产召回原文、首次原始回答、真实工具结果、反馈和经验写回；新轮次更换输入，加入漂移、来源缺失和重启。程序校验数值、文件或执行结果，先冻结答案再揭示反馈。无法清除同会话历史时，应使用等价不同实体任务并披露携带偏差；不能宣称无记忆独立对照。当前没有完成这一确认性实验，因此模型收益结论仍待证，不能用模板生成回答冒充实测。</w:t>
+      </w:r>
+    </w:p>
+    <w:p>
+      <w:pPr>
+        <w:pStyle w:val="Heading1"/>
+        <w:keepNext/>
+        <w:keepLines/>
+        <w:spacing w:after="70" w:before="140"/>
+        <w:jc w:val="center"/>
+      </w:pPr>
+      <w:r>
+        <w:rPr>
+          <w:rFonts w:ascii="Times New Roman" w:cs="Times New Roman" w:eastAsia="黑体" w:hAnsi="Times New Roman"/>
+          <w:b/>
+          <w:bCs/>
+          <w:color w:val="000000"/>
+          <w:sz w:val="22"/>
+          <w:szCs w:val="22"/>
+        </w:rPr>
+        <w:t xml:space="preserve">IX. 讨论与有效性威胁</w:t>
+      </w:r>
+    </w:p>
+    <w:p>
+      <w:pPr>
+        <w:spacing w:after="40" w:line="240" w:lineRule="auto"/>
+        <w:ind w:firstLine="400"/>
+      </w:pPr>
+      <w:r>
+        <w:rPr>
+          <w:rFonts w:ascii="Times New Roman" w:cs="Times New Roman" w:eastAsia="宋体" w:hAnsi="Times New Roman"/>
+          <w:color w:val="000000"/>
+          <w:sz w:val="20"/>
+          <w:szCs w:val="20"/>
+        </w:rPr>
+        <w:t xml:space="preserve">机制收益来自规则复用、版本准入和持久连续性，依赖当前版本已知、源规则可靠及预算充分。断源日程和同构任务会影响效应大小；完全可用资料下，强索引可能与完整策略同样正确且更便宜。独立统计单元只有10个种子，bootstrap区间不能消除分布偏差。条件循环平衡不等于随机盲测，本地时延也受缓存和调度影响。真实用户表达、模糊实体识别、隐式版本变化、恶意来源和自由文本推理均未测试。10080次机制主实验未执行模型推理；另有15条非盲宿主AI探索回答，仍不能证明模型幻觉降低、理解增强或参数自进化。</w:t>
+      </w:r>
+    </w:p>
+    <w:p>
+      <w:pPr>
+        <w:spacing w:after="40" w:line="240" w:lineRule="auto"/>
+        <w:ind w:firstLine="400"/>
+      </w:pPr>
+      <w:r>
+        <w:rPr>
+          <w:rFonts w:ascii="Times New Roman" w:cs="Times New Roman" w:eastAsia="宋体" w:hAnsi="Times New Roman"/>
+          <w:color w:val="000000"/>
+          <w:sz w:val="20"/>
+          <w:szCs w:val="20"/>
+        </w:rPr>
+        <w:t xml:space="preserve">经验可为后训练提供候选，但还需要独立准确性复核、去重、隐私处理、训练协议及遗忘评估。用户使用量只有在新增有效独立证据时才增加信息，重复错误可能强化偏差。模型参数容量与隐藏信息保留、监督与幻觉、涌现与思维学习等命题的条件数学讨论保留在配套理论长稿；本实验不提供模型训练证据，不能把条件解释写成已证实结论。</w:t>
+      </w:r>
+    </w:p>
+    <w:p>
+      <w:pPr>
+        <w:pStyle w:val="Heading1"/>
+        <w:keepNext/>
+        <w:keepLines/>
+        <w:spacing w:after="70" w:before="140"/>
+        <w:jc w:val="center"/>
+      </w:pPr>
+      <w:r>
+        <w:rPr>
+          <w:rFonts w:ascii="Times New Roman" w:cs="Times New Roman" w:eastAsia="黑体" w:hAnsi="Times New Roman"/>
+          <w:b/>
+          <w:bCs/>
+          <w:color w:val="000000"/>
+          <w:sz w:val="22"/>
+          <w:szCs w:val="22"/>
+        </w:rPr>
+        <w:t xml:space="preserve">X. 结论</w:t>
       </w:r>
     </w:p>
     <w:p>

</xml_diff>

<commit_message>
docs: detail mathematical implementation contracts and Word appendix
</commit_message>
<xml_diff>
--- a/docs/论文/补天多轮经验机制-IEEE.docx
+++ b/docs/论文/补天多轮经验机制-IEEE.docx
@@ -4676,6 +4676,294 @@
     </w:p>
     <w:p>
       <w:pPr>
+        <w:pStyle w:val="Heading1"/>
+        <w:keepNext/>
+        <w:keepLines/>
+        <w:spacing w:after="70" w:before="140"/>
+        <w:jc w:val="center"/>
+      </w:pPr>
+      <w:r>
+        <w:rPr>
+          <w:rFonts w:ascii="Times New Roman" w:cs="Times New Roman" w:eastAsia="黑体" w:hAnsi="Times New Roman"/>
+          <w:b/>
+          <w:bCs/>
+          <w:color w:val="000000"/>
+          <w:sz w:val="22"/>
+          <w:szCs w:val="22"/>
+        </w:rPr>
+        <w:t xml:space="preserve">附录 C：数学算法的实现契约</w:t>
+      </w:r>
+    </w:p>
+    <w:p>
+      <w:pPr>
+        <w:pStyle w:val="Heading2"/>
+        <w:keepNext/>
+        <w:keepLines/>
+        <w:spacing w:after="70" w:before="140"/>
+      </w:pPr>
+      <w:r>
+        <w:rPr>
+          <w:rFonts w:ascii="Times New Roman" w:cs="Times New Roman" w:eastAsia="黑体" w:hAnsi="Times New Roman"/>
+          <w:b/>
+          <w:bCs/>
+          <w:color w:val="000000"/>
+          <w:sz w:val="20"/>
+          <w:szCs w:val="20"/>
+        </w:rPr>
+        <w:t xml:space="preserve">A. Beta信念和加权证据</w:t>
+      </w:r>
+    </w:p>
+    <w:p>
+      <w:pPr>
+        <w:spacing w:after="40" w:line="240" w:lineRule="auto"/>
+        <w:ind w:firstLine="400"/>
+      </w:pPr>
+      <w:r>
+        <w:rPr>
+          <w:rFonts w:ascii="Times New Roman" w:cs="Times New Roman" w:eastAsia="宋体" w:hAnsi="Times New Roman"/>
+          <w:color w:val="000000"/>
+          <w:sz w:val="20"/>
+          <w:szCs w:val="20"/>
+        </w:rPr>
+        <w:t xml:space="preserve">_unit将输入转为有限的</w:t>
+      </w:r>
+      <w:r>
+        <w:rPr>
+          <w:rFonts w:ascii="Times New Roman" w:cs="Times New Roman" w:eastAsia="Times New Roman" w:hAnsi="Times New Roman"/>
+          <w:sz w:val="16"/>
+          <w:szCs w:val="16"/>
+          <w:vertAlign w:val="superscript"/>
+        </w:rPr>
+        <w:t xml:space="preserve">[0,1]</w:t>
+      </w:r>
+      <w:r>
+        <w:rPr>
+          <w:rFonts w:ascii="Times New Roman" w:cs="Times New Roman" w:eastAsia="宋体" w:hAnsi="Times New Roman"/>
+          <w:color w:val="000000"/>
+          <w:sz w:val="20"/>
+          <w:szCs w:val="20"/>
+        </w:rPr>
+        <w:t xml:space="preserve">浮点数。Beta信念保存正的有限α、β及非负有限观测权重，均值为α/(α+β)，有效样本量为累计观测权重，先验强度为α+β减观测权重；外部直接构造时，后一个派生量并未额外限制为正。update把成功和失败权重分别加到α、β，拒绝负权重和全零更新。bayesian_evidence_update将质量、独立性和环境匹配三项相乘作为权重，乘积为零会报告缺少证据权重；独立性是调用者声明的评价，不由函数自动证明。</w:t>
+      </w:r>
+    </w:p>
+    <w:p>
+      <w:pPr>
+        <w:spacing w:after="40" w:line="240" w:lineRule="auto"/>
+        <w:ind w:firstLine="400"/>
+      </w:pPr>
+      <w:r>
+        <w:rPr>
+          <w:rFonts w:ascii="Times New Roman" w:cs="Times New Roman" w:eastAsia="宋体" w:hAnsi="Times New Roman"/>
+          <w:color w:val="000000"/>
+          <w:sz w:val="20"/>
+          <w:szCs w:val="20"/>
+        </w:rPr>
+        <w:t xml:space="preserve">区间计算使用正则化不完全Beta函数的双尾分位。CDF通过lgamma、log及log1p计算前因子，在(a+1)/(a+b+2)两侧选择正向或互补尾部连分式；连分式使用1e-300下界、3e-14收敛阈值及最多200轮，未收敛抛ArithmeticError。分位在</w:t>
+      </w:r>
+      <w:r>
+        <w:rPr>
+          <w:rFonts w:ascii="Times New Roman" w:cs="Times New Roman" w:eastAsia="Times New Roman" w:hAnsi="Times New Roman"/>
+          <w:sz w:val="16"/>
+          <w:szCs w:val="16"/>
+          <w:vertAlign w:val="superscript"/>
+        </w:rPr>
+        <w:t xml:space="preserve">[0,1]</w:t>
+      </w:r>
+      <w:r>
+        <w:rPr>
+          <w:rFonts w:ascii="Times New Roman" w:cs="Times New Roman" w:eastAsia="宋体" w:hAnsi="Times New Roman"/>
+          <w:color w:val="000000"/>
+          <w:sz w:val="20"/>
+          <w:szCs w:val="20"/>
+        </w:rPr>
+        <w:t xml:space="preserve">上执行90次二分，固定轮数不能消除CDF浮点误差。interval要求置信度属于(0,1]，计算两个分位；这类可信区间依赖Beta建模假设，不是经验正确性的绝对保证。</w:t>
+      </w:r>
+    </w:p>
+    <w:p>
+      <w:pPr>
+        <w:pStyle w:val="Heading2"/>
+        <w:keepNext/>
+        <w:keepLines/>
+        <w:spacing w:after="70" w:before="140"/>
+      </w:pPr>
+      <w:r>
+        <w:rPr>
+          <w:rFonts w:ascii="Times New Roman" w:cs="Times New Roman" w:eastAsia="黑体" w:hAnsi="Times New Roman"/>
+          <w:b/>
+          <w:bCs/>
+          <w:color w:val="000000"/>
+          <w:sz w:val="20"/>
+          <w:szCs w:val="20"/>
+        </w:rPr>
+        <w:t xml:space="preserve">B. 转移与信息增益</w:t>
+      </w:r>
+    </w:p>
+    <w:p>
+      <w:pPr>
+        <w:spacing w:after="40" w:line="240" w:lineRule="auto"/>
+        <w:ind w:firstLine="400"/>
+      </w:pPr>
+      <w:r>
+        <w:rPr>
+          <w:rFonts w:ascii="Times New Roman" w:cs="Times New Roman" w:eastAsia="宋体" w:hAnsi="Times New Roman"/>
+          <w:color w:val="000000"/>
+          <w:sz w:val="20"/>
+          <w:szCs w:val="20"/>
+        </w:rPr>
+        <w:t xml:space="preserve">transition_distribution按显式候选分数归一化，拒绝空集合、负值、非有限值、零总质量及总和溢出，复杂度O(k)。current不参与分布计算，evidence只做单位区间校验，不改变归一结果。entropy要求非空概率序列、各项在</w:t>
+      </w:r>
+      <w:r>
+        <w:rPr>
+          <w:rFonts w:ascii="Times New Roman" w:cs="Times New Roman" w:eastAsia="Times New Roman" w:hAnsi="Times New Roman"/>
+          <w:sz w:val="16"/>
+          <w:szCs w:val="16"/>
+          <w:vertAlign w:val="superscript"/>
+        </w:rPr>
+        <w:t xml:space="preserve">[0,1]</w:t>
+      </w:r>
+      <w:r>
+        <w:rPr>
+          <w:rFonts w:ascii="Times New Roman" w:cs="Times New Roman" w:eastAsia="宋体" w:hAnsi="Times New Roman"/>
+          <w:color w:val="000000"/>
+          <w:sz w:val="20"/>
+          <w:szCs w:val="20"/>
+        </w:rPr>
+        <w:t xml:space="preserve">及总和误差不超过1e-9，计算以2为底的负概率加权对数和。information_gain返回一个显式后验前后的熵差，后验熵上升时拒绝；这是一项受限单后验契约，不能推成每次Bayes观测都降低熵。</w:t>
+      </w:r>
+    </w:p>
+    <w:p>
+      <w:pPr>
+        <w:spacing w:after="40" w:line="240" w:lineRule="auto"/>
+        <w:ind w:firstLine="400"/>
+      </w:pPr>
+      <w:r>
+        <w:rPr>
+          <w:rFonts w:ascii="Times New Roman" w:cs="Times New Roman" w:eastAsia="宋体" w:hAnsi="Times New Roman"/>
+          <w:color w:val="000000"/>
+          <w:sz w:val="20"/>
+          <w:szCs w:val="20"/>
+        </w:rPr>
+        <w:t xml:space="preserve">expected_information_gain要求结果概率归一、后验数量和维度匹配，再检查逐元素p(y)h.p(s|y)不大于p(s)，以及每状态的后验加权混合等于先验，容差为1e-9。结果为先验熵减期望后验熵，复杂度O(mn)。score_information_action使用单后验信息差减成本权重乘成本；成本和权重拒绝负数，但当前没有对所有乘积统一做有限性后验检查。分数可以为负，不能当作概率。</w:t>
+      </w:r>
+    </w:p>
+    <w:p>
+      <w:pPr>
+        <w:pStyle w:val="Heading2"/>
+        <w:keepNext/>
+        <w:keepLines/>
+        <w:spacing w:after="70" w:before="140"/>
+      </w:pPr>
+      <w:r>
+        <w:rPr>
+          <w:rFonts w:ascii="Times New Roman" w:cs="Times New Roman" w:eastAsia="黑体" w:hAnsi="Times New Roman"/>
+          <w:b/>
+          <w:bCs/>
+          <w:color w:val="000000"/>
+          <w:sz w:val="20"/>
+          <w:szCs w:val="20"/>
+        </w:rPr>
+        <w:t xml:space="preserve">C. 描述差异与效用分配</w:t>
+      </w:r>
+    </w:p>
+    <w:p>
+      <w:pPr>
+        <w:spacing w:after="40" w:line="240" w:lineRule="auto"/>
+        <w:ind w:firstLine="400"/>
+      </w:pPr>
+      <w:r>
+        <w:rPr>
+          <w:rFonts w:ascii="Times New Roman" w:cs="Times New Roman" w:eastAsia="宋体" w:hAnsi="Times New Roman"/>
+          <w:color w:val="000000"/>
+          <w:sz w:val="20"/>
+          <w:szCs w:val="20"/>
+        </w:rPr>
+        <w:t xml:space="preserve">difference_in_means要求两组非空、结果有限且在</w:t>
+      </w:r>
+      <w:r>
+        <w:rPr>
+          <w:rFonts w:ascii="Times New Roman" w:cs="Times New Roman" w:eastAsia="Times New Roman" w:hAnsi="Times New Roman"/>
+          <w:sz w:val="16"/>
+          <w:szCs w:val="16"/>
+          <w:vertAlign w:val="superscript"/>
+        </w:rPr>
+        <w:t xml:space="preserve">[0,1]</w:t>
+      </w:r>
+      <w:r>
+        <w:rPr>
+          <w:rFonts w:ascii="Times New Roman" w:cs="Times New Roman" w:eastAsia="宋体" w:hAnsi="Times New Roman"/>
+          <w:color w:val="000000"/>
+          <w:sz w:val="20"/>
+          <w:szCs w:val="20"/>
+        </w:rPr>
+        <w:t xml:space="preserve">，返回均值、均值差和样本数；它不自动解决混杂或随机化。stratified_effect要求权重键和分层键完全一致、各权重非负有限且和为1，再按声明目标权重汇总各层均值。计数是原始计数之和，并非有效样本量。Utility以质量、学习、团队价值的加权和减去成本和风险，字段及权重有限，成本、风险和权重非负；结果不限定单位区间，极大数乘加仍可能溢出。</w:t>
+      </w:r>
+    </w:p>
+    <w:p>
+      <w:pPr>
+        <w:spacing w:after="40" w:line="240" w:lineRule="auto"/>
+        <w:ind w:firstLine="400"/>
+      </w:pPr>
+      <w:r>
+        <w:rPr>
+          <w:rFonts w:ascii="Times New Roman" w:cs="Times New Roman" w:eastAsia="宋体" w:hAnsi="Times New Roman"/>
+          <w:color w:val="000000"/>
+          <w:sz w:val="20"/>
+          <w:szCs w:val="20"/>
+        </w:rPr>
+        <w:t xml:space="preserve">allocate_by_utility无预算时按正效用降序选择，排序为O(n log n)；有预算时执行0/1背包的稀疏Pareto前沿枚举，每项扩展可行组合，按成本升序、分数降序排序，并删除分数未超过已有最佳值的受支配状态。前沿超过100000时报错，不能称为一般多项式算法。在正常完成且浮点比较有效时搜索给定分数的最优组合，返回顺序恢复为输入顺序；最坏成本取决于前沿状态数，而非只取决于数值预算。</w:t>
+      </w:r>
+    </w:p>
+    <w:p>
+      <w:pPr>
+        <w:pStyle w:val="Heading2"/>
+        <w:keepNext/>
+        <w:keepLines/>
+        <w:spacing w:after="70" w:before="140"/>
+      </w:pPr>
+      <w:r>
+        <w:rPr>
+          <w:rFonts w:ascii="Times New Roman" w:cs="Times New Roman" w:eastAsia="黑体" w:hAnsi="Times New Roman"/>
+          <w:b/>
+          <w:bCs/>
+          <w:color w:val="000000"/>
+          <w:sz w:val="20"/>
+          <w:szCs w:val="20"/>
+        </w:rPr>
+        <w:t xml:space="preserve">D. 排队、采样与可达性</w:t>
+      </w:r>
+    </w:p>
+    <w:p>
+      <w:pPr>
+        <w:spacing w:after="40" w:line="240" w:lineRule="auto"/>
+        <w:ind w:firstLine="400"/>
+      </w:pPr>
+      <w:r>
+        <w:rPr>
+          <w:rFonts w:ascii="Times New Roman" w:cs="Times New Roman" w:eastAsia="宋体" w:hAnsi="Times New Roman"/>
+          <w:color w:val="000000"/>
+          <w:sz w:val="20"/>
+          <w:szCs w:val="20"/>
+        </w:rPr>
+        <w:t xml:space="preserve">queue_metrics只计算ρ=λ/μ，要求有限λ≥0及有限μ&gt;0，ρ≥1返回unstable；没有计算等待时间或队列长度。BanditArm从Beta参数采样，observe只接受二元奖励。ThompsonBandit以唯一臂名、Beta(1,1)及可选seed初始化，每次为K个臂采样并取最大者，选择为O(K)、单臂更新为O(1)。sample只检查参数正性，不能声称覆盖全部非有限构造输入。合成奖励实验检验的是策略机制，不能证明语言模型训练或自主进化。</w:t>
+      </w:r>
+    </w:p>
+    <w:p>
+      <w:pPr>
+        <w:spacing w:after="40" w:line="240" w:lineRule="auto"/>
+        <w:ind w:firstLine="400"/>
+      </w:pPr>
+      <w:r>
+        <w:rPr>
+          <w:rFonts w:ascii="Times New Roman" w:cs="Times New Roman" w:eastAsia="宋体" w:hAnsi="Times New Roman"/>
+          <w:color w:val="000000"/>
+          <w:sz w:val="20"/>
+          <w:szCs w:val="20"/>
+        </w:rPr>
+        <w:t xml:space="preserve">本次调用定位发现，score_information_action、transition_distribution、allocate_by_utility及ThompsonBandit的名称引用主要在本模块、测试和研究控制脚本；不能因数学库存在就声称生产服务已按这些模型自动调度。逐函数完整输入输出、异常、分支、复杂度和解释限制保存在配套《核心实现语义说明.md》。本附录增加数学实现细节，不改变既有实验的采集方法，也不把机制运行数量当作真实模型调用数量。</w:t>
+      </w:r>
+    </w:p>
+    <w:p>
+      <w:pPr>
         <w:sectPr>
           <w:footerReference w:type="default" r:id="rId8"/>
           <w:type w:val="continuous"/>

</xml_diff>

<commit_message>
docs: add Bayesian bandit algorithms and experiments
</commit_message>
<xml_diff>
--- a/docs/论文/补天多轮经验机制-IEEE.docx
+++ b/docs/论文/补天多轮经验机制-IEEE.docx
@@ -46,7 +46,7 @@
           <w:sz w:val="20"/>
           <w:szCs w:val="20"/>
         </w:rPr>
-        <w:t xml:space="preserve">许伟｜独立研究者，中国</w:t>
+        <w:t xml:space="preserve">许伟｜电子科学与技术专业，工学学士｜独立研究者，中国</w:t>
       </w:r>
     </w:p>
     <w:p>
@@ -111,7 +111,7 @@
           <w:sz w:val="18"/>
           <w:szCs w:val="18"/>
         </w:rPr>
-        <w:t xml:space="preserve">作者许伟。本研究于毕业后独立开展，研究设计、实验执行、数据分析和论文撰写均由作者完成。感谢盐城工学院在学习期间提供的实验室环境、课程训练和知识培养，这些经历为本文研究提供了基础。本文观点、实验结果和结论由作者本人负责，不代表盐城工学院或任何相关实验室的立场。</w:t>
+        <w:t xml:space="preserve">作者许伟，电子科学与技术专业，工学学士。本研究于毕业后独立开展，研究设计、实验执行、数据分析和论文撰写均由作者完成。感谢盐城工学院在学习期间提供的实验室环境、课程训练和知识培养，这些经历为本文研究提供了基础。本文观点、实验结果和结论由作者本人负责，不代表盐城工学院或任何相关实验室的立场。</w:t>
       </w:r>
     </w:p>
     <w:p>
@@ -4964,6 +4964,424 @@
     </w:p>
     <w:p>
       <w:pPr>
+        <w:pStyle w:val="Heading1"/>
+        <w:keepNext/>
+        <w:keepLines/>
+        <w:spacing w:after="70" w:before="140"/>
+        <w:jc w:val="center"/>
+      </w:pPr>
+      <w:r>
+        <w:rPr>
+          <w:rFonts w:ascii="Times New Roman" w:cs="Times New Roman" w:eastAsia="黑体" w:hAnsi="Times New Roman"/>
+          <w:b/>
+          <w:bCs/>
+          <w:color w:val="000000"/>
+          <w:sz w:val="22"/>
+          <w:szCs w:val="22"/>
+        </w:rPr>
+        <w:t xml:space="preserve">IX. 贝叶斯证据更新、Thompson采样与算法实验</w:t>
+      </w:r>
+    </w:p>
+    <w:p>
+      <w:pPr>
+        <w:pStyle w:val="Heading2"/>
+        <w:keepNext/>
+        <w:keepLines/>
+        <w:spacing w:after="70" w:before="140"/>
+      </w:pPr>
+      <w:r>
+        <w:rPr>
+          <w:rFonts w:ascii="Times New Roman" w:cs="Times New Roman" w:eastAsia="黑体" w:hAnsi="Times New Roman"/>
+          <w:b/>
+          <w:bCs/>
+          <w:color w:val="000000"/>
+          <w:sz w:val="20"/>
+          <w:szCs w:val="20"/>
+        </w:rPr>
+        <w:t xml:space="preserve">A. 从Beta-Bernoulli信念到实践证据</w:t>
+      </w:r>
+    </w:p>
+    <w:p>
+      <w:pPr>
+        <w:spacing w:after="40" w:line="240" w:lineRule="auto"/>
+        <w:ind w:firstLine="400"/>
+      </w:pPr>
+      <w:r>
+        <w:rPr>
+          <w:rFonts w:ascii="Times New Roman" w:cs="Times New Roman" w:eastAsia="宋体" w:hAnsi="Times New Roman"/>
+          <w:color w:val="000000"/>
+          <w:sz w:val="20"/>
+          <w:szCs w:val="20"/>
+        </w:rPr>
+        <w:t xml:space="preserve">本项目对实践结果使用Beta-Bernoulli信念作为可解释的成功率后验表示。令θ表示某一经验在给定实体、版本和环境下再次有效的概率，先验为θ∼Beta(α0,β0)，Bernoulli观察yi∈{0,1}。在加权证据下，成功权重ws与失败权重wf分别更新α=α0+Σws、β=β0+Σwf，后验均值为E[θ]=α/(α+β)，方差为αβ/[(α+β)^2(α+β+1)]。代码中的evidence_quality、independence和environment_match相乘形成单次权重；这表示证据可信度的折减，不是自动识别样本独立性。零权重被拒绝，避免把没有信息的记录伪装成一次观测。</w:t>
+      </w:r>
+    </w:p>
+    <w:p>
+      <w:pPr>
+        <w:spacing w:after="40" w:line="240" w:lineRule="auto"/>
+        <w:ind w:firstLine="400"/>
+      </w:pPr>
+      <w:r>
+        <w:rPr>
+          <w:rFonts w:ascii="Times New Roman" w:cs="Times New Roman" w:eastAsia="宋体" w:hAnsi="Times New Roman"/>
+          <w:color w:val="000000"/>
+          <w:sz w:val="20"/>
+          <w:szCs w:val="20"/>
+        </w:rPr>
+        <w:t xml:space="preserve">实践状态机与Beta信念不是同一层对象。candidate、warm和disputed由来源、独立键、成功失败计数、版本和反馈规则决定；Beta后验提供连续的不确定性摘要，不能绕过至少两次独立成功、来源证据或版本准入。95%区间由Beta分位数计算，区间宽度反映样本与先验强度，不能把区间覆盖率写成当前经验必然正确。</w:t>
+      </w:r>
+    </w:p>
+    <w:p>
+      <w:pPr>
+        <w:pStyle w:val="Heading2"/>
+        <w:keepNext/>
+        <w:keepLines/>
+        <w:spacing w:after="70" w:before="140"/>
+      </w:pPr>
+      <w:r>
+        <w:rPr>
+          <w:rFonts w:ascii="Times New Roman" w:cs="Times New Roman" w:eastAsia="黑体" w:hAnsi="Times New Roman"/>
+          <w:b/>
+          <w:bCs/>
+          <w:color w:val="000000"/>
+          <w:sz w:val="20"/>
+          <w:szCs w:val="20"/>
+        </w:rPr>
+        <w:t xml:space="preserve">B. Thompson Sampling与强化学习边界</w:t>
+      </w:r>
+    </w:p>
+    <w:p>
+      <w:pPr>
+        <w:spacing w:after="40" w:line="240" w:lineRule="auto"/>
+        <w:ind w:firstLine="400"/>
+      </w:pPr>
+      <w:r>
+        <w:rPr>
+          <w:rFonts w:ascii="Times New Roman" w:cs="Times New Roman" w:eastAsia="宋体" w:hAnsi="Times New Roman"/>
+          <w:color w:val="000000"/>
+          <w:sz w:val="20"/>
+          <w:szCs w:val="20"/>
+        </w:rPr>
+        <w:t xml:space="preserve">对K个候选动作ak，Thompson Sampling在每轮从各臂后验θk∼Beta(αk,βk)采样θ̃k，并选择argmaxk θ̃k；得到Bernoulli奖励后只更新被选臂。该随机化在探索与利用之间平衡：高不确定性臂仍可能采到较大值，持续低奖励臂的后验逐步降低。本文代码ThompsonBandit正是这一Beta-Bernoulli bandit机制，选择复杂度O(K)，更新复杂度O(1)。</w:t>
+      </w:r>
+    </w:p>
+    <w:p>
+      <w:pPr>
+        <w:spacing w:after="40" w:line="240" w:lineRule="auto"/>
+        <w:ind w:firstLine="400"/>
+      </w:pPr>
+      <w:r>
+        <w:rPr>
+          <w:rFonts w:ascii="Times New Roman" w:cs="Times New Roman" w:eastAsia="宋体" w:hAnsi="Times New Roman"/>
+          <w:color w:val="000000"/>
+          <w:sz w:val="20"/>
+          <w:szCs w:val="20"/>
+        </w:rPr>
+        <w:t xml:space="preserve">严格说，本实现不是完整的Bayesian reinforcement learning。完整Bayesian RL还需要状态st、动作at、转移模型P(st+1|st,at)、奖励模型R和策略对长期回报的后验推断，例如对模型参数或价值函数进行后验更新。当前Bandit实验没有状态转移，奖励只取当前臂的Bernoulli结果，目标是验证经验选择机制，而不是证明项目已经学习长期策略。论文将其称为贝叶斯Bandit或上下文无关的贝叶斯决策控制；若未来接入状态、迁移和折扣回报，才可扩展为Bayesian RL实验。</w:t>
+      </w:r>
+    </w:p>
+    <w:p>
+      <w:pPr>
+        <w:pStyle w:val="Heading2"/>
+        <w:keepNext/>
+        <w:keepLines/>
+        <w:spacing w:after="70" w:before="140"/>
+      </w:pPr>
+      <w:r>
+        <w:rPr>
+          <w:rFonts w:ascii="Times New Roman" w:cs="Times New Roman" w:eastAsia="黑体" w:hAnsi="Times New Roman"/>
+          <w:b/>
+          <w:bCs/>
+          <w:color w:val="000000"/>
+          <w:sz w:val="20"/>
+          <w:szCs w:val="20"/>
+        </w:rPr>
+        <w:t xml:space="preserve">C. 算法伪代码与实现对应</w:t>
+      </w:r>
+    </w:p>
+    <w:p>
+      <w:pPr>
+        <w:spacing w:after="40" w:line="240" w:lineRule="auto"/>
+        <w:ind w:firstLine="400"/>
+      </w:pPr>
+      <w:r>
+        <w:rPr>
+          <w:rFonts w:ascii="Times New Roman" w:cs="Times New Roman" w:eastAsia="宋体" w:hAnsi="Times New Roman"/>
+          <w:color w:val="000000"/>
+          <w:sz w:val="20"/>
+          <w:szCs w:val="20"/>
+        </w:rPr>
+        <w:t xml:space="preserve">算法1（加权实践更新）：输入先验(α,β)、结果y、质量q、独立性i、环境匹配e；若y不属于{success,failure}则拒绝；w=qie；若w=0则拒绝；y=success时返回(α+w,β)，否则返回(α,β+w)，并累计观测权重。算法2（Thompson选择）：对每个臂k采样xk∼Beta(αk,βk)，选择k*=argmax xk；取得真实或实验奖励r∈{0,1}后令αk*←αk*+r、βk*←βk*+1−r，其余臂保持不变。算法3（经验准入）：先验证实体、版本、来源和上下文预算，再调用宿主完成任务；冻结首次结果；由客观反馈产生success/failure/unknown；成功写入证据并更新状态，失败进入disputed或触发修订。算法3不是由Beta采样替代的模型训练。</w:t>
+      </w:r>
+    </w:p>
+    <w:p>
+      <w:pPr>
+        <w:pStyle w:val="Heading2"/>
+        <w:keepNext/>
+        <w:keepLines/>
+        <w:spacing w:after="70" w:before="140"/>
+      </w:pPr>
+      <w:r>
+        <w:rPr>
+          <w:rFonts w:ascii="Times New Roman" w:cs="Times New Roman" w:eastAsia="黑体" w:hAnsi="Times New Roman"/>
+          <w:b/>
+          <w:bCs/>
+          <w:color w:val="000000"/>
+          <w:sz w:val="20"/>
+          <w:szCs w:val="20"/>
+        </w:rPr>
+        <w:t xml:space="preserve">D. 贝叶斯Bandit对照实验</w:t>
+      </w:r>
+    </w:p>
+    <w:p>
+      <w:pPr>
+        <w:spacing w:after="40" w:line="240" w:lineRule="auto"/>
+        <w:ind w:firstLine="400"/>
+      </w:pPr>
+      <w:r>
+        <w:rPr>
+          <w:rFonts w:ascii="Times New Roman" w:cs="Times New Roman" w:eastAsia="宋体" w:hAnsi="Times New Roman"/>
+          <w:color w:val="000000"/>
+          <w:sz w:val="20"/>
+          <w:szCs w:val="20"/>
+        </w:rPr>
+        <w:t xml:space="preserve">实验脚本run_bayesian_bandit_experiments.py使用两个臂，真实奖励概率分别为0.30和0.70，设置10个固定随机种子、每个种子1000轮，比较Thompson Sampling、ε-greedy(ε=0.1)和均匀随机策略。每轮只产生合成Bernoulli奖励，actual_model_runs=0；因此这是算法机制控制，不是语言模型实测。记录总奖励、选择次数、后验均值和伪遗憾R*=T·maxkθk−Σtθat，并生成后验收敛、累计奖励和伪遗憾三张300 dpi PNG图。</w:t>
+      </w:r>
+    </w:p>
+    <w:p>
+      <w:pPr>
+        <w:spacing w:after="40" w:line="240" w:lineRule="auto"/>
+        <w:ind w:firstLine="400"/>
+      </w:pPr>
+      <w:r>
+        <w:rPr>
+          <w:rFonts w:ascii="Times New Roman" w:cs="Times New Roman" w:eastAsia="宋体" w:hAnsi="Times New Roman"/>
+          <w:color w:val="000000"/>
+          <w:sz w:val="20"/>
+          <w:szCs w:val="20"/>
+        </w:rPr>
+        <w:t xml:space="preserve">结果为：Thompson平均总奖励704.4、平均伪遗憾4.32；ε-greedy分别为672.8和25.44；均匀随机分别为494.3和202.60。Thompson在10个种子上的总奖励范围为678—727。结果支持该实现能够在这个两臂、平稳、Bernoulli奖励控制中较快集中到高奖励臂；它不能证明真实宿主Agent的回答质量提升、不能证明长期任务收益，也不能证明模型参数持续进化。所有结论受真实奖励分布、固定策略和10个种子限制。</w:t>
+      </w:r>
+    </w:p>
+    <w:p>
+      <w:pPr>
+        <w:spacing/>
+        <w:jc w:val="center"/>
+      </w:pPr>
+      <w:r>
+        <w:drawing>
+          <wp:inline distT="0" distB="0" distL="0" distR="0">
+            <wp:extent cx="2914650" cy="1733550"/>
+            <wp:effectExtent t="0" r="0" b="0" l="0"/>
+            <wp:docPr id="1" name="" descr="" title=""/>
+            <wp:cNvGraphicFramePr>
+              <a:graphicFrameLocks xmlns:a="http://schemas.openxmlformats.org/drawingml/2006/main" noChangeAspect="1"/>
+            </wp:cNvGraphicFramePr>
+            <a:graphic xmlns:a="http://schemas.openxmlformats.org/drawingml/2006/main">
+              <a:graphicData uri="http://schemas.openxmlformats.org/drawingml/2006/picture">
+                <pic:pic xmlns:pic="http://schemas.openxmlformats.org/drawingml/2006/picture">
+                  <pic:nvPicPr>
+                    <pic:cNvPr id="0" name="" descr=""/>
+                    <pic:cNvPicPr>
+                      <a:picLocks noChangeAspect="1" noChangeArrowheads="1"/>
+                    </pic:cNvPicPr>
+                  </pic:nvPicPr>
+                  <pic:blipFill>
+                    <a:blip r:embed="rId17" cstate="none"/>
+                    <a:srcRect/>
+                    <a:stretch>
+                      <a:fillRect/>
+                    </a:stretch>
+                  </pic:blipFill>
+                  <pic:spPr bwMode="auto">
+                    <a:xfrm>
+                      <a:off x="0" y="0"/>
+                      <a:ext cx="2914650" cy="1733550"/>
+                    </a:xfrm>
+                    <a:prstGeom prst="rect">
+                      <a:avLst/>
+                    </a:prstGeom>
+                  </pic:spPr>
+                </pic:pic>
+              </a:graphicData>
+            </a:graphic>
+          </wp:inline>
+        </w:drawing>
+      </w:r>
+    </w:p>
+    <w:p>
+      <w:pPr>
+        <w:spacing w:after="40" w:line="240" w:lineRule="auto"/>
+        <w:jc w:val="center"/>
+      </w:pPr>
+      <w:r>
+        <w:rPr>
+          <w:rFonts w:ascii="Times New Roman" w:cs="Times New Roman" w:eastAsia="宋体" w:hAnsi="Times New Roman"/>
+          <w:color w:val="000000"/>
+          <w:sz w:val="16"/>
+          <w:szCs w:val="16"/>
+        </w:rPr>
+        <w:t xml:space="preserve">图9 Thompson Sampling中高奖励臂的Beta后验均值收敛。</w:t>
+      </w:r>
+    </w:p>
+    <w:p>
+      <w:pPr>
+        <w:spacing/>
+        <w:jc w:val="center"/>
+      </w:pPr>
+      <w:r>
+        <w:drawing>
+          <wp:inline distT="0" distB="0" distL="0" distR="0">
+            <wp:extent cx="2914650" cy="1733550"/>
+            <wp:effectExtent t="0" r="0" b="0" l="0"/>
+            <wp:docPr id="1" name="" descr="" title=""/>
+            <wp:cNvGraphicFramePr>
+              <a:graphicFrameLocks xmlns:a="http://schemas.openxmlformats.org/drawingml/2006/main" noChangeAspect="1"/>
+            </wp:cNvGraphicFramePr>
+            <a:graphic xmlns:a="http://schemas.openxmlformats.org/drawingml/2006/main">
+              <a:graphicData uri="http://schemas.openxmlformats.org/drawingml/2006/picture">
+                <pic:pic xmlns:pic="http://schemas.openxmlformats.org/drawingml/2006/picture">
+                  <pic:nvPicPr>
+                    <pic:cNvPr id="0" name="" descr=""/>
+                    <pic:cNvPicPr>
+                      <a:picLocks noChangeAspect="1" noChangeArrowheads="1"/>
+                    </pic:cNvPicPr>
+                  </pic:nvPicPr>
+                  <pic:blipFill>
+                    <a:blip r:embed="rId18" cstate="none"/>
+                    <a:srcRect/>
+                    <a:stretch>
+                      <a:fillRect/>
+                    </a:stretch>
+                  </pic:blipFill>
+                  <pic:spPr bwMode="auto">
+                    <a:xfrm>
+                      <a:off x="0" y="0"/>
+                      <a:ext cx="2914650" cy="1733550"/>
+                    </a:xfrm>
+                    <a:prstGeom prst="rect">
+                      <a:avLst/>
+                    </a:prstGeom>
+                  </pic:spPr>
+                </pic:pic>
+              </a:graphicData>
+            </a:graphic>
+          </wp:inline>
+        </w:drawing>
+      </w:r>
+    </w:p>
+    <w:p>
+      <w:pPr>
+        <w:spacing w:after="40" w:line="240" w:lineRule="auto"/>
+        <w:jc w:val="center"/>
+      </w:pPr>
+      <w:r>
+        <w:rPr>
+          <w:rFonts w:ascii="Times New Roman" w:cs="Times New Roman" w:eastAsia="宋体" w:hAnsi="Times New Roman"/>
+          <w:color w:val="000000"/>
+          <w:sz w:val="16"/>
+          <w:szCs w:val="16"/>
+        </w:rPr>
+        <w:t xml:space="preserve">图10 三种策略的10种子平均累计奖励。</w:t>
+      </w:r>
+    </w:p>
+    <w:p>
+      <w:pPr>
+        <w:spacing/>
+        <w:jc w:val="center"/>
+      </w:pPr>
+      <w:r>
+        <w:drawing>
+          <wp:inline distT="0" distB="0" distL="0" distR="0">
+            <wp:extent cx="2914650" cy="1733550"/>
+            <wp:effectExtent t="0" r="0" b="0" l="0"/>
+            <wp:docPr id="1" name="" descr="" title=""/>
+            <wp:cNvGraphicFramePr>
+              <a:graphicFrameLocks xmlns:a="http://schemas.openxmlformats.org/drawingml/2006/main" noChangeAspect="1"/>
+            </wp:cNvGraphicFramePr>
+            <a:graphic xmlns:a="http://schemas.openxmlformats.org/drawingml/2006/main">
+              <a:graphicData uri="http://schemas.openxmlformats.org/drawingml/2006/picture">
+                <pic:pic xmlns:pic="http://schemas.openxmlformats.org/drawingml/2006/picture">
+                  <pic:nvPicPr>
+                    <pic:cNvPr id="0" name="" descr=""/>
+                    <pic:cNvPicPr>
+                      <a:picLocks noChangeAspect="1" noChangeArrowheads="1"/>
+                    </pic:cNvPicPr>
+                  </pic:nvPicPr>
+                  <pic:blipFill>
+                    <a:blip r:embed="rId19" cstate="none"/>
+                    <a:srcRect/>
+                    <a:stretch>
+                      <a:fillRect/>
+                    </a:stretch>
+                  </pic:blipFill>
+                  <pic:spPr bwMode="auto">
+                    <a:xfrm>
+                      <a:off x="0" y="0"/>
+                      <a:ext cx="2914650" cy="1733550"/>
+                    </a:xfrm>
+                    <a:prstGeom prst="rect">
+                      <a:avLst/>
+                    </a:prstGeom>
+                  </pic:spPr>
+                </pic:pic>
+              </a:graphicData>
+            </a:graphic>
+          </wp:inline>
+        </w:drawing>
+      </w:r>
+    </w:p>
+    <w:p>
+      <w:pPr>
+        <w:spacing w:after="40" w:line="240" w:lineRule="auto"/>
+        <w:jc w:val="center"/>
+      </w:pPr>
+      <w:r>
+        <w:rPr>
+          <w:rFonts w:ascii="Times New Roman" w:cs="Times New Roman" w:eastAsia="宋体" w:hAnsi="Times New Roman"/>
+          <w:color w:val="000000"/>
+          <w:sz w:val="16"/>
+          <w:szCs w:val="16"/>
+        </w:rPr>
+        <w:t xml:space="preserve">图11 三种策略的平均伪遗憾；该指标基于已知合成奖励概率。</w:t>
+      </w:r>
+    </w:p>
+    <w:p>
+      <w:pPr>
+        <w:pStyle w:val="Heading2"/>
+        <w:keepNext/>
+        <w:keepLines/>
+        <w:spacing w:after="70" w:before="140"/>
+      </w:pPr>
+      <w:r>
+        <w:rPr>
+          <w:rFonts w:ascii="Times New Roman" w:cs="Times New Roman" w:eastAsia="黑体" w:hAnsi="Times New Roman"/>
+          <w:b/>
+          <w:bCs/>
+          <w:color w:val="000000"/>
+          <w:sz w:val="20"/>
+          <w:szCs w:val="20"/>
+        </w:rPr>
+        <w:t xml:space="preserve">E. 与项目主实验的关系</w:t>
+      </w:r>
+    </w:p>
+    <w:p>
+      <w:pPr>
+        <w:spacing w:after="40" w:line="240" w:lineRule="auto"/>
+        <w:ind w:firstLine="400"/>
+      </w:pPr>
+      <w:r>
+        <w:rPr>
+          <w:rFonts w:ascii="Times New Roman" w:cs="Times New Roman" w:eastAsia="宋体" w:hAnsi="Times New Roman"/>
+          <w:color w:val="000000"/>
+          <w:sz w:val="20"/>
+          <w:szCs w:val="20"/>
+        </w:rPr>
+        <w:t xml:space="preserve">贝叶斯Bandit控制和10080次多轮机制实验回答不同问题。前者验证Beta更新、Thompson选择及数值边界；后者验证版本约束经验复用、断源回退和持久化。两者都没有语言模型训练或参数更新。项目实践反馈中的成功、失败和环境匹配度可以为未来的后验决策提供输入，但当前生产主路径尚未将Thompson采样接入任务调度，因此不能把控制实验结果写成系统已经自动使用该策略。</w:t>
+      </w:r>
+    </w:p>
+    <w:p>
+      <w:pPr>
         <w:sectPr>
           <w:footerReference w:type="default" r:id="rId8"/>
           <w:type w:val="continuous"/>

</xml_diff>

<commit_message>
docs: render inline mathematical notation as Word equations
</commit_message>
<xml_diff>
--- a/docs/论文/补天多轮经验机制-IEEE.docx
+++ b/docs/论文/补天多轮经验机制-IEEE.docx
@@ -434,7 +434,245 @@
           <w:sz w:val="18"/>
           <w:szCs w:val="18"/>
         </w:rPr>
-        <w:t xml:space="preserve">设人在时刻t面对任务目标G_t、环境E_t和已有认识M_t。人先提出行动方案A_t，再通过工具或身体行动改变环境，获得观察O_t。预期结果\hat O_t与实际结果O_t之间的差异产生反馈F_t=O_t−\hat O_t。这个差异不是简单的“对/错”标签：如果行动没有真正执行，结果不可解释；如果环境版本未知，成功不能迁移；如果观测没有来源，结果不能复核；如果结果只发生一次，统计稳定性仍然不足。计算模型因此保留行动、环境快照、观察来源和结果证据，而不是只保存一句总结。</w:t>
+        <w:t xml:space="preserve">设人在时刻</w:t>
+      </w:r>
+      <m:oMath>
+        <m:r>
+          <m:t>t</m:t>
+        </m:r>
+      </m:oMath>
+      <w:r>
+        <w:rPr>
+          <w:rFonts w:ascii="Times New Roman" w:cs="Times New Roman" w:eastAsia="宋体" w:hAnsi="Times New Roman"/>
+          <w:color w:val="000000"/>
+          <w:sz w:val="18"/>
+          <w:szCs w:val="18"/>
+        </w:rPr>
+        <w:t xml:space="preserve">面对任务目标</w:t>
+      </w:r>
+      <m:oMath>
+        <m:sSub>
+          <m:sSubPr/>
+          <m:e>
+            <m:r>
+              <m:t>G</m:t>
+            </m:r>
+          </m:e>
+          <m:sub>
+            <m:r>
+              <m:t>t</m:t>
+            </m:r>
+          </m:sub>
+        </m:sSub>
+      </m:oMath>
+      <w:r>
+        <w:rPr>
+          <w:rFonts w:ascii="Times New Roman" w:cs="Times New Roman" w:eastAsia="宋体" w:hAnsi="Times New Roman"/>
+          <w:color w:val="000000"/>
+          <w:sz w:val="18"/>
+          <w:szCs w:val="18"/>
+        </w:rPr>
+        <w:t xml:space="preserve">、环境</w:t>
+      </w:r>
+      <m:oMath>
+        <m:sSub>
+          <m:sSubPr/>
+          <m:e>
+            <m:r>
+              <m:t>E</m:t>
+            </m:r>
+          </m:e>
+          <m:sub>
+            <m:r>
+              <m:t>t</m:t>
+            </m:r>
+          </m:sub>
+        </m:sSub>
+      </m:oMath>
+      <w:r>
+        <w:rPr>
+          <w:rFonts w:ascii="Times New Roman" w:cs="Times New Roman" w:eastAsia="宋体" w:hAnsi="Times New Roman"/>
+          <w:color w:val="000000"/>
+          <w:sz w:val="18"/>
+          <w:szCs w:val="18"/>
+        </w:rPr>
+        <w:t xml:space="preserve">和已有认识</w:t>
+      </w:r>
+      <m:oMath>
+        <m:sSub>
+          <m:sSubPr/>
+          <m:e>
+            <m:r>
+              <m:t>M</m:t>
+            </m:r>
+          </m:e>
+          <m:sub>
+            <m:r>
+              <m:t>t</m:t>
+            </m:r>
+          </m:sub>
+        </m:sSub>
+      </m:oMath>
+      <w:r>
+        <w:rPr>
+          <w:rFonts w:ascii="Times New Roman" w:cs="Times New Roman" w:eastAsia="宋体" w:hAnsi="Times New Roman"/>
+          <w:color w:val="000000"/>
+          <w:sz w:val="18"/>
+          <w:szCs w:val="18"/>
+        </w:rPr>
+        <w:t xml:space="preserve">。人先提出行动方案</w:t>
+      </w:r>
+      <m:oMath>
+        <m:sSub>
+          <m:sSubPr/>
+          <m:e>
+            <m:r>
+              <m:t>A</m:t>
+            </m:r>
+          </m:e>
+          <m:sub>
+            <m:r>
+              <m:t>t</m:t>
+            </m:r>
+          </m:sub>
+        </m:sSub>
+      </m:oMath>
+      <w:r>
+        <w:rPr>
+          <w:rFonts w:ascii="Times New Roman" w:cs="Times New Roman" w:eastAsia="宋体" w:hAnsi="Times New Roman"/>
+          <w:color w:val="000000"/>
+          <w:sz w:val="18"/>
+          <w:szCs w:val="18"/>
+        </w:rPr>
+        <w:t xml:space="preserve">，再通过工具或身体行动改变环境，获得观察</w:t>
+      </w:r>
+      <m:oMath>
+        <m:sSub>
+          <m:sSubPr/>
+          <m:e>
+            <m:r>
+              <m:t>O</m:t>
+            </m:r>
+          </m:e>
+          <m:sub>
+            <m:r>
+              <m:t>t</m:t>
+            </m:r>
+          </m:sub>
+        </m:sSub>
+      </m:oMath>
+      <w:r>
+        <w:rPr>
+          <w:rFonts w:ascii="Times New Roman" w:cs="Times New Roman" w:eastAsia="宋体" w:hAnsi="Times New Roman"/>
+          <w:color w:val="000000"/>
+          <w:sz w:val="18"/>
+          <w:szCs w:val="18"/>
+        </w:rPr>
+        <w:t xml:space="preserve">。预期结果</w:t>
+      </w:r>
+      <m:oMath>
+        <m:sSub>
+          <m:sSubPr/>
+          <m:e>
+            <m:r>
+              <m:t>Ô</m:t>
+            </m:r>
+          </m:e>
+          <m:sub>
+            <m:r>
+              <m:t>t</m:t>
+            </m:r>
+          </m:sub>
+        </m:sSub>
+      </m:oMath>
+      <w:r>
+        <w:rPr>
+          <w:rFonts w:ascii="Times New Roman" w:cs="Times New Roman" w:eastAsia="宋体" w:hAnsi="Times New Roman"/>
+          <w:color w:val="000000"/>
+          <w:sz w:val="18"/>
+          <w:szCs w:val="18"/>
+        </w:rPr>
+        <w:t xml:space="preserve">与实际结果</w:t>
+      </w:r>
+      <m:oMath>
+        <m:sSub>
+          <m:sSubPr/>
+          <m:e>
+            <m:r>
+              <m:t>O</m:t>
+            </m:r>
+          </m:e>
+          <m:sub>
+            <m:r>
+              <m:t>t</m:t>
+            </m:r>
+          </m:sub>
+        </m:sSub>
+      </m:oMath>
+      <w:r>
+        <w:rPr>
+          <w:rFonts w:ascii="Times New Roman" w:cs="Times New Roman" w:eastAsia="宋体" w:hAnsi="Times New Roman"/>
+          <w:color w:val="000000"/>
+          <w:sz w:val="18"/>
+          <w:szCs w:val="18"/>
+        </w:rPr>
+        <w:t xml:space="preserve">之间的差异产生反馈</w:t>
+      </w:r>
+      <m:oMath>
+        <m:sSub>
+          <m:sSubPr/>
+          <m:e>
+            <m:r>
+              <m:t>F</m:t>
+            </m:r>
+          </m:e>
+          <m:sub>
+            <m:r>
+              <m:t>t</m:t>
+            </m:r>
+          </m:sub>
+        </m:sSub>
+        <m:r>
+          <m:t>=</m:t>
+        </m:r>
+        <m:sSub>
+          <m:sSubPr/>
+          <m:e>
+            <m:r>
+              <m:t>O</m:t>
+            </m:r>
+          </m:e>
+          <m:sub>
+            <m:r>
+              <m:t>t</m:t>
+            </m:r>
+          </m:sub>
+        </m:sSub>
+        <m:r>
+          <m:t>-</m:t>
+        </m:r>
+        <m:sSub>
+          <m:sSubPr/>
+          <m:e>
+            <m:r>
+              <m:t>Ô</m:t>
+            </m:r>
+          </m:e>
+          <m:sub>
+            <m:r>
+              <m:t>t</m:t>
+            </m:r>
+          </m:sub>
+        </m:sSub>
+      </m:oMath>
+      <w:r>
+        <w:rPr>
+          <w:rFonts w:ascii="Times New Roman" w:cs="Times New Roman" w:eastAsia="宋体" w:hAnsi="Times New Roman"/>
+          <w:color w:val="000000"/>
+          <w:sz w:val="18"/>
+          <w:szCs w:val="18"/>
+        </w:rPr>
+        <w:t xml:space="preserve">。这个差异不是简单的“对/错”标签：如果行动没有真正执行，结果不可解释；如果环境版本未知，成功不能迁移；如果观测没有来源，结果不能复核；如果结果只发生一次，统计稳定性仍然不足。计算模型因此保留行动、环境快照、观察来源和结果证据，而不是只保存一句总结。</w:t>
       </w:r>
     </w:p>
     <w:p>
@@ -1105,7 +1343,91 @@
           <w:sz w:val="18"/>
           <w:szCs w:val="18"/>
         </w:rPr>
-        <w:t xml:space="preserve">输入任务G、行动A、环境快照E、观察O、来源s和预期\hat O。首先计算结果状态；若行动没有完成或证据缺失，记录unknown并停止升级。若结果成功，创建或读取经验对象，检查独立键、证据摘要和正文哈希；重复证据拒绝。若结果失败，写入反例并把状态置为disputed或保留candidate。MemoryStore中的观察、证据摘要、经验版本和领域技能更新在同一个BEGIN IMMEDIATE事务中提交；ButianService随后向另一服务存储追加practice_observed事件。两步没有跨库原子提交，不能宣称服务事件与记忆事务具有整体原子性。</w:t>
+        <w:t xml:space="preserve">输入任务</w:t>
+      </w:r>
+      <m:oMath>
+        <m:r>
+          <m:t>G</m:t>
+        </m:r>
+      </m:oMath>
+      <w:r>
+        <w:rPr>
+          <w:rFonts w:ascii="Times New Roman" w:cs="Times New Roman" w:eastAsia="宋体" w:hAnsi="Times New Roman"/>
+          <w:color w:val="000000"/>
+          <w:sz w:val="18"/>
+          <w:szCs w:val="18"/>
+        </w:rPr>
+        <w:t xml:space="preserve">、行动</w:t>
+      </w:r>
+      <m:oMath>
+        <m:r>
+          <m:t>A</m:t>
+        </m:r>
+      </m:oMath>
+      <w:r>
+        <w:rPr>
+          <w:rFonts w:ascii="Times New Roman" w:cs="Times New Roman" w:eastAsia="宋体" w:hAnsi="Times New Roman"/>
+          <w:color w:val="000000"/>
+          <w:sz w:val="18"/>
+          <w:szCs w:val="18"/>
+        </w:rPr>
+        <w:t xml:space="preserve">、环境快照</w:t>
+      </w:r>
+      <m:oMath>
+        <m:r>
+          <m:t>E</m:t>
+        </m:r>
+      </m:oMath>
+      <w:r>
+        <w:rPr>
+          <w:rFonts w:ascii="Times New Roman" w:cs="Times New Roman" w:eastAsia="宋体" w:hAnsi="Times New Roman"/>
+          <w:color w:val="000000"/>
+          <w:sz w:val="18"/>
+          <w:szCs w:val="18"/>
+        </w:rPr>
+        <w:t xml:space="preserve">、观察</w:t>
+      </w:r>
+      <m:oMath>
+        <m:r>
+          <m:t>O</m:t>
+        </m:r>
+      </m:oMath>
+      <w:r>
+        <w:rPr>
+          <w:rFonts w:ascii="Times New Roman" w:cs="Times New Roman" w:eastAsia="宋体" w:hAnsi="Times New Roman"/>
+          <w:color w:val="000000"/>
+          <w:sz w:val="18"/>
+          <w:szCs w:val="18"/>
+        </w:rPr>
+        <w:t xml:space="preserve">、来源</w:t>
+      </w:r>
+      <m:oMath>
+        <m:r>
+          <m:t>s</m:t>
+        </m:r>
+      </m:oMath>
+      <w:r>
+        <w:rPr>
+          <w:rFonts w:ascii="Times New Roman" w:cs="Times New Roman" w:eastAsia="宋体" w:hAnsi="Times New Roman"/>
+          <w:color w:val="000000"/>
+          <w:sz w:val="18"/>
+          <w:szCs w:val="18"/>
+        </w:rPr>
+        <w:t xml:space="preserve">和预期</w:t>
+      </w:r>
+      <m:oMath>
+        <m:r>
+          <m:t>Ô</m:t>
+        </m:r>
+      </m:oMath>
+      <w:r>
+        <w:rPr>
+          <w:rFonts w:ascii="Times New Roman" w:cs="Times New Roman" w:eastAsia="宋体" w:hAnsi="Times New Roman"/>
+          <w:color w:val="000000"/>
+          <w:sz w:val="18"/>
+          <w:szCs w:val="18"/>
+        </w:rPr>
+        <w:t xml:space="preserve">。首先计算结果状态；若行动没有完成或证据缺失，记录unknown并停止升级。若结果成功，创建或读取经验对象，检查独立键、证据摘要和正文哈希；重复证据拒绝。若结果失败，写入反例并把状态置为disputed或保留candidate。MemoryStore中的观察、证据摘要、经验版本和领域技能更新在同一个BEGIN IMMEDIATE事务中提交；ButianService随后向另一服务存储追加practice_observed事件。两步没有跨库原子提交，不能宣称服务事件与记忆事务具有整体原子性。</w:t>
       </w:r>
     </w:p>
     <w:p>
@@ -1201,7 +1523,300 @@
           <w:sz w:val="18"/>
           <w:szCs w:val="18"/>
         </w:rPr>
-        <w:t xml:space="preserve">在经验主张“下一次满足条件时成功”的工作模型下，令θ∼Beta(α,β)。一次成功证据权重为w=qdm，其中q是证据质量、d是独立性评价、m是环境匹配度；失败证据采用同样权重。成功更新α′=α+w、β′=β，失败更新α′=α、β′=β+w。后验均值μ=α/(α+β)，成功带来的变化为wβ/[(α+β)(α+β+w)]。因此成功会提高当前工作信念，且在参数增大后边际变化下降；这描述证据积累，不证明主张真实。</w:t>
+        <w:t xml:space="preserve">在经验主张“下一次满足条件时成功”的工作模型下，令</w:t>
+      </w:r>
+      <m:oMath>
+        <m:r>
+          <m:t>θ</m:t>
+        </m:r>
+        <m:r>
+          <m:t>∼</m:t>
+        </m:r>
+        <m:r>
+          <m:t>Beta</m:t>
+        </m:r>
+        <m:r>
+          <m:t>(</m:t>
+        </m:r>
+        <m:r>
+          <m:t>α</m:t>
+        </m:r>
+        <m:r>
+          <m:t>,</m:t>
+        </m:r>
+        <m:r>
+          <m:t>β</m:t>
+        </m:r>
+        <m:r>
+          <m:t>)</m:t>
+        </m:r>
+      </m:oMath>
+      <w:r>
+        <w:rPr>
+          <w:rFonts w:ascii="Times New Roman" w:cs="Times New Roman" w:eastAsia="宋体" w:hAnsi="Times New Roman"/>
+          <w:color w:val="000000"/>
+          <w:sz w:val="18"/>
+          <w:szCs w:val="18"/>
+        </w:rPr>
+        <w:t xml:space="preserve">。一次成功证据权重为</w:t>
+      </w:r>
+      <m:oMath>
+        <m:r>
+          <m:t>w</m:t>
+        </m:r>
+        <m:r>
+          <m:t>=</m:t>
+        </m:r>
+        <m:r>
+          <m:t>qdm</m:t>
+        </m:r>
+      </m:oMath>
+      <w:r>
+        <w:rPr>
+          <w:rFonts w:ascii="Times New Roman" w:cs="Times New Roman" w:eastAsia="宋体" w:hAnsi="Times New Roman"/>
+          <w:color w:val="000000"/>
+          <w:sz w:val="18"/>
+          <w:szCs w:val="18"/>
+        </w:rPr>
+        <w:t xml:space="preserve">，其中q是证据质量、d是独立性评价、m是环境匹配度；失败证据采用同样权重。成功更新</w:t>
+      </w:r>
+      <m:oMath>
+        <m:sSup>
+          <m:sSupPr/>
+          <m:e>
+            <m:r>
+              <m:t>α</m:t>
+            </m:r>
+          </m:e>
+          <m:sup>
+            <m:r>
+              <m:t>′</m:t>
+            </m:r>
+          </m:sup>
+        </m:sSup>
+        <m:r>
+          <m:t>=</m:t>
+        </m:r>
+        <m:r>
+          <m:t>α</m:t>
+        </m:r>
+        <m:r>
+          <m:t>+</m:t>
+        </m:r>
+        <m:r>
+          <m:t>w</m:t>
+        </m:r>
+      </m:oMath>
+      <w:r>
+        <w:rPr>
+          <w:rFonts w:ascii="Times New Roman" w:cs="Times New Roman" w:eastAsia="宋体" w:hAnsi="Times New Roman"/>
+          <w:color w:val="000000"/>
+          <w:sz w:val="18"/>
+          <w:szCs w:val="18"/>
+        </w:rPr>
+        <w:t xml:space="preserve">、</w:t>
+      </w:r>
+      <m:oMath>
+        <m:sSup>
+          <m:sSupPr/>
+          <m:e>
+            <m:r>
+              <m:t>β</m:t>
+            </m:r>
+          </m:e>
+          <m:sup>
+            <m:r>
+              <m:t>′</m:t>
+            </m:r>
+          </m:sup>
+        </m:sSup>
+        <m:r>
+          <m:t>=</m:t>
+        </m:r>
+        <m:r>
+          <m:t>β</m:t>
+        </m:r>
+      </m:oMath>
+      <w:r>
+        <w:rPr>
+          <w:rFonts w:ascii="Times New Roman" w:cs="Times New Roman" w:eastAsia="宋体" w:hAnsi="Times New Roman"/>
+          <w:color w:val="000000"/>
+          <w:sz w:val="18"/>
+          <w:szCs w:val="18"/>
+        </w:rPr>
+        <w:t xml:space="preserve">，失败更新</w:t>
+      </w:r>
+      <m:oMath>
+        <m:sSup>
+          <m:sSupPr/>
+          <m:e>
+            <m:r>
+              <m:t>α</m:t>
+            </m:r>
+          </m:e>
+          <m:sup>
+            <m:r>
+              <m:t>′</m:t>
+            </m:r>
+          </m:sup>
+        </m:sSup>
+        <m:r>
+          <m:t>=</m:t>
+        </m:r>
+        <m:r>
+          <m:t>α</m:t>
+        </m:r>
+      </m:oMath>
+      <w:r>
+        <w:rPr>
+          <w:rFonts w:ascii="Times New Roman" w:cs="Times New Roman" w:eastAsia="宋体" w:hAnsi="Times New Roman"/>
+          <w:color w:val="000000"/>
+          <w:sz w:val="18"/>
+          <w:szCs w:val="18"/>
+        </w:rPr>
+        <w:t xml:space="preserve">、</w:t>
+      </w:r>
+      <m:oMath>
+        <m:sSup>
+          <m:sSupPr/>
+          <m:e>
+            <m:r>
+              <m:t>β</m:t>
+            </m:r>
+          </m:e>
+          <m:sup>
+            <m:r>
+              <m:t>′</m:t>
+            </m:r>
+          </m:sup>
+        </m:sSup>
+        <m:r>
+          <m:t>=</m:t>
+        </m:r>
+        <m:r>
+          <m:t>β</m:t>
+        </m:r>
+        <m:r>
+          <m:t>+</m:t>
+        </m:r>
+        <m:r>
+          <m:t>w</m:t>
+        </m:r>
+      </m:oMath>
+      <w:r>
+        <w:rPr>
+          <w:rFonts w:ascii="Times New Roman" w:cs="Times New Roman" w:eastAsia="宋体" w:hAnsi="Times New Roman"/>
+          <w:color w:val="000000"/>
+          <w:sz w:val="18"/>
+          <w:szCs w:val="18"/>
+        </w:rPr>
+        <w:t xml:space="preserve">。后验均值</w:t>
+      </w:r>
+      <m:oMath>
+        <m:r>
+          <m:t>μ</m:t>
+        </m:r>
+        <m:r>
+          <m:t>=</m:t>
+        </m:r>
+        <m:r>
+          <m:t>α</m:t>
+        </m:r>
+        <m:r>
+          <m:t>/</m:t>
+        </m:r>
+        <m:r>
+          <m:t>(</m:t>
+        </m:r>
+        <m:r>
+          <m:t>α</m:t>
+        </m:r>
+        <m:r>
+          <m:t>+</m:t>
+        </m:r>
+        <m:r>
+          <m:t>β</m:t>
+        </m:r>
+        <m:r>
+          <m:t>)</m:t>
+        </m:r>
+      </m:oMath>
+      <w:r>
+        <w:rPr>
+          <w:rFonts w:ascii="Times New Roman" w:cs="Times New Roman" w:eastAsia="宋体" w:hAnsi="Times New Roman"/>
+          <w:color w:val="000000"/>
+          <w:sz w:val="18"/>
+          <w:szCs w:val="18"/>
+        </w:rPr>
+        <w:t xml:space="preserve">，成功带来的变化为</w:t>
+      </w:r>
+      <m:oMath>
+        <m:r>
+          <m:t>Δ</m:t>
+        </m:r>
+        <m:r>
+          <m:t>μ</m:t>
+        </m:r>
+        <m:r>
+          <m:t>=</m:t>
+        </m:r>
+        <m:f>
+          <m:num>
+            <m:r>
+              <m:t>w</m:t>
+            </m:r>
+            <m:r>
+              <m:t>β</m:t>
+            </m:r>
+          </m:num>
+          <m:den>
+            <m:r>
+              <m:t>(</m:t>
+            </m:r>
+            <m:r>
+              <m:t>α</m:t>
+            </m:r>
+            <m:r>
+              <m:t>+</m:t>
+            </m:r>
+            <m:r>
+              <m:t>β</m:t>
+            </m:r>
+            <m:r>
+              <m:t>)</m:t>
+            </m:r>
+            <m:r>
+              <m:t>(</m:t>
+            </m:r>
+            <m:r>
+              <m:t>α</m:t>
+            </m:r>
+            <m:r>
+              <m:t>+</m:t>
+            </m:r>
+            <m:r>
+              <m:t>β</m:t>
+            </m:r>
+            <m:r>
+              <m:t>+</m:t>
+            </m:r>
+            <m:r>
+              <m:t>w</m:t>
+            </m:r>
+            <m:r>
+              <m:t>)</m:t>
+            </m:r>
+          </m:den>
+        </m:f>
+      </m:oMath>
+      <w:r>
+        <w:rPr>
+          <w:rFonts w:ascii="Times New Roman" w:cs="Times New Roman" w:eastAsia="宋体" w:hAnsi="Times New Roman"/>
+          <w:color w:val="000000"/>
+          <w:sz w:val="18"/>
+          <w:szCs w:val="18"/>
+        </w:rPr>
+        <w:t xml:space="preserve">。因此成功会提高当前工作信念，且在参数增大后边际变化下降；这描述证据积累，不证明主张真实。</w:t>
       </w:r>
     </w:p>
     <w:p>
@@ -1329,7 +1944,97 @@
           <w:sz w:val="18"/>
           <w:szCs w:val="18"/>
         </w:rPr>
-        <w:t xml:space="preserve">当多个候选行动都可能减少不确定性时，信息增益IG=H(prior)−H(posterior)可用于排序，成本惩罚后的分数为IG−λcost。只有后验集合满足概率归一和全概率混合，期望信息增益才具有互信息解释。补天的expected_information_gain检查显式后验维度、结果概率和混合一致性；不从文字自动推导后验。</w:t>
+        <w:t xml:space="preserve">当多个候选行动都可能减少不确定性时，信息增益</w:t>
+      </w:r>
+      <m:oMath>
+        <m:r>
+          <m:t>IG</m:t>
+        </m:r>
+        <m:r>
+          <m:t>=</m:t>
+        </m:r>
+        <m:r>
+          <m:t>H</m:t>
+        </m:r>
+        <m:r>
+          <m:t>(</m:t>
+        </m:r>
+        <m:sSub>
+          <m:sSubPr/>
+          <m:e>
+            <m:r>
+              <m:t>p</m:t>
+            </m:r>
+          </m:e>
+          <m:sub>
+            <m:r>
+              <m:t>prior</m:t>
+            </m:r>
+          </m:sub>
+        </m:sSub>
+        <m:r>
+          <m:t>)</m:t>
+        </m:r>
+        <m:r>
+          <m:t>-</m:t>
+        </m:r>
+        <m:r>
+          <m:t>H</m:t>
+        </m:r>
+        <m:r>
+          <m:t>(</m:t>
+        </m:r>
+        <m:sSub>
+          <m:sSubPr/>
+          <m:e>
+            <m:r>
+              <m:t>p</m:t>
+            </m:r>
+          </m:e>
+          <m:sub>
+            <m:r>
+              <m:t>posterior</m:t>
+            </m:r>
+          </m:sub>
+        </m:sSub>
+        <m:r>
+          <m:t>)</m:t>
+        </m:r>
+      </m:oMath>
+      <w:r>
+        <w:rPr>
+          <w:rFonts w:ascii="Times New Roman" w:cs="Times New Roman" w:eastAsia="宋体" w:hAnsi="Times New Roman"/>
+          <w:color w:val="000000"/>
+          <w:sz w:val="18"/>
+          <w:szCs w:val="18"/>
+        </w:rPr>
+        <w:t xml:space="preserve">可用于排序，成本惩罚后的分数为</w:t>
+      </w:r>
+      <m:oMath>
+        <m:r>
+          <m:t>IG</m:t>
+        </m:r>
+        <m:r>
+          <m:t>-</m:t>
+        </m:r>
+        <m:r>
+          <m:t>λ</m:t>
+        </m:r>
+        <m:r>
+          <m:t> </m:t>
+        </m:r>
+        <m:r>
+          <m:t>cost</m:t>
+        </m:r>
+      </m:oMath>
+      <w:r>
+        <w:rPr>
+          <w:rFonts w:ascii="Times New Roman" w:cs="Times New Roman" w:eastAsia="宋体" w:hAnsi="Times New Roman"/>
+          <w:color w:val="000000"/>
+          <w:sz w:val="18"/>
+          <w:szCs w:val="18"/>
+        </w:rPr>
+        <w:t xml:space="preserve">。只有后验集合满足概率归一和全概率混合，期望信息增益才具有互信息解释。补天的expected_information_gain检查显式后验维度、结果概率和混合一致性；不从文字自动推导后验。</w:t>
       </w:r>
     </w:p>
     <w:p>
@@ -1462,7 +2167,135 @@
           <w:sz w:val="18"/>
           <w:szCs w:val="18"/>
         </w:rPr>
-        <w:t xml:space="preserve">Thompson Sampling不是经验形成过程本身，而是当系统有多个待验证行动或候选策略时的探索分配器。每个候选臂k维护Beta(α_k,β_k)，每轮采样\tilde θ_k∼Beta(α_k,β_k)，选择最大者，观察Bernoulli反馈后只更新被选臂。其选择复杂度为O(K)，更新为O(1)。当前代码没有状态转移、长期回报或价值函数，因此它是上下文无关的Bayesian bandit，不是完整Bayesian reinforcement learning。</w:t>
+        <w:t xml:space="preserve">Thompson Sampling不是经验形成过程本身，而是当系统有多个待验证行动或候选策略时的探索分配器。每个候选臂</w:t>
+      </w:r>
+      <m:oMath>
+        <m:r>
+          <m:t>k</m:t>
+        </m:r>
+      </m:oMath>
+      <w:r>
+        <w:rPr>
+          <w:rFonts w:ascii="Times New Roman" w:cs="Times New Roman" w:eastAsia="宋体" w:hAnsi="Times New Roman"/>
+          <w:color w:val="000000"/>
+          <w:sz w:val="18"/>
+          <w:szCs w:val="18"/>
+        </w:rPr>
+        <w:t xml:space="preserve">维护</w:t>
+      </w:r>
+      <m:oMath>
+        <m:r>
+          <m:t>Beta</m:t>
+        </m:r>
+        <m:r>
+          <m:t>(</m:t>
+        </m:r>
+        <m:sSub>
+          <m:sSubPr/>
+          <m:e>
+            <m:r>
+              <m:t>α</m:t>
+            </m:r>
+          </m:e>
+          <m:sub>
+            <m:r>
+              <m:t>k</m:t>
+            </m:r>
+          </m:sub>
+        </m:sSub>
+        <m:r>
+          <m:t>,</m:t>
+        </m:r>
+        <m:sSub>
+          <m:sSubPr/>
+          <m:e>
+            <m:r>
+              <m:t>β</m:t>
+            </m:r>
+          </m:e>
+          <m:sub>
+            <m:r>
+              <m:t>k</m:t>
+            </m:r>
+          </m:sub>
+        </m:sSub>
+        <m:r>
+          <m:t>)</m:t>
+        </m:r>
+      </m:oMath>
+      <w:r>
+        <w:rPr>
+          <w:rFonts w:ascii="Times New Roman" w:cs="Times New Roman" w:eastAsia="宋体" w:hAnsi="Times New Roman"/>
+          <w:color w:val="000000"/>
+          <w:sz w:val="18"/>
+          <w:szCs w:val="18"/>
+        </w:rPr>
+        <w:t xml:space="preserve">，每轮采样</w:t>
+      </w:r>
+      <m:oMath>
+        <m:sSub>
+          <m:sSubPr/>
+          <m:e>
+            <m:r>
+              <m:t>θ̃</m:t>
+            </m:r>
+          </m:e>
+          <m:sub>
+            <m:r>
+              <m:t>k</m:t>
+            </m:r>
+          </m:sub>
+        </m:sSub>
+        <m:r>
+          <m:t>∼</m:t>
+        </m:r>
+        <m:r>
+          <m:t>Beta</m:t>
+        </m:r>
+        <m:r>
+          <m:t>(</m:t>
+        </m:r>
+        <m:sSub>
+          <m:sSubPr/>
+          <m:e>
+            <m:r>
+              <m:t>α</m:t>
+            </m:r>
+          </m:e>
+          <m:sub>
+            <m:r>
+              <m:t>k</m:t>
+            </m:r>
+          </m:sub>
+        </m:sSub>
+        <m:r>
+          <m:t>,</m:t>
+        </m:r>
+        <m:sSub>
+          <m:sSubPr/>
+          <m:e>
+            <m:r>
+              <m:t>β</m:t>
+            </m:r>
+          </m:e>
+          <m:sub>
+            <m:r>
+              <m:t>k</m:t>
+            </m:r>
+          </m:sub>
+        </m:sSub>
+        <m:r>
+          <m:t>)</m:t>
+        </m:r>
+      </m:oMath>
+      <w:r>
+        <w:rPr>
+          <w:rFonts w:ascii="Times New Roman" w:cs="Times New Roman" w:eastAsia="宋体" w:hAnsi="Times New Roman"/>
+          <w:color w:val="000000"/>
+          <w:sz w:val="18"/>
+          <w:szCs w:val="18"/>
+        </w:rPr>
+        <w:t xml:space="preserve">，选择最大者，观察Bernoulli反馈后只更新被选臂。其选择复杂度为O(K)，更新为O(1)。当前代码没有状态转移、长期回报或价值函数，因此它是上下文无关的Bayesian bandit，不是完整Bayesian reinforcement learning。</w:t>
       </w:r>
     </w:p>
     <w:p>
@@ -1609,7 +2442,84 @@
           <w:sz w:val="18"/>
           <w:szCs w:val="18"/>
         </w:rPr>
-        <w:t xml:space="preserve">经验写入涉及固定种类的表操作，但成功计数、失败计数和领域汇总会随观察记录增长；令N为相关观察数、N_d为领域观察数，聚合在无更强索引保证时保守计为O(N+N_d)，不能把整条实践写回称为O(1)。固定表操作数量也不意味着每条SQL耗时为常数；候选召回使用当前实现的OR LIKE路径，若M条经验、平均正文长度L，保守成本为O(ML)；候选解析为O(B)，B为上下文字符数；版本链检查为O(V)，V为版本数；Beta更新为O(1)；Thompson一次选择为O(K)；Pareto预算分配取决于前沿状态数并设100000上限。复杂度说明的是程序执行量，不等于宿主模型token成本，也不等于人的认知复杂度。</w:t>
+        <w:t xml:space="preserve">经验写入涉及固定种类的表操作，但成功计数、失败计数和领域汇总会随观察记录增长；令</w:t>
+      </w:r>
+      <m:oMath>
+        <m:r>
+          <m:t>N</m:t>
+        </m:r>
+      </m:oMath>
+      <w:r>
+        <w:rPr>
+          <w:rFonts w:ascii="Times New Roman" w:cs="Times New Roman" w:eastAsia="宋体" w:hAnsi="Times New Roman"/>
+          <w:color w:val="000000"/>
+          <w:sz w:val="18"/>
+          <w:szCs w:val="18"/>
+        </w:rPr>
+        <w:t xml:space="preserve">为相关观察数、</w:t>
+      </w:r>
+      <m:oMath>
+        <m:sSub>
+          <m:sSubPr/>
+          <m:e>
+            <m:r>
+              <m:t>N</m:t>
+            </m:r>
+          </m:e>
+          <m:sub>
+            <m:r>
+              <m:t>d</m:t>
+            </m:r>
+          </m:sub>
+        </m:sSub>
+      </m:oMath>
+      <w:r>
+        <w:rPr>
+          <w:rFonts w:ascii="Times New Roman" w:cs="Times New Roman" w:eastAsia="宋体" w:hAnsi="Times New Roman"/>
+          <w:color w:val="000000"/>
+          <w:sz w:val="18"/>
+          <w:szCs w:val="18"/>
+        </w:rPr>
+        <w:t xml:space="preserve">为领域观察数，聚合在无更强索引保证时保守计为</w:t>
+      </w:r>
+      <m:oMath>
+        <m:r>
+          <m:t>O</m:t>
+        </m:r>
+        <m:r>
+          <m:t>(</m:t>
+        </m:r>
+        <m:r>
+          <m:t>N</m:t>
+        </m:r>
+        <m:r>
+          <m:t>+</m:t>
+        </m:r>
+        <m:sSub>
+          <m:sSubPr/>
+          <m:e>
+            <m:r>
+              <m:t>N</m:t>
+            </m:r>
+          </m:e>
+          <m:sub>
+            <m:r>
+              <m:t>d</m:t>
+            </m:r>
+          </m:sub>
+        </m:sSub>
+        <m:r>
+          <m:t>)</m:t>
+        </m:r>
+      </m:oMath>
+      <w:r>
+        <w:rPr>
+          <w:rFonts w:ascii="Times New Roman" w:cs="Times New Roman" w:eastAsia="宋体" w:hAnsi="Times New Roman"/>
+          <w:color w:val="000000"/>
+          <w:sz w:val="18"/>
+          <w:szCs w:val="18"/>
+        </w:rPr>
+        <w:t xml:space="preserve">，不能把整条实践写回称为O(1)。固定表操作数量也不意味着每条SQL耗时为常数；候选召回使用当前实现的OR LIKE路径，若M条经验、平均正文长度L，保守成本为O(ML)；候选解析为O(B)，B为上下文字符数；版本链检查为O(V)，V为版本数；Beta更新为O(1)；Thompson一次选择为O(K)；Pareto预算分配取决于前沿状态数并设100000上限。复杂度说明的是程序执行量，不等于宿主模型token成本，也不等于人的认知复杂度。</w:t>
       </w:r>
     </w:p>
     <w:p>

</xml_diff>

<commit_message>
docs: use supported arrows in Word equations
</commit_message>
<xml_diff>
--- a/docs/论文/补天多轮经验机制-IEEE.docx
+++ b/docs/论文/补天多轮经验机制-IEEE.docx
@@ -687,6 +687,9 @@
         <w:ptab w:alignment="center" w:relativeTo="margin" w:leader="none"/>
       </w:r>
       <m:oMath>
+        <m:r>
+          <m:t>(</m:t>
+        </m:r>
         <m:sSub>
           <m:sSubPr/>
           <m:e>
@@ -733,7 +736,7 @@
           </m:sub>
         </m:sSub>
         <m:r>
-          <m:t>xrightarrow</m:t>
+          <m:t>,</m:t>
         </m:r>
         <m:sSub>
           <m:sSubPr/>
@@ -748,6 +751,12 @@
             </m:r>
           </m:sub>
         </m:sSub>
+        <m:r>
+          <m:t>)</m:t>
+        </m:r>
+        <m:r>
+          <m:t>→</m:t>
+        </m:r>
         <m:sSub>
           <m:sSubPr/>
           <m:e>
@@ -762,10 +771,7 @@
           </m:sub>
         </m:sSub>
         <m:r>
-          <m:t>xrightarrow</m:t>
-        </m:r>
-        <m:r>
-          <m:t>compare</m:t>
+          <m:t>→</m:t>
         </m:r>
         <m:sSub>
           <m:sSubPr/>
@@ -1108,34 +1114,37 @@
       </w:r>
       <m:oMath>
         <m:r>
+          <m:t>s</m:t>
+        </m:r>
+        <m:r>
+          <m:t>≥</m:t>
+        </m:r>
+        <m:r>
+          <m:t>2</m:t>
+        </m:r>
+        <m:r>
+          <m:t>,</m:t>
+        </m:r>
+        <m:r>
+          <m:t> </m:t>
+        </m:r>
+        <m:r>
+          <m:t>f</m:t>
+        </m:r>
+        <m:r>
+          <m:t>=</m:t>
+        </m:r>
+        <m:r>
+          <m:t>0:</m:t>
+        </m:r>
+        <m:r>
+          <m:t> </m:t>
+        </m:r>
+        <m:r>
           <m:t>candidate</m:t>
         </m:r>
         <m:r>
-          <m:t>xrightarrow</m:t>
-        </m:r>
-        <m:r>
-          <m:t>s</m:t>
-        </m:r>
-        <m:r>
-          <m:t>≥</m:t>
-        </m:r>
-        <m:r>
-          <m:t>2</m:t>
-        </m:r>
-        <m:r>
-          <m:t>,</m:t>
-        </m:r>
-        <m:r>
-          <m:t> </m:t>
-        </m:r>
-        <m:r>
-          <m:t>f</m:t>
-        </m:r>
-        <m:r>
-          <m:t>=</m:t>
-        </m:r>
-        <m:r>
-          <m:t>0</m:t>
+          <m:t>→</m:t>
         </m:r>
         <m:r>
           <m:t>warm</m:t>
@@ -1166,13 +1175,19 @@
       </w:r>
       <m:oMath>
         <m:r>
+          <m:t>failure</m:t>
+        </m:r>
+        <m:r>
+          <m:t>:</m:t>
+        </m:r>
+        <m:r>
+          <m:t> </m:t>
+        </m:r>
+        <m:r>
           <m:t>warm</m:t>
         </m:r>
         <m:r>
-          <m:t>xrightarrow</m:t>
-        </m:r>
-        <m:r>
-          <m:t>failure</m:t>
+          <m:t>→</m:t>
         </m:r>
         <m:r>
           <m:t>disputed</m:t>

</xml_diff>

<commit_message>
docs: explain roundwise benefits and correct experiment scope
</commit_message>
<xml_diff>
--- a/docs/论文/补天多轮经验机制-IEEE.docx
+++ b/docs/论文/补天多轮经验机制-IEEE.docx
@@ -2588,7 +2588,7 @@
           <w:sz w:val="18"/>
           <w:szCs w:val="18"/>
         </w:rPr>
-        <w:t xml:space="preserve">主实验把每个任务视为一次实践循环：任务生成目标和环境，策略产生行动，确定性求解器产生首次结果，评测器提供客观反馈，系统根据反馈写入经验，下一轮再次使用。实验不调用语言模型，因此测量的是经验基础设施是否能支撑实践循环，而不是语言生成能力。10个种子、12个实体、12轮、7个条件共10080次执行；第5和第9轮发生版本漂移，第6和第7轮发生资料中断，第8轮关闭并重启服务。</w:t>
+        <w:t xml:space="preserve">主实验是规则复用基准，并未验证完整经验形成过程。脚本remember直接调用MemoryStore.put把精确来源规则写为warm、confidence=1.0，没有执行candidate门槛、独立实践检验或disputed反例处理。任务生成器给出实体和版本，固定求解器按规则计算结果，评测器比较参考答案，随后缓存来源规则以供下轮复用。实验不调用语言模型，因此测量的是经验基础设施是否能支撑实践循环，而不是语言生成能力。10个种子、12个实体、12轮、7个条件共10080次执行；第5和第9轮发生版本漂移，第6和第7轮发生资料中断，第8轮关闭并重启服务。</w:t>
       </w:r>
     </w:p>
     <w:p>
@@ -2656,7 +2656,7 @@
           <w:sz w:val="18"/>
           <w:szCs w:val="18"/>
         </w:rPr>
-        <w:t xml:space="preserve">主要指标是首次完成率、版本错误数、unknown数和源读取次数。次要指标是上下文查询、写回次数、逻辑操作、本地耗时和版本链审计。H1：在漂移和断源任务中，完整经验过程减少重复源读取并避免旧版本错误；H2：持久化在重启后保留可复用经验；H3：经验机制可能增加本地逻辑开销，因此源读取收益不等于端到端时延收益。</w:t>
+        <w:t xml:space="preserve">主要指标是首次完成率、版本错误数、unknown数和源读取次数。次要指标是上下文查询、写回次数、逻辑操作、本地耗时和版本链审计。H1：在漂移和断源任务中，带版本准入的规则复用策略减少重复源读取并避免旧版本错误；H2：持久化在重启后保留可复用经验；H3：经验机制可能增加本地逻辑开销，因此源读取收益不等于端到端时延收益。</w:t>
       </w:r>
     </w:p>
     <w:p>
@@ -2675,7 +2675,41 @@
           <w:sz w:val="22"/>
           <w:szCs w:val="22"/>
         </w:rPr>
-        <w:t xml:space="preserve">D. 独立算法控制</w:t>
+        <w:t xml:space="preserve">D. 生命周期接口控制及其局限</w:t>
+      </w:r>
+    </w:p>
+    <w:p>
+      <w:pPr>
+        <w:spacing w:after="50" w:line="260" w:lineRule="auto"/>
+        <w:ind w:firstLine="360"/>
+      </w:pPr>
+      <w:r>
+        <w:rPr>
+          <w:rFonts w:ascii="Times New Roman" w:cs="Times New Roman" w:eastAsia="宋体" w:hAnsi="Times New Roman"/>
+          <w:color w:val="000000"/>
+          <w:sz w:val="18"/>
+          <w:szCs w:val="18"/>
+        </w:rPr>
+        <w:t xml:space="preserve">另一项24目录控制调用record_practice_outcome：首次成功得到candidate；同一证据换独立键被拒绝；第二份不同证据使状态变warm；随后失败进入disputed；脚本人工改写为candidate；正常close/open后检查修订内容、父版本链和召回。它证明接口按设计执行状态守卫，不证明宿主会自主归纳、证据确实独立或新主张正确。证据文件由脚本构造，人工修订也由脚本明确指定，不能把24次相同流程称为24项科学发现。该控制与规则复用基准互补，但尚未连接为一项同时测量经验形成和任务收益的端到端实验。</w:t>
+      </w:r>
+    </w:p>
+    <w:p>
+      <w:pPr>
+        <w:pStyle w:val="Heading2"/>
+        <w:keepNext/>
+        <w:keepLines/>
+        <w:spacing w:after="80" w:before="120"/>
+      </w:pPr>
+      <w:r>
+        <w:rPr>
+          <w:rFonts w:ascii="Times New Roman" w:cs="Times New Roman" w:eastAsia="黑体" w:hAnsi="Times New Roman"/>
+          <w:b/>
+          <w:bCs/>
+          <w:color w:val="000000"/>
+          <w:sz w:val="22"/>
+          <w:szCs w:val="22"/>
+        </w:rPr>
+        <w:t xml:space="preserve">E. 独立算法控制</w:t>
       </w:r>
     </w:p>
     <w:p>
@@ -4090,7 +4124,7 @@
           <w:sz w:val="18"/>
           <w:szCs w:val="18"/>
         </w:rPr>
-        <w:t xml:space="preserve">完整机制相对精确索引基线完成率提高4.51个百分点，种子聚类bootstrap 95%区间为[3.68,5.35]。源读取从1375降至253，减少81.60%；无版本检查产生133次过期规则错误，说明版本不是附属字段，而是经验能否迁移的条件。重启丢失经验的条件增加120次源读取，说明持久化改变了后续实践所需的取证动作。</w:t>
+        <w:t xml:space="preserve">B2-full是实验条件名称，表示规则复用策略的全部开关，并不表示完整经验生命周期。相对精确索引基线，其首次完成率提高4.51个百分点，种子聚类bootstrap 95%区间为[3.68,5.35]。源读取从1375降至253，减少81.60%；无版本检查产生133次过期规则错误，说明版本不是附属字段，而是经验能否迁移的条件。重启丢失经验的条件增加120次源读取，说明持久化改变了后续实践所需的取证动作。</w:t>
       </w:r>
     </w:p>
     <w:p>
@@ -4231,7 +4265,1288 @@
           <w:sz w:val="22"/>
           <w:szCs w:val="22"/>
         </w:rPr>
-        <w:t xml:space="preserve">B. 操作代价与边界</w:t>
+        <w:t xml:space="preserve">B. 逐轮结果：收益究竟从哪里产生</w:t>
+      </w:r>
+    </w:p>
+    <w:p>
+      <w:pPr>
+        <w:spacing w:after="60" w:before="200"/>
+        <w:jc w:val="center"/>
+      </w:pPr>
+      <w:r>
+        <w:rPr>
+          <w:rFonts w:ascii="Times New Roman" w:cs="Times New Roman" w:eastAsia="宋体" w:hAnsi="Times New Roman"/>
+          <w:color w:val="000000"/>
+          <w:sz w:val="18"/>
+          <w:szCs w:val="18"/>
+        </w:rPr>
+        <w:t xml:space="preserve">表2a 按轮次分解首次结果和B2外部来源读取</w:t>
+      </w:r>
+    </w:p>
+    <w:tbl>
+      <w:tblPr>
+        <w:tblW w:type="dxa" w:w="4640"/>
+        <w:tblBorders>
+          <w:top w:val="single" w:color="auto" w:sz="4"/>
+          <w:left w:val="single" w:color="auto" w:sz="4"/>
+          <w:bottom w:val="single" w:color="auto" w:sz="4"/>
+          <w:right w:val="single" w:color="auto" w:sz="4"/>
+          <w:insideH w:val="single" w:color="auto" w:sz="4"/>
+          <w:insideV w:val="single" w:color="auto" w:sz="4"/>
+        </w:tblBorders>
+      </w:tblPr>
+      <w:tblGrid>
+        <w:gridCol w:w="1160"/>
+        <w:gridCol w:w="1160"/>
+        <w:gridCol w:w="1160"/>
+        <w:gridCol w:w="1160"/>
+      </w:tblGrid>
+      <w:tr>
+        <w:tc>
+          <w:tcPr>
+            <w:tcW w:type="dxa" w:w="1160"/>
+            <w:tcBorders>
+              <w:top w:val="single" w:color="000000" w:sz="12"/>
+              <w:left w:val="nil" w:sz="0"/>
+              <w:bottom w:val="single" w:color="000000" w:sz="6"/>
+              <w:right w:val="nil" w:sz="0"/>
+            </w:tcBorders>
+            <w:tcMar>
+              <w:top w:type="dxa" w:w="60"/>
+              <w:left w:type="dxa" w:w="100"/>
+              <w:bottom w:type="dxa" w:w="60"/>
+              <w:right w:type="dxa" w:w="100"/>
+            </w:tcMar>
+          </w:tcPr>
+          <w:p>
+            <w:pPr>
+              <w:spacing w:after="0" w:line="320"/>
+              <w:jc w:val="center"/>
+            </w:pPr>
+            <w:r>
+              <w:rPr>
+                <w:rFonts w:ascii="Times New Roman" w:cs="Times New Roman" w:eastAsia="宋体" w:hAnsi="Times New Roman"/>
+                <w:b/>
+                <w:bCs/>
+                <w:color w:val="000000"/>
+                <w:sz w:val="18"/>
+                <w:szCs w:val="18"/>
+              </w:rPr>
+              <w:t xml:space="preserve">轮次</w:t>
+            </w:r>
+          </w:p>
+        </w:tc>
+        <w:tc>
+          <w:tcPr>
+            <w:tcW w:type="dxa" w:w="1160"/>
+            <w:tcBorders>
+              <w:top w:val="single" w:color="000000" w:sz="12"/>
+              <w:left w:val="nil" w:sz="0"/>
+              <w:bottom w:val="single" w:color="000000" w:sz="6"/>
+              <w:right w:val="nil" w:sz="0"/>
+            </w:tcBorders>
+            <w:tcMar>
+              <w:top w:type="dxa" w:w="60"/>
+              <w:left w:type="dxa" w:w="100"/>
+              <w:bottom w:type="dxa" w:w="60"/>
+              <w:right w:type="dxa" w:w="100"/>
+            </w:tcMar>
+          </w:tcPr>
+          <w:p>
+            <w:pPr>
+              <w:spacing w:after="0" w:line="320"/>
+              <w:jc w:val="center"/>
+            </w:pPr>
+            <w:r>
+              <w:rPr>
+                <w:rFonts w:ascii="Times New Roman" w:cs="Times New Roman" w:eastAsia="宋体" w:hAnsi="Times New Roman"/>
+                <w:b/>
+                <w:bCs/>
+                <w:color w:val="000000"/>
+                <w:sz w:val="18"/>
+                <w:szCs w:val="18"/>
+              </w:rPr>
+              <w:t xml:space="preserve">索引正确/120</w:t>
+            </w:r>
+          </w:p>
+        </w:tc>
+        <w:tc>
+          <w:tcPr>
+            <w:tcW w:type="dxa" w:w="1160"/>
+            <w:tcBorders>
+              <w:top w:val="single" w:color="000000" w:sz="12"/>
+              <w:left w:val="nil" w:sz="0"/>
+              <w:bottom w:val="single" w:color="000000" w:sz="6"/>
+              <w:right w:val="nil" w:sz="0"/>
+            </w:tcBorders>
+            <w:tcMar>
+              <w:top w:type="dxa" w:w="60"/>
+              <w:left w:type="dxa" w:w="100"/>
+              <w:bottom w:type="dxa" w:w="60"/>
+              <w:right w:type="dxa" w:w="100"/>
+            </w:tcMar>
+          </w:tcPr>
+          <w:p>
+            <w:pPr>
+              <w:spacing w:after="0" w:line="320"/>
+              <w:jc w:val="center"/>
+            </w:pPr>
+            <w:r>
+              <w:rPr>
+                <w:rFonts w:ascii="Times New Roman" w:cs="Times New Roman" w:eastAsia="宋体" w:hAnsi="Times New Roman"/>
+                <w:b/>
+                <w:bCs/>
+                <w:color w:val="000000"/>
+                <w:sz w:val="18"/>
+                <w:szCs w:val="18"/>
+              </w:rPr>
+              <w:t xml:space="preserve">B2正确/120</w:t>
+            </w:r>
+          </w:p>
+        </w:tc>
+        <w:tc>
+          <w:tcPr>
+            <w:tcW w:type="dxa" w:w="1160"/>
+            <w:tcBorders>
+              <w:top w:val="single" w:color="000000" w:sz="12"/>
+              <w:left w:val="nil" w:sz="0"/>
+              <w:bottom w:val="single" w:color="000000" w:sz="6"/>
+              <w:right w:val="nil" w:sz="0"/>
+            </w:tcBorders>
+            <w:tcMar>
+              <w:top w:type="dxa" w:w="60"/>
+              <w:left w:type="dxa" w:w="100"/>
+              <w:bottom w:type="dxa" w:w="60"/>
+              <w:right w:type="dxa" w:w="100"/>
+            </w:tcMar>
+          </w:tcPr>
+          <w:p>
+            <w:pPr>
+              <w:spacing w:after="0" w:line="320"/>
+              <w:jc w:val="center"/>
+            </w:pPr>
+            <w:r>
+              <w:rPr>
+                <w:rFonts w:ascii="Times New Roman" w:cs="Times New Roman" w:eastAsia="宋体" w:hAnsi="Times New Roman"/>
+                <w:b/>
+                <w:bCs/>
+                <w:color w:val="000000"/>
+                <w:sz w:val="18"/>
+                <w:szCs w:val="18"/>
+              </w:rPr>
+              <w:t xml:space="preserve">B2源读取</w:t>
+            </w:r>
+          </w:p>
+        </w:tc>
+      </w:tr>
+      <w:tr>
+        <w:tc>
+          <w:tcPr>
+            <w:tcW w:type="dxa" w:w="1160"/>
+            <w:tcBorders>
+              <w:top w:val="single" w:color="000000" w:sz="6"/>
+              <w:left w:val="nil" w:sz="0"/>
+              <w:bottom w:val="nil" w:sz="0"/>
+              <w:right w:val="nil" w:sz="0"/>
+            </w:tcBorders>
+            <w:tcMar>
+              <w:top w:type="dxa" w:w="60"/>
+              <w:left w:type="dxa" w:w="100"/>
+              <w:bottom w:type="dxa" w:w="60"/>
+              <w:right w:type="dxa" w:w="100"/>
+            </w:tcMar>
+          </w:tcPr>
+          <w:p>
+            <w:pPr>
+              <w:spacing w:after="0" w:line="320"/>
+              <w:jc w:val="center"/>
+            </w:pPr>
+            <w:r>
+              <w:rPr>
+                <w:rFonts w:ascii="Times New Roman" w:cs="Times New Roman" w:eastAsia="宋体" w:hAnsi="Times New Roman"/>
+                <w:color w:val="000000"/>
+                <w:sz w:val="18"/>
+                <w:szCs w:val="18"/>
+              </w:rPr>
+              <w:t xml:space="preserve">1</w:t>
+            </w:r>
+          </w:p>
+        </w:tc>
+        <w:tc>
+          <w:tcPr>
+            <w:tcW w:type="dxa" w:w="1160"/>
+            <w:tcBorders>
+              <w:top w:val="single" w:color="000000" w:sz="6"/>
+              <w:left w:val="nil" w:sz="0"/>
+              <w:bottom w:val="nil" w:sz="0"/>
+              <w:right w:val="nil" w:sz="0"/>
+            </w:tcBorders>
+            <w:tcMar>
+              <w:top w:type="dxa" w:w="60"/>
+              <w:left w:type="dxa" w:w="100"/>
+              <w:bottom w:type="dxa" w:w="60"/>
+              <w:right w:type="dxa" w:w="100"/>
+            </w:tcMar>
+          </w:tcPr>
+          <w:p>
+            <w:pPr>
+              <w:spacing w:after="0" w:line="320"/>
+              <w:jc w:val="center"/>
+            </w:pPr>
+            <w:r>
+              <w:rPr>
+                <w:rFonts w:ascii="Times New Roman" w:cs="Times New Roman" w:eastAsia="宋体" w:hAnsi="Times New Roman"/>
+                <w:color w:val="000000"/>
+                <w:sz w:val="18"/>
+                <w:szCs w:val="18"/>
+              </w:rPr>
+              <w:t xml:space="preserve">120</w:t>
+            </w:r>
+          </w:p>
+        </w:tc>
+        <w:tc>
+          <w:tcPr>
+            <w:tcW w:type="dxa" w:w="1160"/>
+            <w:tcBorders>
+              <w:top w:val="single" w:color="000000" w:sz="6"/>
+              <w:left w:val="nil" w:sz="0"/>
+              <w:bottom w:val="nil" w:sz="0"/>
+              <w:right w:val="nil" w:sz="0"/>
+            </w:tcBorders>
+            <w:tcMar>
+              <w:top w:type="dxa" w:w="60"/>
+              <w:left w:type="dxa" w:w="100"/>
+              <w:bottom w:type="dxa" w:w="60"/>
+              <w:right w:type="dxa" w:w="100"/>
+            </w:tcMar>
+          </w:tcPr>
+          <w:p>
+            <w:pPr>
+              <w:spacing w:after="0" w:line="320"/>
+              <w:jc w:val="center"/>
+            </w:pPr>
+            <w:r>
+              <w:rPr>
+                <w:rFonts w:ascii="Times New Roman" w:cs="Times New Roman" w:eastAsia="宋体" w:hAnsi="Times New Roman"/>
+                <w:color w:val="000000"/>
+                <w:sz w:val="18"/>
+                <w:szCs w:val="18"/>
+              </w:rPr>
+              <w:t xml:space="preserve">120</w:t>
+            </w:r>
+          </w:p>
+        </w:tc>
+        <w:tc>
+          <w:tcPr>
+            <w:tcW w:type="dxa" w:w="1160"/>
+            <w:tcBorders>
+              <w:top w:val="single" w:color="000000" w:sz="6"/>
+              <w:left w:val="nil" w:sz="0"/>
+              <w:bottom w:val="nil" w:sz="0"/>
+              <w:right w:val="nil" w:sz="0"/>
+            </w:tcBorders>
+            <w:tcMar>
+              <w:top w:type="dxa" w:w="60"/>
+              <w:left w:type="dxa" w:w="100"/>
+              <w:bottom w:type="dxa" w:w="60"/>
+              <w:right w:type="dxa" w:w="100"/>
+            </w:tcMar>
+          </w:tcPr>
+          <w:p>
+            <w:pPr>
+              <w:spacing w:after="0" w:line="320"/>
+              <w:jc w:val="center"/>
+            </w:pPr>
+            <w:r>
+              <w:rPr>
+                <w:rFonts w:ascii="Times New Roman" w:cs="Times New Roman" w:eastAsia="宋体" w:hAnsi="Times New Roman"/>
+                <w:color w:val="000000"/>
+                <w:sz w:val="18"/>
+                <w:szCs w:val="18"/>
+              </w:rPr>
+              <w:t xml:space="preserve">120</w:t>
+            </w:r>
+          </w:p>
+        </w:tc>
+      </w:tr>
+      <w:tr>
+        <w:tc>
+          <w:tcPr>
+            <w:tcW w:type="dxa" w:w="1160"/>
+            <w:tcBorders>
+              <w:top w:val="nil" w:sz="0"/>
+              <w:left w:val="nil" w:sz="0"/>
+              <w:bottom w:val="nil" w:sz="0"/>
+              <w:right w:val="nil" w:sz="0"/>
+            </w:tcBorders>
+            <w:tcMar>
+              <w:top w:type="dxa" w:w="60"/>
+              <w:left w:type="dxa" w:w="100"/>
+              <w:bottom w:type="dxa" w:w="60"/>
+              <w:right w:type="dxa" w:w="100"/>
+            </w:tcMar>
+          </w:tcPr>
+          <w:p>
+            <w:pPr>
+              <w:spacing w:after="0" w:line="320"/>
+              <w:jc w:val="center"/>
+            </w:pPr>
+            <w:r>
+              <w:rPr>
+                <w:rFonts w:ascii="Times New Roman" w:cs="Times New Roman" w:eastAsia="宋体" w:hAnsi="Times New Roman"/>
+                <w:color w:val="000000"/>
+                <w:sz w:val="18"/>
+                <w:szCs w:val="18"/>
+              </w:rPr>
+              <w:t xml:space="preserve">2—4（每轮）</w:t>
+            </w:r>
+          </w:p>
+        </w:tc>
+        <w:tc>
+          <w:tcPr>
+            <w:tcW w:type="dxa" w:w="1160"/>
+            <w:tcBorders>
+              <w:top w:val="nil" w:sz="0"/>
+              <w:left w:val="nil" w:sz="0"/>
+              <w:bottom w:val="nil" w:sz="0"/>
+              <w:right w:val="nil" w:sz="0"/>
+            </w:tcBorders>
+            <w:tcMar>
+              <w:top w:type="dxa" w:w="60"/>
+              <w:left w:type="dxa" w:w="100"/>
+              <w:bottom w:type="dxa" w:w="60"/>
+              <w:right w:type="dxa" w:w="100"/>
+            </w:tcMar>
+          </w:tcPr>
+          <w:p>
+            <w:pPr>
+              <w:spacing w:after="0" w:line="320"/>
+              <w:jc w:val="center"/>
+            </w:pPr>
+            <w:r>
+              <w:rPr>
+                <w:rFonts w:ascii="Times New Roman" w:cs="Times New Roman" w:eastAsia="宋体" w:hAnsi="Times New Roman"/>
+                <w:color w:val="000000"/>
+                <w:sz w:val="18"/>
+                <w:szCs w:val="18"/>
+              </w:rPr>
+              <w:t xml:space="preserve">120</w:t>
+            </w:r>
+          </w:p>
+        </w:tc>
+        <w:tc>
+          <w:tcPr>
+            <w:tcW w:type="dxa" w:w="1160"/>
+            <w:tcBorders>
+              <w:top w:val="nil" w:sz="0"/>
+              <w:left w:val="nil" w:sz="0"/>
+              <w:bottom w:val="nil" w:sz="0"/>
+              <w:right w:val="nil" w:sz="0"/>
+            </w:tcBorders>
+            <w:tcMar>
+              <w:top w:type="dxa" w:w="60"/>
+              <w:left w:type="dxa" w:w="100"/>
+              <w:bottom w:type="dxa" w:w="60"/>
+              <w:right w:type="dxa" w:w="100"/>
+            </w:tcMar>
+          </w:tcPr>
+          <w:p>
+            <w:pPr>
+              <w:spacing w:after="0" w:line="320"/>
+              <w:jc w:val="center"/>
+            </w:pPr>
+            <w:r>
+              <w:rPr>
+                <w:rFonts w:ascii="Times New Roman" w:cs="Times New Roman" w:eastAsia="宋体" w:hAnsi="Times New Roman"/>
+                <w:color w:val="000000"/>
+                <w:sz w:val="18"/>
+                <w:szCs w:val="18"/>
+              </w:rPr>
+              <w:t xml:space="preserve">120</w:t>
+            </w:r>
+          </w:p>
+        </w:tc>
+        <w:tc>
+          <w:tcPr>
+            <w:tcW w:type="dxa" w:w="1160"/>
+            <w:tcBorders>
+              <w:top w:val="nil" w:sz="0"/>
+              <w:left w:val="nil" w:sz="0"/>
+              <w:bottom w:val="nil" w:sz="0"/>
+              <w:right w:val="nil" w:sz="0"/>
+            </w:tcBorders>
+            <w:tcMar>
+              <w:top w:type="dxa" w:w="60"/>
+              <w:left w:type="dxa" w:w="100"/>
+              <w:bottom w:type="dxa" w:w="60"/>
+              <w:right w:type="dxa" w:w="100"/>
+            </w:tcMar>
+          </w:tcPr>
+          <w:p>
+            <w:pPr>
+              <w:spacing w:after="0" w:line="320"/>
+              <w:jc w:val="center"/>
+            </w:pPr>
+            <w:r>
+              <w:rPr>
+                <w:rFonts w:ascii="Times New Roman" w:cs="Times New Roman" w:eastAsia="宋体" w:hAnsi="Times New Roman"/>
+                <w:color w:val="000000"/>
+                <w:sz w:val="18"/>
+                <w:szCs w:val="18"/>
+              </w:rPr>
+              <w:t xml:space="preserve">0</w:t>
+            </w:r>
+          </w:p>
+        </w:tc>
+      </w:tr>
+      <w:tr>
+        <w:tc>
+          <w:tcPr>
+            <w:tcW w:type="dxa" w:w="1160"/>
+            <w:tcBorders>
+              <w:top w:val="nil" w:sz="0"/>
+              <w:left w:val="nil" w:sz="0"/>
+              <w:bottom w:val="nil" w:sz="0"/>
+              <w:right w:val="nil" w:sz="0"/>
+            </w:tcBorders>
+            <w:tcMar>
+              <w:top w:type="dxa" w:w="60"/>
+              <w:left w:type="dxa" w:w="100"/>
+              <w:bottom w:type="dxa" w:w="60"/>
+              <w:right w:type="dxa" w:w="100"/>
+            </w:tcMar>
+          </w:tcPr>
+          <w:p>
+            <w:pPr>
+              <w:spacing w:after="0" w:line="320"/>
+              <w:jc w:val="center"/>
+            </w:pPr>
+            <w:r>
+              <w:rPr>
+                <w:rFonts w:ascii="Times New Roman" w:cs="Times New Roman" w:eastAsia="宋体" w:hAnsi="Times New Roman"/>
+                <w:color w:val="000000"/>
+                <w:sz w:val="18"/>
+                <w:szCs w:val="18"/>
+              </w:rPr>
+              <w:t xml:space="preserve">5（漂移）</w:t>
+            </w:r>
+          </w:p>
+        </w:tc>
+        <w:tc>
+          <w:tcPr>
+            <w:tcW w:type="dxa" w:w="1160"/>
+            <w:tcBorders>
+              <w:top w:val="nil" w:sz="0"/>
+              <w:left w:val="nil" w:sz="0"/>
+              <w:bottom w:val="nil" w:sz="0"/>
+              <w:right w:val="nil" w:sz="0"/>
+            </w:tcBorders>
+            <w:tcMar>
+              <w:top w:type="dxa" w:w="60"/>
+              <w:left w:type="dxa" w:w="100"/>
+              <w:bottom w:type="dxa" w:w="60"/>
+              <w:right w:type="dxa" w:w="100"/>
+            </w:tcMar>
+          </w:tcPr>
+          <w:p>
+            <w:pPr>
+              <w:spacing w:after="0" w:line="320"/>
+              <w:jc w:val="center"/>
+            </w:pPr>
+            <w:r>
+              <w:rPr>
+                <w:rFonts w:ascii="Times New Roman" w:cs="Times New Roman" w:eastAsia="宋体" w:hAnsi="Times New Roman"/>
+                <w:color w:val="000000"/>
+                <w:sz w:val="18"/>
+                <w:szCs w:val="18"/>
+              </w:rPr>
+              <w:t xml:space="preserve">120</w:t>
+            </w:r>
+          </w:p>
+        </w:tc>
+        <w:tc>
+          <w:tcPr>
+            <w:tcW w:type="dxa" w:w="1160"/>
+            <w:tcBorders>
+              <w:top w:val="nil" w:sz="0"/>
+              <w:left w:val="nil" w:sz="0"/>
+              <w:bottom w:val="nil" w:sz="0"/>
+              <w:right w:val="nil" w:sz="0"/>
+            </w:tcBorders>
+            <w:tcMar>
+              <w:top w:type="dxa" w:w="60"/>
+              <w:left w:type="dxa" w:w="100"/>
+              <w:bottom w:type="dxa" w:w="60"/>
+              <w:right w:type="dxa" w:w="100"/>
+            </w:tcMar>
+          </w:tcPr>
+          <w:p>
+            <w:pPr>
+              <w:spacing w:after="0" w:line="320"/>
+              <w:jc w:val="center"/>
+            </w:pPr>
+            <w:r>
+              <w:rPr>
+                <w:rFonts w:ascii="Times New Roman" w:cs="Times New Roman" w:eastAsia="宋体" w:hAnsi="Times New Roman"/>
+                <w:color w:val="000000"/>
+                <w:sz w:val="18"/>
+                <w:szCs w:val="18"/>
+              </w:rPr>
+              <w:t xml:space="preserve">120</w:t>
+            </w:r>
+          </w:p>
+        </w:tc>
+        <w:tc>
+          <w:tcPr>
+            <w:tcW w:type="dxa" w:w="1160"/>
+            <w:tcBorders>
+              <w:top w:val="nil" w:sz="0"/>
+              <w:left w:val="nil" w:sz="0"/>
+              <w:bottom w:val="nil" w:sz="0"/>
+              <w:right w:val="nil" w:sz="0"/>
+            </w:tcBorders>
+            <w:tcMar>
+              <w:top w:type="dxa" w:w="60"/>
+              <w:left w:type="dxa" w:w="100"/>
+              <w:bottom w:type="dxa" w:w="60"/>
+              <w:right w:type="dxa" w:w="100"/>
+            </w:tcMar>
+          </w:tcPr>
+          <w:p>
+            <w:pPr>
+              <w:spacing w:after="0" w:line="320"/>
+              <w:jc w:val="center"/>
+            </w:pPr>
+            <w:r>
+              <w:rPr>
+                <w:rFonts w:ascii="Times New Roman" w:cs="Times New Roman" w:eastAsia="宋体" w:hAnsi="Times New Roman"/>
+                <w:color w:val="000000"/>
+                <w:sz w:val="18"/>
+                <w:szCs w:val="18"/>
+              </w:rPr>
+              <w:t xml:space="preserve">70</w:t>
+            </w:r>
+          </w:p>
+        </w:tc>
+      </w:tr>
+      <w:tr>
+        <w:tc>
+          <w:tcPr>
+            <w:tcW w:type="dxa" w:w="1160"/>
+            <w:tcBorders>
+              <w:top w:val="nil" w:sz="0"/>
+              <w:left w:val="nil" w:sz="0"/>
+              <w:bottom w:val="nil" w:sz="0"/>
+              <w:right w:val="nil" w:sz="0"/>
+            </w:tcBorders>
+            <w:tcMar>
+              <w:top w:type="dxa" w:w="60"/>
+              <w:left w:type="dxa" w:w="100"/>
+              <w:bottom w:type="dxa" w:w="60"/>
+              <w:right w:type="dxa" w:w="100"/>
+            </w:tcMar>
+          </w:tcPr>
+          <w:p>
+            <w:pPr>
+              <w:spacing w:after="0" w:line="320"/>
+              <w:jc w:val="center"/>
+            </w:pPr>
+            <w:r>
+              <w:rPr>
+                <w:rFonts w:ascii="Times New Roman" w:cs="Times New Roman" w:eastAsia="宋体" w:hAnsi="Times New Roman"/>
+                <w:color w:val="000000"/>
+                <w:sz w:val="18"/>
+                <w:szCs w:val="18"/>
+              </w:rPr>
+              <w:t xml:space="preserve">6（断源）</w:t>
+            </w:r>
+          </w:p>
+        </w:tc>
+        <w:tc>
+          <w:tcPr>
+            <w:tcW w:type="dxa" w:w="1160"/>
+            <w:tcBorders>
+              <w:top w:val="nil" w:sz="0"/>
+              <w:left w:val="nil" w:sz="0"/>
+              <w:bottom w:val="nil" w:sz="0"/>
+              <w:right w:val="nil" w:sz="0"/>
+            </w:tcBorders>
+            <w:tcMar>
+              <w:top w:type="dxa" w:w="60"/>
+              <w:left w:type="dxa" w:w="100"/>
+              <w:bottom w:type="dxa" w:w="60"/>
+              <w:right w:type="dxa" w:w="100"/>
+            </w:tcMar>
+          </w:tcPr>
+          <w:p>
+            <w:pPr>
+              <w:spacing w:after="0" w:line="320"/>
+              <w:jc w:val="center"/>
+            </w:pPr>
+            <w:r>
+              <w:rPr>
+                <w:rFonts w:ascii="Times New Roman" w:cs="Times New Roman" w:eastAsia="宋体" w:hAnsi="Times New Roman"/>
+                <w:color w:val="000000"/>
+                <w:sz w:val="18"/>
+                <w:szCs w:val="18"/>
+              </w:rPr>
+              <w:t xml:space="preserve">99</w:t>
+            </w:r>
+          </w:p>
+        </w:tc>
+        <w:tc>
+          <w:tcPr>
+            <w:tcW w:type="dxa" w:w="1160"/>
+            <w:tcBorders>
+              <w:top w:val="nil" w:sz="0"/>
+              <w:left w:val="nil" w:sz="0"/>
+              <w:bottom w:val="nil" w:sz="0"/>
+              <w:right w:val="nil" w:sz="0"/>
+            </w:tcBorders>
+            <w:tcMar>
+              <w:top w:type="dxa" w:w="60"/>
+              <w:left w:type="dxa" w:w="100"/>
+              <w:bottom w:type="dxa" w:w="60"/>
+              <w:right w:type="dxa" w:w="100"/>
+            </w:tcMar>
+          </w:tcPr>
+          <w:p>
+            <w:pPr>
+              <w:spacing w:after="0" w:line="320"/>
+              <w:jc w:val="center"/>
+            </w:pPr>
+            <w:r>
+              <w:rPr>
+                <w:rFonts w:ascii="Times New Roman" w:cs="Times New Roman" w:eastAsia="宋体" w:hAnsi="Times New Roman"/>
+                <w:color w:val="000000"/>
+                <w:sz w:val="18"/>
+                <w:szCs w:val="18"/>
+              </w:rPr>
+              <w:t xml:space="preserve">120</w:t>
+            </w:r>
+          </w:p>
+        </w:tc>
+        <w:tc>
+          <w:tcPr>
+            <w:tcW w:type="dxa" w:w="1160"/>
+            <w:tcBorders>
+              <w:top w:val="nil" w:sz="0"/>
+              <w:left w:val="nil" w:sz="0"/>
+              <w:bottom w:val="nil" w:sz="0"/>
+              <w:right w:val="nil" w:sz="0"/>
+            </w:tcBorders>
+            <w:tcMar>
+              <w:top w:type="dxa" w:w="60"/>
+              <w:left w:type="dxa" w:w="100"/>
+              <w:bottom w:type="dxa" w:w="60"/>
+              <w:right w:type="dxa" w:w="100"/>
+            </w:tcMar>
+          </w:tcPr>
+          <w:p>
+            <w:pPr>
+              <w:spacing w:after="0" w:line="320"/>
+              <w:jc w:val="center"/>
+            </w:pPr>
+            <w:r>
+              <w:rPr>
+                <w:rFonts w:ascii="Times New Roman" w:cs="Times New Roman" w:eastAsia="宋体" w:hAnsi="Times New Roman"/>
+                <w:color w:val="000000"/>
+                <w:sz w:val="18"/>
+                <w:szCs w:val="18"/>
+              </w:rPr>
+              <w:t xml:space="preserve">0</w:t>
+            </w:r>
+          </w:p>
+        </w:tc>
+      </w:tr>
+      <w:tr>
+        <w:tc>
+          <w:tcPr>
+            <w:tcW w:type="dxa" w:w="1160"/>
+            <w:tcBorders>
+              <w:top w:val="nil" w:sz="0"/>
+              <w:left w:val="nil" w:sz="0"/>
+              <w:bottom w:val="nil" w:sz="0"/>
+              <w:right w:val="nil" w:sz="0"/>
+            </w:tcBorders>
+            <w:tcMar>
+              <w:top w:type="dxa" w:w="60"/>
+              <w:left w:type="dxa" w:w="100"/>
+              <w:bottom w:type="dxa" w:w="60"/>
+              <w:right w:type="dxa" w:w="100"/>
+            </w:tcMar>
+          </w:tcPr>
+          <w:p>
+            <w:pPr>
+              <w:spacing w:after="0" w:line="320"/>
+              <w:jc w:val="center"/>
+            </w:pPr>
+            <w:r>
+              <w:rPr>
+                <w:rFonts w:ascii="Times New Roman" w:cs="Times New Roman" w:eastAsia="宋体" w:hAnsi="Times New Roman"/>
+                <w:color w:val="000000"/>
+                <w:sz w:val="18"/>
+                <w:szCs w:val="18"/>
+              </w:rPr>
+              <w:t xml:space="preserve">7（断源）</w:t>
+            </w:r>
+          </w:p>
+        </w:tc>
+        <w:tc>
+          <w:tcPr>
+            <w:tcW w:type="dxa" w:w="1160"/>
+            <w:tcBorders>
+              <w:top w:val="nil" w:sz="0"/>
+              <w:left w:val="nil" w:sz="0"/>
+              <w:bottom w:val="nil" w:sz="0"/>
+              <w:right w:val="nil" w:sz="0"/>
+            </w:tcBorders>
+            <w:tcMar>
+              <w:top w:type="dxa" w:w="60"/>
+              <w:left w:type="dxa" w:w="100"/>
+              <w:bottom w:type="dxa" w:w="60"/>
+              <w:right w:type="dxa" w:w="100"/>
+            </w:tcMar>
+          </w:tcPr>
+          <w:p>
+            <w:pPr>
+              <w:spacing w:after="0" w:line="320"/>
+              <w:jc w:val="center"/>
+            </w:pPr>
+            <w:r>
+              <w:rPr>
+                <w:rFonts w:ascii="Times New Roman" w:cs="Times New Roman" w:eastAsia="宋体" w:hAnsi="Times New Roman"/>
+                <w:color w:val="000000"/>
+                <w:sz w:val="18"/>
+                <w:szCs w:val="18"/>
+              </w:rPr>
+              <w:t xml:space="preserve">76</w:t>
+            </w:r>
+          </w:p>
+        </w:tc>
+        <w:tc>
+          <w:tcPr>
+            <w:tcW w:type="dxa" w:w="1160"/>
+            <w:tcBorders>
+              <w:top w:val="nil" w:sz="0"/>
+              <w:left w:val="nil" w:sz="0"/>
+              <w:bottom w:val="nil" w:sz="0"/>
+              <w:right w:val="nil" w:sz="0"/>
+            </w:tcBorders>
+            <w:tcMar>
+              <w:top w:type="dxa" w:w="60"/>
+              <w:left w:type="dxa" w:w="100"/>
+              <w:bottom w:type="dxa" w:w="60"/>
+              <w:right w:type="dxa" w:w="100"/>
+            </w:tcMar>
+          </w:tcPr>
+          <w:p>
+            <w:pPr>
+              <w:spacing w:after="0" w:line="320"/>
+              <w:jc w:val="center"/>
+            </w:pPr>
+            <w:r>
+              <w:rPr>
+                <w:rFonts w:ascii="Times New Roman" w:cs="Times New Roman" w:eastAsia="宋体" w:hAnsi="Times New Roman"/>
+                <w:color w:val="000000"/>
+                <w:sz w:val="18"/>
+                <w:szCs w:val="18"/>
+              </w:rPr>
+              <w:t xml:space="preserve">120</w:t>
+            </w:r>
+          </w:p>
+        </w:tc>
+        <w:tc>
+          <w:tcPr>
+            <w:tcW w:type="dxa" w:w="1160"/>
+            <w:tcBorders>
+              <w:top w:val="nil" w:sz="0"/>
+              <w:left w:val="nil" w:sz="0"/>
+              <w:bottom w:val="nil" w:sz="0"/>
+              <w:right w:val="nil" w:sz="0"/>
+            </w:tcBorders>
+            <w:tcMar>
+              <w:top w:type="dxa" w:w="60"/>
+              <w:left w:type="dxa" w:w="100"/>
+              <w:bottom w:type="dxa" w:w="60"/>
+              <w:right w:type="dxa" w:w="100"/>
+            </w:tcMar>
+          </w:tcPr>
+          <w:p>
+            <w:pPr>
+              <w:spacing w:after="0" w:line="320"/>
+              <w:jc w:val="center"/>
+            </w:pPr>
+            <w:r>
+              <w:rPr>
+                <w:rFonts w:ascii="Times New Roman" w:cs="Times New Roman" w:eastAsia="宋体" w:hAnsi="Times New Roman"/>
+                <w:color w:val="000000"/>
+                <w:sz w:val="18"/>
+                <w:szCs w:val="18"/>
+              </w:rPr>
+              <w:t xml:space="preserve">0</w:t>
+            </w:r>
+          </w:p>
+        </w:tc>
+      </w:tr>
+      <w:tr>
+        <w:tc>
+          <w:tcPr>
+            <w:tcW w:type="dxa" w:w="1160"/>
+            <w:tcBorders>
+              <w:top w:val="nil" w:sz="0"/>
+              <w:left w:val="nil" w:sz="0"/>
+              <w:bottom w:val="nil" w:sz="0"/>
+              <w:right w:val="nil" w:sz="0"/>
+            </w:tcBorders>
+            <w:tcMar>
+              <w:top w:type="dxa" w:w="60"/>
+              <w:left w:type="dxa" w:w="100"/>
+              <w:bottom w:type="dxa" w:w="60"/>
+              <w:right w:type="dxa" w:w="100"/>
+            </w:tcMar>
+          </w:tcPr>
+          <w:p>
+            <w:pPr>
+              <w:spacing w:after="0" w:line="320"/>
+              <w:jc w:val="center"/>
+            </w:pPr>
+            <w:r>
+              <w:rPr>
+                <w:rFonts w:ascii="Times New Roman" w:cs="Times New Roman" w:eastAsia="宋体" w:hAnsi="Times New Roman"/>
+                <w:color w:val="000000"/>
+                <w:sz w:val="18"/>
+                <w:szCs w:val="18"/>
+              </w:rPr>
+              <w:t xml:space="preserve">8（重启）</w:t>
+            </w:r>
+          </w:p>
+        </w:tc>
+        <w:tc>
+          <w:tcPr>
+            <w:tcW w:type="dxa" w:w="1160"/>
+            <w:tcBorders>
+              <w:top w:val="nil" w:sz="0"/>
+              <w:left w:val="nil" w:sz="0"/>
+              <w:bottom w:val="nil" w:sz="0"/>
+              <w:right w:val="nil" w:sz="0"/>
+            </w:tcBorders>
+            <w:tcMar>
+              <w:top w:type="dxa" w:w="60"/>
+              <w:left w:type="dxa" w:w="100"/>
+              <w:bottom w:type="dxa" w:w="60"/>
+              <w:right w:type="dxa" w:w="100"/>
+            </w:tcMar>
+          </w:tcPr>
+          <w:p>
+            <w:pPr>
+              <w:spacing w:after="0" w:line="320"/>
+              <w:jc w:val="center"/>
+            </w:pPr>
+            <w:r>
+              <w:rPr>
+                <w:rFonts w:ascii="Times New Roman" w:cs="Times New Roman" w:eastAsia="宋体" w:hAnsi="Times New Roman"/>
+                <w:color w:val="000000"/>
+                <w:sz w:val="18"/>
+                <w:szCs w:val="18"/>
+              </w:rPr>
+              <w:t xml:space="preserve">120</w:t>
+            </w:r>
+          </w:p>
+        </w:tc>
+        <w:tc>
+          <w:tcPr>
+            <w:tcW w:type="dxa" w:w="1160"/>
+            <w:tcBorders>
+              <w:top w:val="nil" w:sz="0"/>
+              <w:left w:val="nil" w:sz="0"/>
+              <w:bottom w:val="nil" w:sz="0"/>
+              <w:right w:val="nil" w:sz="0"/>
+            </w:tcBorders>
+            <w:tcMar>
+              <w:top w:type="dxa" w:w="60"/>
+              <w:left w:type="dxa" w:w="100"/>
+              <w:bottom w:type="dxa" w:w="60"/>
+              <w:right w:type="dxa" w:w="100"/>
+            </w:tcMar>
+          </w:tcPr>
+          <w:p>
+            <w:pPr>
+              <w:spacing w:after="0" w:line="320"/>
+              <w:jc w:val="center"/>
+            </w:pPr>
+            <w:r>
+              <w:rPr>
+                <w:rFonts w:ascii="Times New Roman" w:cs="Times New Roman" w:eastAsia="宋体" w:hAnsi="Times New Roman"/>
+                <w:color w:val="000000"/>
+                <w:sz w:val="18"/>
+                <w:szCs w:val="18"/>
+              </w:rPr>
+              <w:t xml:space="preserve">120</w:t>
+            </w:r>
+          </w:p>
+        </w:tc>
+        <w:tc>
+          <w:tcPr>
+            <w:tcW w:type="dxa" w:w="1160"/>
+            <w:tcBorders>
+              <w:top w:val="nil" w:sz="0"/>
+              <w:left w:val="nil" w:sz="0"/>
+              <w:bottom w:val="nil" w:sz="0"/>
+              <w:right w:val="nil" w:sz="0"/>
+            </w:tcBorders>
+            <w:tcMar>
+              <w:top w:type="dxa" w:w="60"/>
+              <w:left w:type="dxa" w:w="100"/>
+              <w:bottom w:type="dxa" w:w="60"/>
+              <w:right w:type="dxa" w:w="100"/>
+            </w:tcMar>
+          </w:tcPr>
+          <w:p>
+            <w:pPr>
+              <w:spacing w:after="0" w:line="320"/>
+              <w:jc w:val="center"/>
+            </w:pPr>
+            <w:r>
+              <w:rPr>
+                <w:rFonts w:ascii="Times New Roman" w:cs="Times New Roman" w:eastAsia="宋体" w:hAnsi="Times New Roman"/>
+                <w:color w:val="000000"/>
+                <w:sz w:val="18"/>
+                <w:szCs w:val="18"/>
+              </w:rPr>
+              <w:t xml:space="preserve">0</w:t>
+            </w:r>
+          </w:p>
+        </w:tc>
+      </w:tr>
+      <w:tr>
+        <w:tc>
+          <w:tcPr>
+            <w:tcW w:type="dxa" w:w="1160"/>
+            <w:tcBorders>
+              <w:top w:val="nil" w:sz="0"/>
+              <w:left w:val="nil" w:sz="0"/>
+              <w:bottom w:val="nil" w:sz="0"/>
+              <w:right w:val="nil" w:sz="0"/>
+            </w:tcBorders>
+            <w:tcMar>
+              <w:top w:type="dxa" w:w="60"/>
+              <w:left w:type="dxa" w:w="100"/>
+              <w:bottom w:type="dxa" w:w="60"/>
+              <w:right w:type="dxa" w:w="100"/>
+            </w:tcMar>
+          </w:tcPr>
+          <w:p>
+            <w:pPr>
+              <w:spacing w:after="0" w:line="320"/>
+              <w:jc w:val="center"/>
+            </w:pPr>
+            <w:r>
+              <w:rPr>
+                <w:rFonts w:ascii="Times New Roman" w:cs="Times New Roman" w:eastAsia="宋体" w:hAnsi="Times New Roman"/>
+                <w:color w:val="000000"/>
+                <w:sz w:val="18"/>
+                <w:szCs w:val="18"/>
+              </w:rPr>
+              <w:t xml:space="preserve">9（漂移）</w:t>
+            </w:r>
+          </w:p>
+        </w:tc>
+        <w:tc>
+          <w:tcPr>
+            <w:tcW w:type="dxa" w:w="1160"/>
+            <w:tcBorders>
+              <w:top w:val="nil" w:sz="0"/>
+              <w:left w:val="nil" w:sz="0"/>
+              <w:bottom w:val="nil" w:sz="0"/>
+              <w:right w:val="nil" w:sz="0"/>
+            </w:tcBorders>
+            <w:tcMar>
+              <w:top w:type="dxa" w:w="60"/>
+              <w:left w:type="dxa" w:w="100"/>
+              <w:bottom w:type="dxa" w:w="60"/>
+              <w:right w:type="dxa" w:w="100"/>
+            </w:tcMar>
+          </w:tcPr>
+          <w:p>
+            <w:pPr>
+              <w:spacing w:after="0" w:line="320"/>
+              <w:jc w:val="center"/>
+            </w:pPr>
+            <w:r>
+              <w:rPr>
+                <w:rFonts w:ascii="Times New Roman" w:cs="Times New Roman" w:eastAsia="宋体" w:hAnsi="Times New Roman"/>
+                <w:color w:val="000000"/>
+                <w:sz w:val="18"/>
+                <w:szCs w:val="18"/>
+              </w:rPr>
+              <w:t xml:space="preserve">120</w:t>
+            </w:r>
+          </w:p>
+        </w:tc>
+        <w:tc>
+          <w:tcPr>
+            <w:tcW w:type="dxa" w:w="1160"/>
+            <w:tcBorders>
+              <w:top w:val="nil" w:sz="0"/>
+              <w:left w:val="nil" w:sz="0"/>
+              <w:bottom w:val="nil" w:sz="0"/>
+              <w:right w:val="nil" w:sz="0"/>
+            </w:tcBorders>
+            <w:tcMar>
+              <w:top w:type="dxa" w:w="60"/>
+              <w:left w:type="dxa" w:w="100"/>
+              <w:bottom w:type="dxa" w:w="60"/>
+              <w:right w:type="dxa" w:w="100"/>
+            </w:tcMar>
+          </w:tcPr>
+          <w:p>
+            <w:pPr>
+              <w:spacing w:after="0" w:line="320"/>
+              <w:jc w:val="center"/>
+            </w:pPr>
+            <w:r>
+              <w:rPr>
+                <w:rFonts w:ascii="Times New Roman" w:cs="Times New Roman" w:eastAsia="宋体" w:hAnsi="Times New Roman"/>
+                <w:color w:val="000000"/>
+                <w:sz w:val="18"/>
+                <w:szCs w:val="18"/>
+              </w:rPr>
+              <w:t xml:space="preserve">120</w:t>
+            </w:r>
+          </w:p>
+        </w:tc>
+        <w:tc>
+          <w:tcPr>
+            <w:tcW w:type="dxa" w:w="1160"/>
+            <w:tcBorders>
+              <w:top w:val="nil" w:sz="0"/>
+              <w:left w:val="nil" w:sz="0"/>
+              <w:bottom w:val="nil" w:sz="0"/>
+              <w:right w:val="nil" w:sz="0"/>
+            </w:tcBorders>
+            <w:tcMar>
+              <w:top w:type="dxa" w:w="60"/>
+              <w:left w:type="dxa" w:w="100"/>
+              <w:bottom w:type="dxa" w:w="60"/>
+              <w:right w:type="dxa" w:w="100"/>
+            </w:tcMar>
+          </w:tcPr>
+          <w:p>
+            <w:pPr>
+              <w:spacing w:after="0" w:line="320"/>
+              <w:jc w:val="center"/>
+            </w:pPr>
+            <w:r>
+              <w:rPr>
+                <w:rFonts w:ascii="Times New Roman" w:cs="Times New Roman" w:eastAsia="宋体" w:hAnsi="Times New Roman"/>
+                <w:color w:val="000000"/>
+                <w:sz w:val="18"/>
+                <w:szCs w:val="18"/>
+              </w:rPr>
+              <w:t xml:space="preserve">63</w:t>
+            </w:r>
+          </w:p>
+        </w:tc>
+      </w:tr>
+      <w:tr>
+        <w:tc>
+          <w:tcPr>
+            <w:tcW w:type="dxa" w:w="1160"/>
+            <w:tcBorders>
+              <w:top w:val="nil" w:sz="0"/>
+              <w:left w:val="nil" w:sz="0"/>
+              <w:bottom w:val="single" w:color="000000" w:sz="12"/>
+              <w:right w:val="nil" w:sz="0"/>
+            </w:tcBorders>
+            <w:tcMar>
+              <w:top w:type="dxa" w:w="60"/>
+              <w:left w:type="dxa" w:w="100"/>
+              <w:bottom w:type="dxa" w:w="60"/>
+              <w:right w:type="dxa" w:w="100"/>
+            </w:tcMar>
+          </w:tcPr>
+          <w:p>
+            <w:pPr>
+              <w:spacing w:after="0" w:line="320"/>
+              <w:jc w:val="center"/>
+            </w:pPr>
+            <w:r>
+              <w:rPr>
+                <w:rFonts w:ascii="Times New Roman" w:cs="Times New Roman" w:eastAsia="宋体" w:hAnsi="Times New Roman"/>
+                <w:color w:val="000000"/>
+                <w:sz w:val="18"/>
+                <w:szCs w:val="18"/>
+              </w:rPr>
+              <w:t xml:space="preserve">10—12（每轮）</w:t>
+            </w:r>
+          </w:p>
+        </w:tc>
+        <w:tc>
+          <w:tcPr>
+            <w:tcW w:type="dxa" w:w="1160"/>
+            <w:tcBorders>
+              <w:top w:val="nil" w:sz="0"/>
+              <w:left w:val="nil" w:sz="0"/>
+              <w:bottom w:val="single" w:color="000000" w:sz="12"/>
+              <w:right w:val="nil" w:sz="0"/>
+            </w:tcBorders>
+            <w:tcMar>
+              <w:top w:type="dxa" w:w="60"/>
+              <w:left w:type="dxa" w:w="100"/>
+              <w:bottom w:type="dxa" w:w="60"/>
+              <w:right w:type="dxa" w:w="100"/>
+            </w:tcMar>
+          </w:tcPr>
+          <w:p>
+            <w:pPr>
+              <w:spacing w:after="0" w:line="320"/>
+              <w:jc w:val="center"/>
+            </w:pPr>
+            <w:r>
+              <w:rPr>
+                <w:rFonts w:ascii="Times New Roman" w:cs="Times New Roman" w:eastAsia="宋体" w:hAnsi="Times New Roman"/>
+                <w:color w:val="000000"/>
+                <w:sz w:val="18"/>
+                <w:szCs w:val="18"/>
+              </w:rPr>
+              <w:t xml:space="preserve">120</w:t>
+            </w:r>
+          </w:p>
+        </w:tc>
+        <w:tc>
+          <w:tcPr>
+            <w:tcW w:type="dxa" w:w="1160"/>
+            <w:tcBorders>
+              <w:top w:val="nil" w:sz="0"/>
+              <w:left w:val="nil" w:sz="0"/>
+              <w:bottom w:val="single" w:color="000000" w:sz="12"/>
+              <w:right w:val="nil" w:sz="0"/>
+            </w:tcBorders>
+            <w:tcMar>
+              <w:top w:type="dxa" w:w="60"/>
+              <w:left w:type="dxa" w:w="100"/>
+              <w:bottom w:type="dxa" w:w="60"/>
+              <w:right w:type="dxa" w:w="100"/>
+            </w:tcMar>
+          </w:tcPr>
+          <w:p>
+            <w:pPr>
+              <w:spacing w:after="0" w:line="320"/>
+              <w:jc w:val="center"/>
+            </w:pPr>
+            <w:r>
+              <w:rPr>
+                <w:rFonts w:ascii="Times New Roman" w:cs="Times New Roman" w:eastAsia="宋体" w:hAnsi="Times New Roman"/>
+                <w:color w:val="000000"/>
+                <w:sz w:val="18"/>
+                <w:szCs w:val="18"/>
+              </w:rPr>
+              <w:t xml:space="preserve">120</w:t>
+            </w:r>
+          </w:p>
+        </w:tc>
+        <w:tc>
+          <w:tcPr>
+            <w:tcW w:type="dxa" w:w="1160"/>
+            <w:tcBorders>
+              <w:top w:val="nil" w:sz="0"/>
+              <w:left w:val="nil" w:sz="0"/>
+              <w:bottom w:val="single" w:color="000000" w:sz="12"/>
+              <w:right w:val="nil" w:sz="0"/>
+            </w:tcBorders>
+            <w:tcMar>
+              <w:top w:type="dxa" w:w="60"/>
+              <w:left w:type="dxa" w:w="100"/>
+              <w:bottom w:type="dxa" w:w="60"/>
+              <w:right w:type="dxa" w:w="100"/>
+            </w:tcMar>
+          </w:tcPr>
+          <w:p>
+            <w:pPr>
+              <w:spacing w:after="0" w:line="320"/>
+              <w:jc w:val="center"/>
+            </w:pPr>
+            <w:r>
+              <w:rPr>
+                <w:rFonts w:ascii="Times New Roman" w:cs="Times New Roman" w:eastAsia="宋体" w:hAnsi="Times New Roman"/>
+                <w:color w:val="000000"/>
+                <w:sz w:val="18"/>
+                <w:szCs w:val="18"/>
+              </w:rPr>
+              <w:t xml:space="preserve">0</w:t>
+            </w:r>
+          </w:p>
+        </w:tc>
+      </w:tr>
+    </w:tbl>
+    <w:p>
+      <w:pPr>
+        <w:spacing w:after="0" w:before="200" w:line="20" w:lineRule="exact"/>
+      </w:pPr>
+    </w:p>
+    <w:p>
+      <w:pPr>
+        <w:spacing w:after="50" w:line="260" w:lineRule="auto"/>
+        <w:ind w:firstLine="360"/>
+      </w:pPr>
+      <w:r>
+        <w:rPr>
+          <w:rFonts w:ascii="Times New Roman" w:cs="Times New Roman" w:eastAsia="宋体" w:hAnsi="Times New Roman"/>
+          <w:color w:val="000000"/>
+          <w:sz w:val="18"/>
+          <w:szCs w:val="18"/>
+        </w:rPr>
+        <w:t xml:space="preserve">第一轮两组都需要读取120份来源，因此没有冷启动优势。第二至第四轮规则不变，B2复用已存规则，索引每轮仍需120次来源访问；两者正确率完全相同。第五轮70个实体更新，版本准入使B2拒绝70条旧规则并重新读源，剩余50条继续复用。第九轮同样重新读取63份来源。因此B2总源读取严格分解为120+70+63=253；减少的1122次源读取来自后续重复任务。</w:t>
+      </w:r>
+    </w:p>
+    <w:p>
+      <w:pPr>
+        <w:spacing w:after="50" w:line="260" w:lineRule="auto"/>
+        <w:ind w:firstLine="360"/>
+      </w:pPr>
+      <w:r>
+        <w:rPr>
+          <w:rFonts w:ascii="Times New Roman" w:cs="Times New Roman" w:eastAsia="宋体" w:hAnsi="Times New Roman"/>
+          <w:color w:val="000000"/>
+          <w:sz w:val="18"/>
+          <w:szCs w:val="18"/>
+        </w:rPr>
+        <w:t xml:space="preserve">完成率差异全部发生在第六、七轮：索引因来源不可用分别返回21次和44次unknown，B2利用此前已保存且版本匹配的规则完成这65题。来源可用的1375题两组均1375/1375正确；来源不可用的65题，索引0/65完成，B2为65/65。故4.51个百分点改善是这份协议下的信息可用性改善，并非推理能力、求解公式或语言理解能力变强。协议先让第五轮更新规则再在第六、七轮断源，给B2留下学习新版本的机会；未覆盖版本更新与首次断源同时发生的更困难情形。</w:t>
+      </w:r>
+    </w:p>
+    <w:p>
+      <w:pPr>
+        <w:spacing w:after="50" w:line="260" w:lineRule="auto"/>
+        <w:ind w:firstLine="360"/>
+      </w:pPr>
+      <w:r>
+        <w:rPr>
+          <w:rFonts w:ascii="Times New Roman" w:cs="Times New Roman" w:eastAsia="宋体" w:hAnsi="Times New Roman"/>
+          <w:color w:val="000000"/>
+          <w:sz w:val="18"/>
+          <w:szCs w:val="18"/>
+        </w:rPr>
+        <w:t xml:space="preserve">取消版本准入后，第五轮70题、第九轮63题直接使用旧规则，共133次首次错误。反馈发生在首次答案冻结后；来源可用时脚本才用新规则纠正缓存，因此错误没有延续至后续稳定轮。第八轮正常重启后B2仍有120次命中，而空目录策略需要重新读源120次；两者都120/120正确。持久化在本协议中的收益是避免重读，不是提高该轮正确率，也不是断电恢复保证。</w:t>
+      </w:r>
+    </w:p>
+    <w:p>
+      <w:pPr>
+        <w:pStyle w:val="Heading2"/>
+        <w:keepNext/>
+        <w:keepLines/>
+        <w:spacing w:after="80" w:before="120"/>
+      </w:pPr>
+      <w:r>
+        <w:rPr>
+          <w:rFonts w:ascii="Times New Roman" w:cs="Times New Roman" w:eastAsia="黑体" w:hAnsi="Times New Roman"/>
+          <w:b/>
+          <w:bCs/>
+          <w:color w:val="000000"/>
+          <w:sz w:val="22"/>
+          <w:szCs w:val="22"/>
+        </w:rPr>
+        <w:t xml:space="preserve">C. 操作代价与边界</w:t>
       </w:r>
     </w:p>
     <w:p>
@@ -5106,7 +6421,7 @@
           <w:sz w:val="18"/>
           <w:szCs w:val="18"/>
         </w:rPr>
-        <w:t xml:space="preserve">B2-full逻辑操作比索引基线增加41.53%，平均本地耗时8.44 ms，而索引约0.0102 ms。经验机制减少的是源取证和旧规则错误，不保证本地时延下降；这符合人的实践过程需要观察、验证和记录所带来的额外工作。</w:t>
+        <w:t xml:space="preserve">B2-full逻辑操作比索引基线增加41.53%，平均本地耗时8.44 ms，而索引约0.0102 ms。经验机制减少的是源取证和旧规则错误，不保证本地时延下降；该时延只测本地基准代码，不能据此解释真实人的学习成本。按等权逻辑操作计数，规则复用没有总操作优势；只有外部来源读取比本地召回和写回昂贵时，减少来源访问才可能抵消额外管理成本。当前没有测量外部服务费用、网络延迟或模型token，因而不能给出真实应用的盈亏阈值。</w:t>
       </w:r>
     </w:p>
     <w:p>
@@ -5125,7 +6440,7 @@
           <w:sz w:val="22"/>
           <w:szCs w:val="22"/>
         </w:rPr>
-        <w:t xml:space="preserve">C. 独立Bayesian Bandit控制</w:t>
+        <w:t xml:space="preserve">D. 独立Bayesian Bandit控制</w:t>
       </w:r>
     </w:p>
     <w:p>
@@ -5909,7 +7224,7 @@
           <w:sz w:val="22"/>
           <w:szCs w:val="22"/>
         </w:rPr>
-        <w:t xml:space="preserve">D. 结果解释</w:t>
+        <w:t xml:space="preserve">E. 结果解释</w:t>
       </w:r>
     </w:p>
     <w:p>
@@ -5924,7 +7239,7 @@
           <w:sz w:val="18"/>
           <w:szCs w:val="18"/>
         </w:rPr>
-        <w:t xml:space="preserve">主实验的收益来自经验形成过程完整：首次行动后写入带来源的候选，下一轮先检查版本，再决定复用或重新取证，反馈会保留失败和修订路径。B1只有固定旧记忆，不能在版本变化时形成新经验，因此它不等于完整机制。Bandit控制的收益来自探索样本分配，与主实验中的实践证据生命周期是不同层次。两组数据不能合并为一个模型效果数字。</w:t>
+        <w:t xml:space="preserve">主实验支持“已知规则可以在条件匹配时复用”的工程结论，没有证明经验主张如何由实践自动生成。B1只在首轮缓存规则，后续遇到新版本仍可读取来源，但不再缓存新规则；它的局限是重复取证，而非必然输出旧版本错误。候选形成、验证门槛和失败争议由另一项接口控制覆盖，不能将两项独立控制拼接成已经实测的完整端到端收益。Bandit控制的收益来自探索样本分配，与主实验中的实践证据生命周期是不同层次。两组数据不能合并为一个模型效果数字。</w:t>
       </w:r>
     </w:p>
     <w:p>
@@ -6217,7 +7532,7 @@
           <w:sz w:val="18"/>
           <w:szCs w:val="18"/>
         </w:rPr>
-        <w:t xml:space="preserve">实验支持三条限定结论：第一，在契约化任务中，完整机制比精确索引基线少81.60%源读取，并避免133次旧版本错误；第二，持久化使重启后的经验可以继续参与召回；第三，Beta更新和Thompson控制在合成数值环境中符合既定公式。代价是更多逻辑操作和本地时延。本文不声称模型参数自进化、完整Bayesian RL或普遍语言模型收益。后续应把同一实践流程接入真实宿主AI，按首次答案冻结、客观工具结果、反馈、复用和反例逐轮记录，以检验人的实践模型是否真正改善宿主Agent在同类问题上的任务结果。</w:t>
+        <w:t xml:space="preserve">实验支持三条限定结论：第一，在契约化任务中，带版本准入的规则复用策略比精确索引基线少81.60%源读取；取消版本准入的对照出现133次旧版本错误；第二，持久化使重启后的经验可以继续参与召回；第三，Beta更新和Thompson控制在合成数值环境中符合既定公式。代价是更多逻辑操作和本地时延。本文不声称模型参数自进化、完整Bayesian RL或普遍语言模型收益。后续应把同一实践流程接入真实宿主AI，按首次答案冻结、客观工具结果、反馈、复用和反例逐轮记录，以检验人的实践模型是否真正改善宿主Agent在同类问题上的任务结果。</w:t>
       </w:r>
     </w:p>
     <w:p>

</xml_diff>

<commit_message>
docs: add numbered pseudocode for practice and evaluation algorithms
</commit_message>
<xml_diff>
--- a/docs/论文/补天多轮经验机制-IEEE.docx
+++ b/docs/论文/补天多轮经验机制-IEEE.docx
@@ -2363,7 +2363,7 @@
           <w:sz w:val="22"/>
           <w:szCs w:val="22"/>
         </w:rPr>
-        <w:t xml:space="preserve">F. 有限闭环的条件命题</w:t>
+        <w:t xml:space="preserve">F. 带输入输出与错误分支的伪代码</w:t>
       </w:r>
     </w:p>
     <w:p>
@@ -2378,52 +2378,1210 @@
           <w:sz w:val="18"/>
           <w:szCs w:val="18"/>
         </w:rPr>
-        <w:t xml:space="preserve">命题1：若每次状态更新都经MemoryStore实践接口，candidate升级前必须存在至少两条通过接口去重的成功观察且无失败。证明直接来自升级分支：程序在事务内读取成功数和失败数，仅在successes≥2、failures=0且旧状态属于candidate或pending_validation时置warm。该命题证明的是程序门槛，无法证明外部证据真实，也无法保证绕过接口的人工写入满足同样条件。两次成功是必要的接口条件，不能作为经验普遍有效的充分条件。</w:t>
-      </w:r>
-    </w:p>
-    <w:p>
-      <w:pPr>
-        <w:spacing w:after="50" w:line="260" w:lineRule="auto"/>
-        <w:ind w:firstLine="360"/>
-      </w:pPr>
-      <w:r>
-        <w:rPr>
-          <w:rFonts w:ascii="Times New Roman" w:cs="Times New Roman" w:eastAsia="宋体" w:hAnsi="Times New Roman"/>
-          <w:color w:val="000000"/>
-          <w:sz w:val="18"/>
-          <w:szCs w:val="18"/>
-        </w:rPr>
-        <w:t xml:space="preserve">命题2：若当前任务版本可确定，且宿主严格执行版本准入，旧版本候选不能直接产生当前版本的已接受结果。证明分两种情况：候选版本匹配时进入正常求解；不匹配时必须重新取证或返回unknown。该条件命题的关键假设是版本识别和准入确实执行；no-version消融移除该假设，因此产生的错误用于说明守卫的作用，不是现实场景永不出错的证明。</w:t>
-      </w:r>
-    </w:p>
-    <w:p>
-      <w:pPr>
-        <w:spacing w:after="50" w:line="260" w:lineRule="auto"/>
-        <w:ind w:firstLine="360"/>
-      </w:pPr>
-      <w:r>
-        <w:rPr>
-          <w:rFonts w:ascii="Times New Roman" w:cs="Times New Roman" w:eastAsia="宋体" w:hAnsi="Times New Roman"/>
-          <w:color w:val="000000"/>
-          <w:sz w:val="18"/>
-          <w:szCs w:val="18"/>
-        </w:rPr>
-        <w:t xml:space="preserve">命题3：一次unknown观察不应计入成功数或失败数。代码只对outcome等于success或failure的记录进行相应计数，unknown可以保留观察和版本记录，但不能据此增加支持样本。由此可避免资料断开或停止未确认时把缺失结果解释为成功。未知次数上升仍会降低任务完成率，因此unknown是诚实记录不确定性的代价，不是可以从评测分母中移走的无效样本。</w:t>
-      </w:r>
-    </w:p>
-    <w:p>
-      <w:pPr>
-        <w:spacing w:after="50" w:line="260" w:lineRule="auto"/>
-        <w:ind w:firstLine="360"/>
-      </w:pPr>
-      <w:r>
-        <w:rPr>
-          <w:rFonts w:ascii="Times New Roman" w:cs="Times New Roman" w:eastAsia="宋体" w:hAnsi="Times New Roman"/>
-          <w:color w:val="000000"/>
-          <w:sz w:val="18"/>
-          <w:szCs w:val="18"/>
-        </w:rPr>
-        <w:t xml:space="preserve">过程闭环成立还需要宿主实际执行行动、返回可靠观察并在下一轮使用记录。数据库写入成功只能证明保存完成；主张在多个任务上有效需要外部结果，长期收益需要跨轮对照。本文将可执行闭环与认识正确性分开论证：前者由接口、事务和恢复控制验证，后者只在给定实验任务族内报告结果。</w:t>
+        <w:t xml:space="preserve">以下伪代码按实际责任边界编写。算法1a对应生产实践接口；算法2a、3a、4a对应数学模块；算法5a是宿主侧恢复与准入流程，不能当作一个已实现的单函数；算法6是主实验真实执行路径。算法6直接写warm，不能代替算法1a的候选验证。行号表示执行顺序，IF/ELSE和FOR块用END闭合。</w:t>
+      </w:r>
+    </w:p>
+    <w:p>
+      <w:pPr>
+        <w:pStyle w:val="Heading3"/>
+        <w:keepNext/>
+        <w:keepLines/>
+        <w:spacing w:after="80" w:before="120"/>
+      </w:pPr>
+      <w:r>
+        <w:rPr>
+          <w:rFonts w:ascii="Times New Roman" w:cs="Times New Roman" w:eastAsia="黑体" w:hAnsi="Times New Roman"/>
+          <w:b/>
+          <w:bCs/>
+          <w:color w:val="000000"/>
+          <w:sz w:val="20"/>
+          <w:szCs w:val="20"/>
+        </w:rPr>
+        <w:t xml:space="preserve">算法1a 记录实践反馈（生产接口）</w:t>
+      </w:r>
+    </w:p>
+    <w:p>
+      <w:pPr>
+        <w:spacing w:after="0" w:before="0" w:line="220"/>
+        <w:ind w:firstLine="360"/>
+      </w:pPr>
+      <w:r>
+        <w:rPr>
+          <w:rFonts w:ascii="Times New Roman" w:cs="Times New Roman" w:eastAsia="宋体" w:hAnsi="Times New Roman"/>
+          <w:color w:val="000000"/>
+          <w:sz w:val="16"/>
+          <w:szCs w:val="16"/>
+        </w:rPr>
+        <w:t xml:space="preserve">01  INPUT: member, memory_id, content, outcome, independent_key, evidence_ref</w:t>
+      </w:r>
+    </w:p>
+    <w:p>
+      <w:pPr>
+        <w:spacing w:after="0" w:before="0" w:line="220"/>
+        <w:ind w:firstLine="360"/>
+      </w:pPr>
+      <w:r>
+        <w:rPr>
+          <w:rFonts w:ascii="Times New Roman" w:cs="Times New Roman" w:eastAsia="宋体" w:hAnsi="Times New Roman"/>
+          <w:color w:val="000000"/>
+          <w:sz w:val="16"/>
+          <w:szCs w:val="16"/>
+        </w:rPr>
+        <w:t xml:space="preserve">02  OUTPUT: memory_id, status, successes, failures；或明确错误</w:t>
+      </w:r>
+    </w:p>
+    <w:p>
+      <w:pPr>
+        <w:spacing w:after="0" w:before="0" w:line="220"/>
+        <w:ind w:firstLine="360"/>
+      </w:pPr>
+      <w:r>
+        <w:rPr>
+          <w:rFonts w:ascii="Times New Roman" w:cs="Times New Roman" w:eastAsia="宋体" w:hAnsi="Times New Roman"/>
+          <w:color w:val="000000"/>
+          <w:sz w:val="16"/>
+          <w:szCs w:val="16"/>
+        </w:rPr>
+        <w:t xml:space="preserve">03  REQUIRE outcome IN {success, failure, unknown} 且 independent_key非空</w:t>
+      </w:r>
+    </w:p>
+    <w:p>
+      <w:pPr>
+        <w:spacing w:after="0" w:before="0" w:line="220"/>
+        <w:ind w:firstLine="360"/>
+      </w:pPr>
+      <w:r>
+        <w:rPr>
+          <w:rFonts w:ascii="Times New Roman" w:cs="Times New Roman" w:eastAsia="宋体" w:hAnsi="Times New Roman"/>
+          <w:color w:val="000000"/>
+          <w:sz w:val="16"/>
+          <w:szCs w:val="16"/>
+        </w:rPr>
+        <w:t xml:space="preserve">04  IF success且无evidence_ref: RAISE practice_success_evidence_required</w:t>
+      </w:r>
+    </w:p>
+    <w:p>
+      <w:pPr>
+        <w:spacing w:after="0" w:before="0" w:line="220"/>
+        <w:ind w:firstLine="360"/>
+      </w:pPr>
+      <w:r>
+        <w:rPr>
+          <w:rFonts w:ascii="Times New Roman" w:cs="Times New Roman" w:eastAsia="宋体" w:hAnsi="Times New Roman"/>
+          <w:color w:val="000000"/>
+          <w:sz w:val="16"/>
+          <w:szCs w:val="16"/>
+        </w:rPr>
+        <w:t xml:space="preserve">05  由服务验证证据归属与正文哈希；无效则RAISE并结束</w:t>
+      </w:r>
+    </w:p>
+    <w:p>
+      <w:pPr>
+        <w:spacing w:after="0" w:before="0" w:line="220"/>
+        <w:ind w:firstLine="360"/>
+      </w:pPr>
+      <w:r>
+        <w:rPr>
+          <w:rFonts w:ascii="Times New Roman" w:cs="Times New Roman" w:eastAsia="宋体" w:hAnsi="Times New Roman"/>
+          <w:color w:val="000000"/>
+          <w:sz w:val="16"/>
+          <w:szCs w:val="16"/>
+        </w:rPr>
+        <w:t xml:space="preserve">06  BEGIN IMMEDIATE（成员记忆数据库事务）</w:t>
+      </w:r>
+    </w:p>
+    <w:p>
+      <w:pPr>
+        <w:spacing w:after="0" w:before="0" w:line="220"/>
+        <w:ind w:firstLine="360"/>
+      </w:pPr>
+      <w:r>
+        <w:rPr>
+          <w:rFonts w:ascii="Times New Roman" w:cs="Times New Roman" w:eastAsia="宋体" w:hAnsi="Times New Roman"/>
+          <w:color w:val="000000"/>
+          <w:sz w:val="16"/>
+          <w:szCs w:val="16"/>
+        </w:rPr>
+        <w:t xml:space="preserve">07  IF 独立键已用，或证据引用/摘要已用: RAISE重复证据错误</w:t>
+      </w:r>
+    </w:p>
+    <w:p>
+      <w:pPr>
+        <w:spacing w:after="0" w:before="0" w:line="220"/>
+        <w:ind w:firstLine="360"/>
+      </w:pPr>
+      <w:r>
+        <w:rPr>
+          <w:rFonts w:ascii="Times New Roman" w:cs="Times New Roman" w:eastAsia="宋体" w:hAnsi="Times New Roman"/>
+          <w:color w:val="000000"/>
+          <w:sz w:val="16"/>
+          <w:szCs w:val="16"/>
+        </w:rPr>
+        <w:t xml:space="preserve">08  读取经验；不存在则创建candidate；如指定正文哈希则校验</w:t>
+      </w:r>
+    </w:p>
+    <w:p>
+      <w:pPr>
+        <w:spacing w:after="0" w:before="0" w:line="220"/>
+        <w:ind w:firstLine="360"/>
+      </w:pPr>
+      <w:r>
+        <w:rPr>
+          <w:rFonts w:ascii="Times New Roman" w:cs="Times New Roman" w:eastAsia="宋体" w:hAnsi="Times New Roman"/>
+          <w:color w:val="000000"/>
+          <w:sz w:val="16"/>
+          <w:szCs w:val="16"/>
+        </w:rPr>
+        <w:t xml:space="preserve">09  插入观察、环境和证据摘要；统计该memory_id的成功数s与失败数f</w:t>
+      </w:r>
+    </w:p>
+    <w:p>
+      <w:pPr>
+        <w:spacing w:after="0" w:before="0" w:line="220"/>
+        <w:ind w:firstLine="360"/>
+      </w:pPr>
+      <w:r>
+        <w:rPr>
+          <w:rFonts w:ascii="Times New Roman" w:cs="Times New Roman" w:eastAsia="宋体" w:hAnsi="Times New Roman"/>
+          <w:color w:val="000000"/>
+          <w:sz w:val="16"/>
+          <w:szCs w:val="16"/>
+        </w:rPr>
+        <w:t xml:space="preserve">10  IF outcome=failure: 成熟经验置disputed，否则保留candidate；降低confidence与weight</w:t>
+      </w:r>
+    </w:p>
+    <w:p>
+      <w:pPr>
+        <w:spacing w:after="0" w:before="0" w:line="220"/>
+        <w:ind w:firstLine="360"/>
+      </w:pPr>
+      <w:r>
+        <w:rPr>
+          <w:rFonts w:ascii="Times New Roman" w:cs="Times New Roman" w:eastAsia="宋体" w:hAnsi="Times New Roman"/>
+          <w:color w:val="000000"/>
+          <w:sz w:val="16"/>
+          <w:szCs w:val="16"/>
+        </w:rPr>
+        <w:t xml:space="preserve">11  ELSE IF outcome=success AND s&gt;=2 AND f=0 AND旧状态为candidate或pending_validation: 置warm并有界增加分值</w:t>
+      </w:r>
+    </w:p>
+    <w:p>
+      <w:pPr>
+        <w:spacing w:after="0" w:before="0" w:line="220"/>
+        <w:ind w:firstLine="360"/>
+      </w:pPr>
+      <w:r>
+        <w:rPr>
+          <w:rFonts w:ascii="Times New Roman" w:cs="Times New Roman" w:eastAsia="宋体" w:hAnsi="Times New Roman"/>
+          <w:color w:val="000000"/>
+          <w:sz w:val="16"/>
+          <w:szCs w:val="16"/>
+        </w:rPr>
+        <w:t xml:space="preserve">12  ELSE: 不执行升级；unknown不计入成功或失败</w:t>
+      </w:r>
+    </w:p>
+    <w:p>
+      <w:pPr>
+        <w:spacing w:after="0" w:before="0" w:line="220"/>
+        <w:ind w:firstLine="360"/>
+      </w:pPr>
+      <w:r>
+        <w:rPr>
+          <w:rFonts w:ascii="Times New Roman" w:cs="Times New Roman" w:eastAsia="宋体" w:hAnsi="Times New Roman"/>
+          <w:color w:val="000000"/>
+          <w:sz w:val="16"/>
+          <w:szCs w:val="16"/>
+        </w:rPr>
+        <w:t xml:space="preserve">13  保存新版本、父链、来源引用和领域技能统计；COMMIT</w:t>
+      </w:r>
+    </w:p>
+    <w:p>
+      <w:pPr>
+        <w:spacing w:after="0" w:before="0" w:line="220"/>
+        <w:ind w:firstLine="360"/>
+      </w:pPr>
+      <w:r>
+        <w:rPr>
+          <w:rFonts w:ascii="Times New Roman" w:cs="Times New Roman" w:eastAsia="宋体" w:hAnsi="Times New Roman"/>
+          <w:color w:val="000000"/>
+          <w:sz w:val="16"/>
+          <w:szCs w:val="16"/>
+        </w:rPr>
+        <w:t xml:space="preserve">14  ON事务内异常: ROLLBACK；重新抛出错误</w:t>
+      </w:r>
+    </w:p>
+    <w:p>
+      <w:pPr>
+        <w:spacing w:after="0" w:before="0" w:line="220"/>
+        <w:ind w:firstLine="360"/>
+      </w:pPr>
+      <w:r>
+        <w:rPr>
+          <w:rFonts w:ascii="Times New Roman" w:cs="Times New Roman" w:eastAsia="宋体" w:hAnsi="Times New Roman"/>
+          <w:color w:val="000000"/>
+          <w:sz w:val="16"/>
+          <w:szCs w:val="16"/>
+        </w:rPr>
+        <w:t xml:space="preserve">15  事务后服务另行追加practice_observed事件；失败不得宣称两库整体回滚</w:t>
+      </w:r>
+    </w:p>
+    <w:p>
+      <w:pPr>
+        <w:spacing w:after="0" w:before="0" w:line="220"/>
+        <w:ind w:firstLine="360"/>
+      </w:pPr>
+      <w:r>
+        <w:rPr>
+          <w:rFonts w:ascii="Times New Roman" w:cs="Times New Roman" w:eastAsia="宋体" w:hAnsi="Times New Roman"/>
+          <w:color w:val="000000"/>
+          <w:sz w:val="16"/>
+          <w:szCs w:val="16"/>
+        </w:rPr>
+        <w:t xml:space="preserve">16  RETURN 实际已提交状态与计数</w:t>
+      </w:r>
+    </w:p>
+    <w:p>
+      <w:pPr>
+        <w:pStyle w:val="Heading3"/>
+        <w:keepNext/>
+        <w:keepLines/>
+        <w:spacing w:after="80" w:before="120"/>
+      </w:pPr>
+      <w:r>
+        <w:rPr>
+          <w:rFonts w:ascii="Times New Roman" w:cs="Times New Roman" w:eastAsia="黑体" w:hAnsi="Times New Roman"/>
+          <w:b/>
+          <w:bCs/>
+          <w:color w:val="000000"/>
+          <w:sz w:val="20"/>
+          <w:szCs w:val="20"/>
+        </w:rPr>
+        <w:t xml:space="preserve">算法2a Beta证据摘要（可选数学模块）</w:t>
+      </w:r>
+    </w:p>
+    <w:p>
+      <w:pPr>
+        <w:spacing w:after="0" w:before="0" w:line="220"/>
+        <w:ind w:firstLine="360"/>
+      </w:pPr>
+      <w:r>
+        <w:rPr>
+          <w:rFonts w:ascii="Times New Roman" w:cs="Times New Roman" w:eastAsia="宋体" w:hAnsi="Times New Roman"/>
+          <w:color w:val="000000"/>
+          <w:sz w:val="16"/>
+          <w:szCs w:val="16"/>
+        </w:rPr>
+        <w:t xml:space="preserve">01  INPUT: alpha&gt;0, beta&gt;0, outcome, q,d,m IN </w:t>
+      </w:r>
+      <w:r>
+        <w:rPr>
+          <w:rFonts w:ascii="Times New Roman" w:cs="Times New Roman" w:eastAsia="Times New Roman" w:hAnsi="Times New Roman"/>
+          <w:sz w:val="16"/>
+          <w:szCs w:val="16"/>
+          <w:vertAlign w:val="superscript"/>
+        </w:rPr>
+        <w:t xml:space="preserve">[0,1]</w:t>
+      </w:r>
+    </w:p>
+    <w:p>
+      <w:pPr>
+        <w:spacing w:after="0" w:before="0" w:line="220"/>
+        <w:ind w:firstLine="360"/>
+      </w:pPr>
+      <w:r>
+        <w:rPr>
+          <w:rFonts w:ascii="Times New Roman" w:cs="Times New Roman" w:eastAsia="宋体" w:hAnsi="Times New Roman"/>
+          <w:color w:val="000000"/>
+          <w:sz w:val="16"/>
+          <w:szCs w:val="16"/>
+        </w:rPr>
+        <w:t xml:space="preserve">02  OUTPUT: 更新参数与后验均值；不改变生产生命周期状态</w:t>
+      </w:r>
+    </w:p>
+    <w:p>
+      <w:pPr>
+        <w:spacing w:after="0" w:before="0" w:line="220"/>
+        <w:ind w:firstLine="360"/>
+      </w:pPr>
+      <w:r>
+        <w:rPr>
+          <w:rFonts w:ascii="Times New Roman" w:cs="Times New Roman" w:eastAsia="宋体" w:hAnsi="Times New Roman"/>
+          <w:color w:val="000000"/>
+          <w:sz w:val="16"/>
+          <w:szCs w:val="16"/>
+        </w:rPr>
+        <w:t xml:space="preserve">03  检查参数有限性与范围；不合法则RAISE</w:t>
+      </w:r>
+    </w:p>
+    <w:p>
+      <w:pPr>
+        <w:spacing w:after="0" w:before="0" w:line="220"/>
+        <w:ind w:firstLine="360"/>
+      </w:pPr>
+      <w:r>
+        <w:rPr>
+          <w:rFonts w:ascii="Times New Roman" w:cs="Times New Roman" w:eastAsia="宋体" w:hAnsi="Times New Roman"/>
+          <w:color w:val="000000"/>
+          <w:sz w:val="16"/>
+          <w:szCs w:val="16"/>
+        </w:rPr>
+        <w:t xml:space="preserve">04  w &lt;- q*d*m</w:t>
+      </w:r>
+    </w:p>
+    <w:p>
+      <w:pPr>
+        <w:spacing w:after="0" w:before="0" w:line="220"/>
+        <w:ind w:firstLine="360"/>
+      </w:pPr>
+      <w:r>
+        <w:rPr>
+          <w:rFonts w:ascii="Times New Roman" w:cs="Times New Roman" w:eastAsia="宋体" w:hAnsi="Times New Roman"/>
+          <w:color w:val="000000"/>
+          <w:sz w:val="16"/>
+          <w:szCs w:val="16"/>
+        </w:rPr>
+        <w:t xml:space="preserve">05  IF outcome=success: alpha &lt;- alpha+w</w:t>
+      </w:r>
+    </w:p>
+    <w:p>
+      <w:pPr>
+        <w:spacing w:after="0" w:before="0" w:line="220"/>
+        <w:ind w:firstLine="360"/>
+      </w:pPr>
+      <w:r>
+        <w:rPr>
+          <w:rFonts w:ascii="Times New Roman" w:cs="Times New Roman" w:eastAsia="宋体" w:hAnsi="Times New Roman"/>
+          <w:color w:val="000000"/>
+          <w:sz w:val="16"/>
+          <w:szCs w:val="16"/>
+        </w:rPr>
+        <w:t xml:space="preserve">06  ELSE IF outcome=failure: beta &lt;- beta+w</w:t>
+      </w:r>
+    </w:p>
+    <w:p>
+      <w:pPr>
+        <w:spacing w:after="0" w:before="0" w:line="220"/>
+        <w:ind w:firstLine="360"/>
+      </w:pPr>
+      <w:r>
+        <w:rPr>
+          <w:rFonts w:ascii="Times New Roman" w:cs="Times New Roman" w:eastAsia="宋体" w:hAnsi="Times New Roman"/>
+          <w:color w:val="000000"/>
+          <w:sz w:val="16"/>
+          <w:szCs w:val="16"/>
+        </w:rPr>
+        <w:t xml:space="preserve">07  ELSE IF outcome=unknown: 保持参数</w:t>
+      </w:r>
+    </w:p>
+    <w:p>
+      <w:pPr>
+        <w:spacing w:after="0" w:before="0" w:line="220"/>
+        <w:ind w:firstLine="360"/>
+      </w:pPr>
+      <w:r>
+        <w:rPr>
+          <w:rFonts w:ascii="Times New Roman" w:cs="Times New Roman" w:eastAsia="宋体" w:hAnsi="Times New Roman"/>
+          <w:color w:val="000000"/>
+          <w:sz w:val="16"/>
+          <w:szCs w:val="16"/>
+        </w:rPr>
+        <w:t xml:space="preserve">08  ELSE: RAISE invalid_outcome</w:t>
+      </w:r>
+    </w:p>
+    <w:p>
+      <w:pPr>
+        <w:spacing w:after="0" w:before="0" w:line="220"/>
+        <w:ind w:firstLine="360"/>
+      </w:pPr>
+      <w:r>
+        <w:rPr>
+          <w:rFonts w:ascii="Times New Roman" w:cs="Times New Roman" w:eastAsia="宋体" w:hAnsi="Times New Roman"/>
+          <w:color w:val="000000"/>
+          <w:sz w:val="16"/>
+          <w:szCs w:val="16"/>
+        </w:rPr>
+        <w:t xml:space="preserve">09  RETURN alpha, beta, alpha/(alpha+beta)</w:t>
+      </w:r>
+    </w:p>
+    <w:p>
+      <w:pPr>
+        <w:spacing w:after="0" w:before="0" w:line="220"/>
+        <w:ind w:firstLine="360"/>
+      </w:pPr>
+      <w:r>
+        <w:rPr>
+          <w:rFonts w:ascii="Times New Roman" w:cs="Times New Roman" w:eastAsia="宋体" w:hAnsi="Times New Roman"/>
+          <w:color w:val="000000"/>
+          <w:sz w:val="16"/>
+          <w:szCs w:val="16"/>
+        </w:rPr>
+        <w:t xml:space="preserve">10  NOTE: 去重在算法1a执行；分数权重不是独立性的证明</w:t>
+      </w:r>
+    </w:p>
+    <w:p>
+      <w:pPr>
+        <w:pStyle w:val="Heading3"/>
+        <w:keepNext/>
+        <w:keepLines/>
+        <w:spacing w:after="80" w:before="120"/>
+      </w:pPr>
+      <w:r>
+        <w:rPr>
+          <w:rFonts w:ascii="Times New Roman" w:cs="Times New Roman" w:eastAsia="黑体" w:hAnsi="Times New Roman"/>
+          <w:b/>
+          <w:bCs/>
+          <w:color w:val="000000"/>
+          <w:sz w:val="20"/>
+          <w:szCs w:val="20"/>
+        </w:rPr>
+        <w:t xml:space="preserve">算法3a 求证行动排序（显式后验控制）</w:t>
+      </w:r>
+    </w:p>
+    <w:p>
+      <w:pPr>
+        <w:spacing w:after="0" w:before="0" w:line="220"/>
+        <w:ind w:firstLine="360"/>
+      </w:pPr>
+      <w:r>
+        <w:rPr>
+          <w:rFonts w:ascii="Times New Roman" w:cs="Times New Roman" w:eastAsia="宋体" w:hAnsi="Times New Roman"/>
+          <w:color w:val="000000"/>
+          <w:sz w:val="16"/>
+          <w:szCs w:val="16"/>
+        </w:rPr>
+        <w:t xml:space="preserve">01  INPUT: 先验p；行动a的结果概率r；各结果后验p_y；成本cost与惩罚lambda</w:t>
+      </w:r>
+    </w:p>
+    <w:p>
+      <w:pPr>
+        <w:spacing w:after="0" w:before="0" w:line="220"/>
+        <w:ind w:firstLine="360"/>
+      </w:pPr>
+      <w:r>
+        <w:rPr>
+          <w:rFonts w:ascii="Times New Roman" w:cs="Times New Roman" w:eastAsia="宋体" w:hAnsi="Times New Roman"/>
+          <w:color w:val="000000"/>
+          <w:sz w:val="16"/>
+          <w:szCs w:val="16"/>
+        </w:rPr>
+        <w:t xml:space="preserve">02  OUTPUT: 合法行动的EIG与成本调整得分</w:t>
+      </w:r>
+    </w:p>
+    <w:p>
+      <w:pPr>
+        <w:spacing w:after="0" w:before="0" w:line="220"/>
+        <w:ind w:firstLine="360"/>
+      </w:pPr>
+      <w:r>
+        <w:rPr>
+          <w:rFonts w:ascii="Times New Roman" w:cs="Times New Roman" w:eastAsia="宋体" w:hAnsi="Times New Roman"/>
+          <w:color w:val="000000"/>
+          <w:sz w:val="16"/>
+          <w:szCs w:val="16"/>
+        </w:rPr>
+        <w:t xml:space="preserve">03  FOR EACH action a:</w:t>
+      </w:r>
+    </w:p>
+    <w:p>
+      <w:pPr>
+        <w:spacing w:after="0" w:before="0" w:line="220"/>
+        <w:ind w:firstLine="360"/>
+      </w:pPr>
+      <w:r>
+        <w:rPr>
+          <w:rFonts w:ascii="Times New Roman" w:cs="Times New Roman" w:eastAsia="宋体" w:hAnsi="Times New Roman"/>
+          <w:color w:val="000000"/>
+          <w:sz w:val="16"/>
+          <w:szCs w:val="16"/>
+        </w:rPr>
+        <w:t xml:space="preserve">04    检查p、r、p_y有限非负、维度一致、各分布归一</w:t>
+      </w:r>
+    </w:p>
+    <w:p>
+      <w:pPr>
+        <w:spacing w:after="0" w:before="0" w:line="220"/>
+        <w:ind w:firstLine="360"/>
+      </w:pPr>
+      <w:r>
+        <w:rPr>
+          <w:rFonts w:ascii="Times New Roman" w:cs="Times New Roman" w:eastAsia="宋体" w:hAnsi="Times New Roman"/>
+          <w:color w:val="000000"/>
+          <w:sz w:val="16"/>
+          <w:szCs w:val="16"/>
+        </w:rPr>
+        <w:t xml:space="preserve">05    检查对每个分量i有 sum_y r_y*p_y[i] 与 p[i]在容差内一致</w:t>
+      </w:r>
+    </w:p>
+    <w:p>
+      <w:pPr>
+        <w:spacing w:after="0" w:before="0" w:line="220"/>
+        <w:ind w:firstLine="360"/>
+      </w:pPr>
+      <w:r>
+        <w:rPr>
+          <w:rFonts w:ascii="Times New Roman" w:cs="Times New Roman" w:eastAsia="宋体" w:hAnsi="Times New Roman"/>
+          <w:color w:val="000000"/>
+          <w:sz w:val="16"/>
+          <w:szCs w:val="16"/>
+        </w:rPr>
+        <w:t xml:space="preserve">06    不合法则RAISE，不凭文字猜测后验</w:t>
+      </w:r>
+    </w:p>
+    <w:p>
+      <w:pPr>
+        <w:spacing w:after="0" w:before="0" w:line="220"/>
+        <w:ind w:firstLine="360"/>
+      </w:pPr>
+      <w:r>
+        <w:rPr>
+          <w:rFonts w:ascii="Times New Roman" w:cs="Times New Roman" w:eastAsia="宋体" w:hAnsi="Times New Roman"/>
+          <w:color w:val="000000"/>
+          <w:sz w:val="16"/>
+          <w:szCs w:val="16"/>
+        </w:rPr>
+        <w:t xml:space="preserve">07    eig[a] &lt;- H(p)-sum_y r_y*H(p_y)</w:t>
+      </w:r>
+    </w:p>
+    <w:p>
+      <w:pPr>
+        <w:spacing w:after="0" w:before="0" w:line="220"/>
+        <w:ind w:firstLine="360"/>
+      </w:pPr>
+      <w:r>
+        <w:rPr>
+          <w:rFonts w:ascii="Times New Roman" w:cs="Times New Roman" w:eastAsia="宋体" w:hAnsi="Times New Roman"/>
+          <w:color w:val="000000"/>
+          <w:sz w:val="16"/>
+          <w:szCs w:val="16"/>
+        </w:rPr>
+        <w:t xml:space="preserve">08    score[a] &lt;- eig[a]-lambda*cost[a]</w:t>
+      </w:r>
+    </w:p>
+    <w:p>
+      <w:pPr>
+        <w:spacing w:after="0" w:before="0" w:line="220"/>
+        <w:ind w:firstLine="360"/>
+      </w:pPr>
+      <w:r>
+        <w:rPr>
+          <w:rFonts w:ascii="Times New Roman" w:cs="Times New Roman" w:eastAsia="宋体" w:hAnsi="Times New Roman"/>
+          <w:color w:val="000000"/>
+          <w:sz w:val="16"/>
+          <w:szCs w:val="16"/>
+        </w:rPr>
+        <w:t xml:space="preserve">09  END FOR</w:t>
+      </w:r>
+    </w:p>
+    <w:p>
+      <w:pPr>
+        <w:spacing w:after="0" w:before="0" w:line="220"/>
+        <w:ind w:firstLine="360"/>
+      </w:pPr>
+      <w:r>
+        <w:rPr>
+          <w:rFonts w:ascii="Times New Roman" w:cs="Times New Roman" w:eastAsia="宋体" w:hAnsi="Times New Roman"/>
+          <w:color w:val="000000"/>
+          <w:sz w:val="16"/>
+          <w:szCs w:val="16"/>
+        </w:rPr>
+        <w:t xml:space="preserve">10  RETURN 按score排序的行动；执行选择仍由调用方决定</w:t>
+      </w:r>
+    </w:p>
+    <w:p>
+      <w:pPr>
+        <w:pStyle w:val="Heading3"/>
+        <w:keepNext/>
+        <w:keepLines/>
+        <w:spacing w:after="80" w:before="120"/>
+      </w:pPr>
+      <w:r>
+        <w:rPr>
+          <w:rFonts w:ascii="Times New Roman" w:cs="Times New Roman" w:eastAsia="黑体" w:hAnsi="Times New Roman"/>
+          <w:b/>
+          <w:bCs/>
+          <w:color w:val="000000"/>
+          <w:sz w:val="20"/>
+          <w:szCs w:val="20"/>
+        </w:rPr>
+        <w:t xml:space="preserve">算法4a Thompson探索分配（Bandit控制）</w:t>
+      </w:r>
+    </w:p>
+    <w:p>
+      <w:pPr>
+        <w:spacing w:after="0" w:before="0" w:line="220"/>
+        <w:ind w:firstLine="360"/>
+      </w:pPr>
+      <w:r>
+        <w:rPr>
+          <w:rFonts w:ascii="Times New Roman" w:cs="Times New Roman" w:eastAsia="宋体" w:hAnsi="Times New Roman"/>
+          <w:color w:val="000000"/>
+          <w:sz w:val="16"/>
+          <w:szCs w:val="16"/>
+        </w:rPr>
+        <w:t xml:space="preserve">01  INPUT: K个臂的正参数alpha[k], beta[k]与随机数生成器</w:t>
+      </w:r>
+    </w:p>
+    <w:p>
+      <w:pPr>
+        <w:spacing w:after="0" w:before="0" w:line="220"/>
+        <w:ind w:firstLine="360"/>
+      </w:pPr>
+      <w:r>
+        <w:rPr>
+          <w:rFonts w:ascii="Times New Roman" w:cs="Times New Roman" w:eastAsia="宋体" w:hAnsi="Times New Roman"/>
+          <w:color w:val="000000"/>
+          <w:sz w:val="16"/>
+          <w:szCs w:val="16"/>
+        </w:rPr>
+        <w:t xml:space="preserve">02  OUTPUT: 选择臂k；获得反馈后更新该臂</w:t>
+      </w:r>
+    </w:p>
+    <w:p>
+      <w:pPr>
+        <w:spacing w:after="0" w:before="0" w:line="220"/>
+        <w:ind w:firstLine="360"/>
+      </w:pPr>
+      <w:r>
+        <w:rPr>
+          <w:rFonts w:ascii="Times New Roman" w:cs="Times New Roman" w:eastAsia="宋体" w:hAnsi="Times New Roman"/>
+          <w:color w:val="000000"/>
+          <w:sz w:val="16"/>
+          <w:szCs w:val="16"/>
+        </w:rPr>
+        <w:t xml:space="preserve">03  REQUIRE K&gt;0；所有参数有限且为正</w:t>
+      </w:r>
+    </w:p>
+    <w:p>
+      <w:pPr>
+        <w:spacing w:after="0" w:before="0" w:line="220"/>
+        <w:ind w:firstLine="360"/>
+      </w:pPr>
+      <w:r>
+        <w:rPr>
+          <w:rFonts w:ascii="Times New Roman" w:cs="Times New Roman" w:eastAsia="宋体" w:hAnsi="Times New Roman"/>
+          <w:color w:val="000000"/>
+          <w:sz w:val="16"/>
+          <w:szCs w:val="16"/>
+        </w:rPr>
+        <w:t xml:space="preserve">04  FOR k=1 TO K: sample[k] &lt;- BetaSample(alpha[k],beta[k])</w:t>
+      </w:r>
+    </w:p>
+    <w:p>
+      <w:pPr>
+        <w:spacing w:after="0" w:before="0" w:line="220"/>
+        <w:ind w:firstLine="360"/>
+      </w:pPr>
+      <w:r>
+        <w:rPr>
+          <w:rFonts w:ascii="Times New Roman" w:cs="Times New Roman" w:eastAsia="宋体" w:hAnsi="Times New Roman"/>
+          <w:color w:val="000000"/>
+          <w:sz w:val="16"/>
+          <w:szCs w:val="16"/>
+        </w:rPr>
+        <w:t xml:space="preserve">05  END FOR</w:t>
+      </w:r>
+    </w:p>
+    <w:p>
+      <w:pPr>
+        <w:spacing w:after="0" w:before="0" w:line="220"/>
+        <w:ind w:firstLine="360"/>
+      </w:pPr>
+      <w:r>
+        <w:rPr>
+          <w:rFonts w:ascii="Times New Roman" w:cs="Times New Roman" w:eastAsia="宋体" w:hAnsi="Times New Roman"/>
+          <w:color w:val="000000"/>
+          <w:sz w:val="16"/>
+          <w:szCs w:val="16"/>
+        </w:rPr>
+        <w:t xml:space="preserve">06  selected &lt;- ARGMAX sample[k]（使用实现约定处理并列）</w:t>
+      </w:r>
+    </w:p>
+    <w:p>
+      <w:pPr>
+        <w:spacing w:after="0" w:before="0" w:line="220"/>
+        <w:ind w:firstLine="360"/>
+      </w:pPr>
+      <w:r>
+        <w:rPr>
+          <w:rFonts w:ascii="Times New Roman" w:cs="Times New Roman" w:eastAsia="宋体" w:hAnsi="Times New Roman"/>
+          <w:color w:val="000000"/>
+          <w:sz w:val="16"/>
+          <w:szCs w:val="16"/>
+        </w:rPr>
+        <w:t xml:space="preserve">07  执行selected；等待可核验的Bernoulli反馈reward</w:t>
+      </w:r>
+    </w:p>
+    <w:p>
+      <w:pPr>
+        <w:spacing w:after="0" w:before="0" w:line="220"/>
+        <w:ind w:firstLine="360"/>
+      </w:pPr>
+      <w:r>
+        <w:rPr>
+          <w:rFonts w:ascii="Times New Roman" w:cs="Times New Roman" w:eastAsia="宋体" w:hAnsi="Times New Roman"/>
+          <w:color w:val="000000"/>
+          <w:sz w:val="16"/>
+          <w:szCs w:val="16"/>
+        </w:rPr>
+        <w:t xml:space="preserve">08  IF反馈未知: 不伪造reward，不执行成功或失败更新</w:t>
+      </w:r>
+    </w:p>
+    <w:p>
+      <w:pPr>
+        <w:spacing w:after="0" w:before="0" w:line="220"/>
+        <w:ind w:firstLine="360"/>
+      </w:pPr>
+      <w:r>
+        <w:rPr>
+          <w:rFonts w:ascii="Times New Roman" w:cs="Times New Roman" w:eastAsia="宋体" w:hAnsi="Times New Roman"/>
+          <w:color w:val="000000"/>
+          <w:sz w:val="16"/>
+          <w:szCs w:val="16"/>
+        </w:rPr>
+        <w:t xml:space="preserve">09  ELSE IF reward=1: alpha[selected] &lt;- alpha[selected]+1</w:t>
+      </w:r>
+    </w:p>
+    <w:p>
+      <w:pPr>
+        <w:spacing w:after="0" w:before="0" w:line="220"/>
+        <w:ind w:firstLine="360"/>
+      </w:pPr>
+      <w:r>
+        <w:rPr>
+          <w:rFonts w:ascii="Times New Roman" w:cs="Times New Roman" w:eastAsia="宋体" w:hAnsi="Times New Roman"/>
+          <w:color w:val="000000"/>
+          <w:sz w:val="16"/>
+          <w:szCs w:val="16"/>
+        </w:rPr>
+        <w:t xml:space="preserve">10  ELSE IF reward=0: beta[selected] &lt;- beta[selected]+1</w:t>
+      </w:r>
+    </w:p>
+    <w:p>
+      <w:pPr>
+        <w:spacing w:after="0" w:before="0" w:line="220"/>
+        <w:ind w:firstLine="360"/>
+      </w:pPr>
+      <w:r>
+        <w:rPr>
+          <w:rFonts w:ascii="Times New Roman" w:cs="Times New Roman" w:eastAsia="宋体" w:hAnsi="Times New Roman"/>
+          <w:color w:val="000000"/>
+          <w:sz w:val="16"/>
+          <w:szCs w:val="16"/>
+        </w:rPr>
+        <w:t xml:space="preserve">11  ELSE: RAISE invalid_reward</w:t>
+      </w:r>
+    </w:p>
+    <w:p>
+      <w:pPr>
+        <w:spacing w:after="0" w:before="0" w:line="220"/>
+        <w:ind w:firstLine="360"/>
+      </w:pPr>
+      <w:r>
+        <w:rPr>
+          <w:rFonts w:ascii="Times New Roman" w:cs="Times New Roman" w:eastAsia="宋体" w:hAnsi="Times New Roman"/>
+          <w:color w:val="000000"/>
+          <w:sz w:val="16"/>
+          <w:szCs w:val="16"/>
+        </w:rPr>
+        <w:t xml:space="preserve">12  RETURN selected与更新参数；不据此自动晋升经验状态</w:t>
+      </w:r>
+    </w:p>
+    <w:p>
+      <w:pPr>
+        <w:pStyle w:val="Heading3"/>
+        <w:keepNext/>
+        <w:keepLines/>
+        <w:spacing w:after="80" w:before="120"/>
+      </w:pPr>
+      <w:r>
+        <w:rPr>
+          <w:rFonts w:ascii="Times New Roman" w:cs="Times New Roman" w:eastAsia="黑体" w:hAnsi="Times New Roman"/>
+          <w:b/>
+          <w:bCs/>
+          <w:color w:val="000000"/>
+          <w:sz w:val="20"/>
+          <w:szCs w:val="20"/>
+        </w:rPr>
+        <w:t xml:space="preserve">算法5a 恢复后的条件准入（宿主责任流程）</w:t>
+      </w:r>
+    </w:p>
+    <w:p>
+      <w:pPr>
+        <w:spacing w:after="0" w:before="0" w:line="220"/>
+        <w:ind w:firstLine="360"/>
+      </w:pPr>
+      <w:r>
+        <w:rPr>
+          <w:rFonts w:ascii="Times New Roman" w:cs="Times New Roman" w:eastAsia="宋体" w:hAnsi="Times New Roman"/>
+          <w:color w:val="000000"/>
+          <w:sz w:val="16"/>
+          <w:szCs w:val="16"/>
+        </w:rPr>
+        <w:t xml:space="preserve">01  INPUT: 已持久化任务、事件、经验、版本链与当前任务条件</w:t>
+      </w:r>
+    </w:p>
+    <w:p>
+      <w:pPr>
+        <w:spacing w:after="0" w:before="0" w:line="220"/>
+        <w:ind w:firstLine="360"/>
+      </w:pPr>
+      <w:r>
+        <w:rPr>
+          <w:rFonts w:ascii="Times New Roman" w:cs="Times New Roman" w:eastAsia="宋体" w:hAnsi="Times New Roman"/>
+          <w:color w:val="000000"/>
+          <w:sz w:val="16"/>
+          <w:szCs w:val="16"/>
+        </w:rPr>
+        <w:t xml:space="preserve">02  OUTPUT: 可复核候选上下文与结果状态；并非自动成功</w:t>
+      </w:r>
+    </w:p>
+    <w:p>
+      <w:pPr>
+        <w:spacing w:after="0" w:before="0" w:line="220"/>
+        <w:ind w:firstLine="360"/>
+      </w:pPr>
+      <w:r>
+        <w:rPr>
+          <w:rFonts w:ascii="Times New Roman" w:cs="Times New Roman" w:eastAsia="宋体" w:hAnsi="Times New Roman"/>
+          <w:color w:val="000000"/>
+          <w:sz w:val="16"/>
+          <w:szCs w:val="16"/>
+        </w:rPr>
+        <w:t xml:space="preserve">03  打开服务存储与成员记忆，读取当前版本和来源</w:t>
+      </w:r>
+    </w:p>
+    <w:p>
+      <w:pPr>
+        <w:spacing w:after="0" w:before="0" w:line="220"/>
+        <w:ind w:firstLine="360"/>
+      </w:pPr>
+      <w:r>
+        <w:rPr>
+          <w:rFonts w:ascii="Times New Roman" w:cs="Times New Roman" w:eastAsia="宋体" w:hAnsi="Times New Roman"/>
+          <w:color w:val="000000"/>
+          <w:sz w:val="16"/>
+          <w:szCs w:val="16"/>
+        </w:rPr>
+        <w:t xml:space="preserve">04  检查父版本链；损坏则报错，不补造缺失版本</w:t>
+      </w:r>
+    </w:p>
+    <w:p>
+      <w:pPr>
+        <w:spacing w:after="0" w:before="0" w:line="220"/>
+        <w:ind w:firstLine="360"/>
+      </w:pPr>
+      <w:r>
+        <w:rPr>
+          <w:rFonts w:ascii="Times New Roman" w:cs="Times New Roman" w:eastAsia="宋体" w:hAnsi="Times New Roman"/>
+          <w:color w:val="000000"/>
+          <w:sz w:val="16"/>
+          <w:szCs w:val="16"/>
+        </w:rPr>
+        <w:t xml:space="preserve">05  FOR EACH 未完成行动:</w:t>
+      </w:r>
+    </w:p>
+    <w:p>
+      <w:pPr>
+        <w:spacing w:after="0" w:before="0" w:line="220"/>
+        <w:ind w:firstLine="360"/>
+      </w:pPr>
+      <w:r>
+        <w:rPr>
+          <w:rFonts w:ascii="Times New Roman" w:cs="Times New Roman" w:eastAsia="宋体" w:hAnsi="Times New Roman"/>
+          <w:color w:val="000000"/>
+          <w:sz w:val="16"/>
+          <w:szCs w:val="16"/>
+        </w:rPr>
+        <w:t xml:space="preserve">06    committed有可核验证据时才恢复其已提交结果</w:t>
+      </w:r>
+    </w:p>
+    <w:p>
+      <w:pPr>
+        <w:spacing w:after="0" w:before="0" w:line="220"/>
+        <w:ind w:firstLine="360"/>
+      </w:pPr>
+      <w:r>
+        <w:rPr>
+          <w:rFonts w:ascii="Times New Roman" w:cs="Times New Roman" w:eastAsia="宋体" w:hAnsi="Times New Roman"/>
+          <w:color w:val="000000"/>
+          <w:sz w:val="16"/>
+          <w:szCs w:val="16"/>
+        </w:rPr>
+        <w:t xml:space="preserve">07    prepared无提交、退出未确认或证据缺失时保留unknown</w:t>
+      </w:r>
+    </w:p>
+    <w:p>
+      <w:pPr>
+        <w:spacing w:after="0" w:before="0" w:line="220"/>
+        <w:ind w:firstLine="360"/>
+      </w:pPr>
+      <w:r>
+        <w:rPr>
+          <w:rFonts w:ascii="Times New Roman" w:cs="Times New Roman" w:eastAsia="宋体" w:hAnsi="Times New Roman"/>
+          <w:color w:val="000000"/>
+          <w:sz w:val="16"/>
+          <w:szCs w:val="16"/>
+        </w:rPr>
+        <w:t xml:space="preserve">08  END FOR</w:t>
+      </w:r>
+    </w:p>
+    <w:p>
+      <w:pPr>
+        <w:spacing w:after="0" w:before="0" w:line="220"/>
+        <w:ind w:firstLine="360"/>
+      </w:pPr>
+      <w:r>
+        <w:rPr>
+          <w:rFonts w:ascii="Times New Roman" w:cs="Times New Roman" w:eastAsia="宋体" w:hAnsi="Times New Roman"/>
+          <w:color w:val="000000"/>
+          <w:sz w:val="16"/>
+          <w:szCs w:val="16"/>
+        </w:rPr>
+        <w:t xml:space="preserve">09  召回候选；再按实体、当前版本、完整性与冲突逐项准入</w:t>
+      </w:r>
+    </w:p>
+    <w:p>
+      <w:pPr>
+        <w:spacing w:after="0" w:before="0" w:line="220"/>
+        <w:ind w:firstLine="360"/>
+      </w:pPr>
+      <w:r>
+        <w:rPr>
+          <w:rFonts w:ascii="Times New Roman" w:cs="Times New Roman" w:eastAsia="宋体" w:hAnsi="Times New Roman"/>
+          <w:color w:val="000000"/>
+          <w:sz w:val="16"/>
+          <w:szCs w:val="16"/>
+        </w:rPr>
+        <w:t xml:space="preserve">10  候选不适用则重新取源；来源不可用则RETURN unknown</w:t>
+      </w:r>
+    </w:p>
+    <w:p>
+      <w:pPr>
+        <w:spacing w:after="0" w:before="0" w:line="220"/>
+        <w:ind w:firstLine="360"/>
+      </w:pPr>
+      <w:r>
+        <w:rPr>
+          <w:rFonts w:ascii="Times New Roman" w:cs="Times New Roman" w:eastAsia="宋体" w:hAnsi="Times New Roman"/>
+          <w:color w:val="000000"/>
+          <w:sz w:val="16"/>
+          <w:szCs w:val="16"/>
+        </w:rPr>
+        <w:t xml:space="preserve">11  RETURN 候选、来源和未决事项；宿主仍需执行下一次实践</w:t>
+      </w:r>
+    </w:p>
+    <w:p>
+      <w:pPr>
+        <w:spacing w:after="0" w:before="0" w:line="220"/>
+        <w:ind w:firstLine="360"/>
+      </w:pPr>
+      <w:r>
+        <w:rPr>
+          <w:rFonts w:ascii="Times New Roman" w:cs="Times New Roman" w:eastAsia="宋体" w:hAnsi="Times New Roman"/>
+          <w:color w:val="000000"/>
+          <w:sz w:val="16"/>
+          <w:szCs w:val="16"/>
+        </w:rPr>
+        <w:t xml:space="preserve">12  NOTE: 当前实验只验证正常close/open，不验证任意断电恢复</w:t>
+      </w:r>
+    </w:p>
+    <w:p>
+      <w:pPr>
+        <w:pStyle w:val="Heading3"/>
+        <w:keepNext/>
+        <w:keepLines/>
+        <w:spacing w:after="80" w:before="120"/>
+      </w:pPr>
+      <w:r>
+        <w:rPr>
+          <w:rFonts w:ascii="Times New Roman" w:cs="Times New Roman" w:eastAsia="黑体" w:hAnsi="Times New Roman"/>
+          <w:b/>
+          <w:bCs/>
+          <w:color w:val="000000"/>
+          <w:sz w:val="20"/>
+          <w:szCs w:val="20"/>
+        </w:rPr>
+        <w:t xml:space="preserve">算法6 多轮规则复用基准（研究脚本实际路径）</w:t>
+      </w:r>
+    </w:p>
+    <w:p>
+      <w:pPr>
+        <w:spacing w:after="0" w:before="0" w:line="220"/>
+        <w:ind w:firstLine="360"/>
+      </w:pPr>
+      <w:r>
+        <w:rPr>
+          <w:rFonts w:ascii="Times New Roman" w:cs="Times New Roman" w:eastAsia="宋体" w:hAnsi="Times New Roman"/>
+          <w:color w:val="000000"/>
+          <w:sz w:val="16"/>
+          <w:szCs w:val="16"/>
+        </w:rPr>
+        <w:t xml:space="preserve">01  INPUT: 共享任务流、精确来源档案、条件method与记忆目录</w:t>
+      </w:r>
+    </w:p>
+    <w:p>
+      <w:pPr>
+        <w:spacing w:after="0" w:before="0" w:line="220"/>
+        <w:ind w:firstLine="360"/>
+      </w:pPr>
+      <w:r>
+        <w:rPr>
+          <w:rFonts w:ascii="Times New Roman" w:cs="Times New Roman" w:eastAsia="宋体" w:hAnsi="Times New Roman"/>
+          <w:color w:val="000000"/>
+          <w:sz w:val="16"/>
+          <w:szCs w:val="16"/>
+        </w:rPr>
+        <w:t xml:space="preserve">02  OUTPUT: 首次答案、正确/错误/unknown及读取/查询/写入计数</w:t>
+      </w:r>
+    </w:p>
+    <w:p>
+      <w:pPr>
+        <w:spacing w:after="0" w:before="0" w:line="220"/>
+        <w:ind w:firstLine="360"/>
+      </w:pPr>
+      <w:r>
+        <w:rPr>
+          <w:rFonts w:ascii="Times New Roman" w:cs="Times New Roman" w:eastAsia="宋体" w:hAnsi="Times New Roman"/>
+          <w:color w:val="000000"/>
+          <w:sz w:val="16"/>
+          <w:szCs w:val="16"/>
+        </w:rPr>
+        <w:t xml:space="preserve">03  IF 条件启用记忆: compose_context；解析唯一实体规则</w:t>
+      </w:r>
+    </w:p>
+    <w:p>
+      <w:pPr>
+        <w:spacing w:after="0" w:before="0" w:line="220"/>
+        <w:ind w:firstLine="360"/>
+      </w:pPr>
+      <w:r>
+        <w:rPr>
+          <w:rFonts w:ascii="Times New Roman" w:cs="Times New Roman" w:eastAsia="宋体" w:hAnsi="Times New Roman"/>
+          <w:color w:val="000000"/>
+          <w:sz w:val="16"/>
+          <w:szCs w:val="16"/>
+        </w:rPr>
+        <w:t xml:space="preserve">04  IF 启用版本准入: 拒绝不匹配版本；否则允许旧规则</w:t>
+      </w:r>
+    </w:p>
+    <w:p>
+      <w:pPr>
+        <w:spacing w:after="0" w:before="0" w:line="220"/>
+        <w:ind w:firstLine="360"/>
+      </w:pPr>
+      <w:r>
+        <w:rPr>
+          <w:rFonts w:ascii="Times New Roman" w:cs="Times New Roman" w:eastAsia="宋体" w:hAnsi="Times New Roman"/>
+          <w:color w:val="000000"/>
+          <w:sz w:val="16"/>
+          <w:szCs w:val="16"/>
+        </w:rPr>
+        <w:t xml:space="preserve">05  IF 无可用规则 AND source_available: 扫描或精确索引读取来源</w:t>
+      </w:r>
+    </w:p>
+    <w:p>
+      <w:pPr>
+        <w:spacing w:after="0" w:before="0" w:line="220"/>
+        <w:ind w:firstLine="360"/>
+      </w:pPr>
+      <w:r>
+        <w:rPr>
+          <w:rFonts w:ascii="Times New Roman" w:cs="Times New Roman" w:eastAsia="宋体" w:hAnsi="Times New Roman"/>
+          <w:color w:val="000000"/>
+          <w:sz w:val="16"/>
+          <w:szCs w:val="16"/>
+        </w:rPr>
+        <w:t xml:space="preserve">06  answer &lt;- 固定solve(rule,task)；冻结首次答案</w:t>
+      </w:r>
+    </w:p>
+    <w:p>
+      <w:pPr>
+        <w:spacing w:after="0" w:before="0" w:line="220"/>
+        <w:ind w:firstLine="360"/>
+      </w:pPr>
+      <w:r>
+        <w:rPr>
+          <w:rFonts w:ascii="Times New Roman" w:cs="Times New Roman" w:eastAsia="宋体" w:hAnsi="Times New Roman"/>
+          <w:color w:val="000000"/>
+          <w:sz w:val="16"/>
+          <w:szCs w:val="16"/>
+        </w:rPr>
+        <w:t xml:space="preserve">07  依据reference计分；此后修复不能改写首次分数</w:t>
+      </w:r>
+    </w:p>
+    <w:p>
+      <w:pPr>
+        <w:spacing w:after="0" w:before="0" w:line="220"/>
+        <w:ind w:firstLine="360"/>
+      </w:pPr>
+      <w:r>
+        <w:rPr>
+          <w:rFonts w:ascii="Times New Roman" w:cs="Times New Roman" w:eastAsia="宋体" w:hAnsi="Times New Roman"/>
+          <w:color w:val="000000"/>
+          <w:sz w:val="16"/>
+          <w:szCs w:val="16"/>
+        </w:rPr>
+        <w:t xml:space="preserve">08  IF 首次错误 AND source_available: 重新取正确来源规则</w:t>
+      </w:r>
+    </w:p>
+    <w:p>
+      <w:pPr>
+        <w:spacing w:after="0" w:before="0" w:line="220"/>
+        <w:ind w:firstLine="360"/>
+      </w:pPr>
+      <w:r>
+        <w:rPr>
+          <w:rFonts w:ascii="Times New Roman" w:cs="Times New Roman" w:eastAsia="宋体" w:hAnsi="Times New Roman"/>
+          <w:color w:val="000000"/>
+          <w:sz w:val="16"/>
+          <w:szCs w:val="16"/>
+        </w:rPr>
+        <w:t xml:space="preserve">09  IF 已取源 AND条件允许写入: append_event；MemoryStore.put(status=warm,confidence=1)</w:t>
+      </w:r>
+    </w:p>
+    <w:p>
+      <w:pPr>
+        <w:spacing w:after="0" w:before="0" w:line="220"/>
+        <w:ind w:firstLine="360"/>
+      </w:pPr>
+      <w:r>
+        <w:rPr>
+          <w:rFonts w:ascii="Times New Roman" w:cs="Times New Roman" w:eastAsia="宋体" w:hAnsi="Times New Roman"/>
+          <w:color w:val="000000"/>
+          <w:sz w:val="16"/>
+          <w:szCs w:val="16"/>
+        </w:rPr>
+        <w:t xml:space="preserve">10  按协议第8轮close/open；no-persist条件改用空目录</w:t>
+      </w:r>
+    </w:p>
+    <w:p>
+      <w:pPr>
+        <w:spacing w:after="0" w:before="0" w:line="220"/>
+        <w:ind w:firstLine="360"/>
+      </w:pPr>
+      <w:r>
+        <w:rPr>
+          <w:rFonts w:ascii="Times New Roman" w:cs="Times New Roman" w:eastAsia="宋体" w:hAnsi="Times New Roman"/>
+          <w:color w:val="000000"/>
+          <w:sz w:val="16"/>
+          <w:szCs w:val="16"/>
+        </w:rPr>
+        <w:t xml:space="preserve">11  RETURN 本轮记录；后续轮重复上述步骤</w:t>
+      </w:r>
+    </w:p>
+    <w:p>
+      <w:pPr>
+        <w:spacing w:after="0" w:before="0" w:line="220"/>
+        <w:ind w:firstLine="360"/>
+      </w:pPr>
+      <w:r>
+        <w:rPr>
+          <w:rFonts w:ascii="Times New Roman" w:cs="Times New Roman" w:eastAsia="宋体" w:hAnsi="Times New Roman"/>
+          <w:color w:val="000000"/>
+          <w:sz w:val="16"/>
+          <w:szCs w:val="16"/>
+        </w:rPr>
+        <w:t xml:space="preserve">12  NOTE: 本算法没有candidate验证、自动归纳或disputed状态实验</w:t>
       </w:r>
     </w:p>
     <w:p>
@@ -2442,7 +3600,86 @@
           <w:sz w:val="22"/>
           <w:szCs w:val="22"/>
         </w:rPr>
-        <w:t xml:space="preserve">G. 复杂度与实现边界</w:t>
+        <w:t xml:space="preserve">G. 有限闭环的条件命题</w:t>
+      </w:r>
+    </w:p>
+    <w:p>
+      <w:pPr>
+        <w:spacing w:after="50" w:line="260" w:lineRule="auto"/>
+        <w:ind w:firstLine="360"/>
+      </w:pPr>
+      <w:r>
+        <w:rPr>
+          <w:rFonts w:ascii="Times New Roman" w:cs="Times New Roman" w:eastAsia="宋体" w:hAnsi="Times New Roman"/>
+          <w:color w:val="000000"/>
+          <w:sz w:val="18"/>
+          <w:szCs w:val="18"/>
+        </w:rPr>
+        <w:t xml:space="preserve">命题1：若每次状态更新都经MemoryStore实践接口，candidate升级前必须存在至少两条通过接口去重的成功观察且无失败。证明直接来自升级分支：程序在事务内读取成功数和失败数，仅在successes≥2、failures=0且旧状态属于candidate或pending_validation时置warm。该命题证明的是程序门槛，无法证明外部证据真实，也无法保证绕过接口的人工写入满足同样条件。两次成功是必要的接口条件，不能作为经验普遍有效的充分条件。</w:t>
+      </w:r>
+    </w:p>
+    <w:p>
+      <w:pPr>
+        <w:spacing w:after="50" w:line="260" w:lineRule="auto"/>
+        <w:ind w:firstLine="360"/>
+      </w:pPr>
+      <w:r>
+        <w:rPr>
+          <w:rFonts w:ascii="Times New Roman" w:cs="Times New Roman" w:eastAsia="宋体" w:hAnsi="Times New Roman"/>
+          <w:color w:val="000000"/>
+          <w:sz w:val="18"/>
+          <w:szCs w:val="18"/>
+        </w:rPr>
+        <w:t xml:space="preserve">命题2：若当前任务版本可确定，且宿主严格执行版本准入，旧版本候选不能直接产生当前版本的已接受结果。证明分两种情况：候选版本匹配时进入正常求解；不匹配时必须重新取证或返回unknown。该条件命题的关键假设是版本识别和准入确实执行；no-version消融移除该假设，因此产生的错误用于说明守卫的作用，不是现实场景永不出错的证明。</w:t>
+      </w:r>
+    </w:p>
+    <w:p>
+      <w:pPr>
+        <w:spacing w:after="50" w:line="260" w:lineRule="auto"/>
+        <w:ind w:firstLine="360"/>
+      </w:pPr>
+      <w:r>
+        <w:rPr>
+          <w:rFonts w:ascii="Times New Roman" w:cs="Times New Roman" w:eastAsia="宋体" w:hAnsi="Times New Roman"/>
+          <w:color w:val="000000"/>
+          <w:sz w:val="18"/>
+          <w:szCs w:val="18"/>
+        </w:rPr>
+        <w:t xml:space="preserve">命题3：一次unknown观察不应计入成功数或失败数。代码只对outcome等于success或failure的记录进行相应计数，unknown可以保留观察和版本记录，但不能据此增加支持样本。由此可避免资料断开或停止未确认时把缺失结果解释为成功。未知次数上升仍会降低任务完成率，因此unknown是诚实记录不确定性的代价，不是可以从评测分母中移走的无效样本。</w:t>
+      </w:r>
+    </w:p>
+    <w:p>
+      <w:pPr>
+        <w:spacing w:after="50" w:line="260" w:lineRule="auto"/>
+        <w:ind w:firstLine="360"/>
+      </w:pPr>
+      <w:r>
+        <w:rPr>
+          <w:rFonts w:ascii="Times New Roman" w:cs="Times New Roman" w:eastAsia="宋体" w:hAnsi="Times New Roman"/>
+          <w:color w:val="000000"/>
+          <w:sz w:val="18"/>
+          <w:szCs w:val="18"/>
+        </w:rPr>
+        <w:t xml:space="preserve">过程闭环成立还需要宿主实际执行行动、返回可靠观察并在下一轮使用记录。数据库写入成功只能证明保存完成；主张在多个任务上有效需要外部结果，长期收益需要跨轮对照。本文将可执行闭环与认识正确性分开论证：前者由接口、事务和恢复控制验证，后者只在给定实验任务族内报告结果。</w:t>
+      </w:r>
+    </w:p>
+    <w:p>
+      <w:pPr>
+        <w:pStyle w:val="Heading2"/>
+        <w:keepNext/>
+        <w:keepLines/>
+        <w:spacing w:after="80" w:before="120"/>
+      </w:pPr>
+      <w:r>
+        <w:rPr>
+          <w:rFonts w:ascii="Times New Roman" w:cs="Times New Roman" w:eastAsia="黑体" w:hAnsi="Times New Roman"/>
+          <w:b/>
+          <w:bCs/>
+          <w:color w:val="000000"/>
+          <w:sz w:val="22"/>
+          <w:szCs w:val="22"/>
+        </w:rPr>
+        <w:t xml:space="preserve">H. 复杂度与实现边界</w:t>
       </w:r>
     </w:p>
     <w:p>

</xml_diff>

<commit_message>
research: add verified dream reuse comparison and clean public documentation
</commit_message>
<xml_diff>
--- a/docs/论文/补天多轮经验机制-IEEE.docx
+++ b/docs/论文/补天多轮经验机制-IEEE.docx
@@ -61,7 +61,7 @@
           <w:sz w:val="17"/>
           <w:szCs w:val="17"/>
         </w:rPr>
-        <w:t xml:space="preserve">摘要—人不是因为保存了一段文字就获得经验。经验来自目标驱动的行动、行动结果、结果解释、反例检验和后续复用；其中任何一步缺失，都可能把偶然成功误记成规律。本文以这一人类实践过程为研究对象，建立“实践—观察—解释—验证—经验—再实践”的计算模型。模型将经验表示为带主张、条件、版本、来源、证据、反例和生命周期状态的对象，区分候选、稳定、争议和失效；通过持久化版本链、来源约束、冲突记录、unknown返回和宿主上下文恢复，使经验能够在下一次行动前接受条件检查。Beta-Bernoulli更新用于描述有限证据下的可信度变化，信息增益用于选择值得求证的行动，Thompson Sampling仅作为候选行动探索的可选控制，不把整个系统误写成贝叶斯强化学习。本文首先逐步说明人的经验形成逻辑，再给出状态机、更新算法、恢复算法和复杂度，最后报告10种子、12轮、7条件的机制实验以及10种子贝叶斯Bandit控制。主实验中完整机制相对精确索引基线完成率提高4.51个百分点，源读取减少81.60%，但本地逻辑操作增加41.53%且时延没有优势。结果支持限定契约任务中的经验复用机制，不证明模型参数自进化或普遍提升语言模型能力。</w:t>
+        <w:t xml:space="preserve">摘要—人不是因为保存了一段文字就获得经验。经验来自目标驱动的行动、行动结果、结果解释、反例检验和后续复用；其中任何一步缺失，都可能把偶然成功误记成规律。本文以这一人类实践过程为研究对象，建立“实践—观察—解释—验证—经验—再实践”的计算模型。模型将经验表示为带主张、条件、版本、来源、证据、反例和生命周期状态的对象，区分候选、稳定、争议和失效；通过持久化版本链、来源约束、冲突记录、unknown返回和宿主上下文恢复，使经验能够在下一次行动前接受条件检查。Beta-Bernoulli更新用于描述有限证据下的可信度变化，信息增益用于选择值得求证的行动，Thompson Sampling仅作为候选行动探索的可选控制，不把整个系统误写成贝叶斯强化学习。本文首先逐步说明人的经验形成逻辑，再给出状态机、更新算法、恢复算法和复杂度，最后报告10种子、12轮、7条件的机制实验以及10种子贝叶斯Bandit控制。规则复用基准中B2条件相对精确索引基线完成率提高4.51个百分点，源读取减少81.60%，但本地逻辑操作增加41.53%且时延没有优势。结果支持限定契约任务中的经验复用机制，不证明模型参数自进化或普遍提升语言模型能力。</w:t>
       </w:r>
     </w:p>
     <w:p>
@@ -380,7 +380,7 @@
           <w:sz w:val="18"/>
           <w:szCs w:val="18"/>
         </w:rPr>
-        <w:t xml:space="preserve">全文按人的认识过程推进。第二节定义一次实践中发生了什么；第三节说明如何把实践结果变成候选经验；第四节说明证据、反例和版本如何决定经验能否复用；第四节给出算法与实现；第五节报告实验设计；第六节报告结果；第七节讨论贝叶斯和探索机制的位置、工程收益与限制；第八节给出结论。数学工具服务于经验形成主线，而不是替代主线。</w:t>
+        <w:t xml:space="preserve">全文按人的认识过程推进。第二节定义一次实践中发生了什么；第三节说明如何把实践结果变成候选经验；第三节说明证据、反例和版本如何决定经验能否复用；第四节给出算法与实现；第五节报告实验设计；第六节报告结果；第七节讨论贝叶斯和探索机制的位置、工程收益与限制；第八节给出结论。数学工具服务于经验形成主线，而不是替代主线。</w:t>
       </w:r>
     </w:p>
     <w:p>
@@ -3600,7 +3600,7 @@
           <w:sz w:val="22"/>
           <w:szCs w:val="22"/>
         </w:rPr>
-        <w:t xml:space="preserve">G. 有限闭环的条件命题</w:t>
+        <w:t xml:space="preserve">G. 做梦整理、假设验证与后续实践</w:t>
       </w:r>
     </w:p>
     <w:p>
@@ -3615,52 +3615,206 @@
           <w:sz w:val="18"/>
           <w:szCs w:val="18"/>
         </w:rPr>
-        <w:t xml:space="preserve">命题1：若每次状态更新都经MemoryStore实践接口，candidate升级前必须存在至少两条通过接口去重的成功观察且无失败。证明直接来自升级分支：程序在事务内读取成功数和失败数，仅在successes≥2、failures=0且旧状态属于candidate或pending_validation时置warm。该命题证明的是程序门槛，无法证明外部证据真实，也无法保证绕过接口的人工写入满足同样条件。两次成功是必要的接口条件，不能作为经验普遍有效的充分条件。</w:t>
-      </w:r>
-    </w:p>
-    <w:p>
-      <w:pPr>
-        <w:spacing w:after="50" w:line="260" w:lineRule="auto"/>
-        <w:ind w:firstLine="360"/>
-      </w:pPr>
-      <w:r>
-        <w:rPr>
-          <w:rFonts w:ascii="Times New Roman" w:cs="Times New Roman" w:eastAsia="宋体" w:hAnsi="Times New Roman"/>
-          <w:color w:val="000000"/>
-          <w:sz w:val="18"/>
-          <w:szCs w:val="18"/>
-        </w:rPr>
-        <w:t xml:space="preserve">命题2：若当前任务版本可确定，且宿主严格执行版本准入，旧版本候选不能直接产生当前版本的已接受结果。证明分两种情况：候选版本匹配时进入正常求解；不匹配时必须重新取证或返回unknown。该条件命题的关键假设是版本识别和准入确实执行；no-version消融移除该假设，因此产生的错误用于说明守卫的作用，不是现实场景永不出错的证明。</w:t>
-      </w:r>
-    </w:p>
-    <w:p>
-      <w:pPr>
-        <w:spacing w:after="50" w:line="260" w:lineRule="auto"/>
-        <w:ind w:firstLine="360"/>
-      </w:pPr>
-      <w:r>
-        <w:rPr>
-          <w:rFonts w:ascii="Times New Roman" w:cs="Times New Roman" w:eastAsia="宋体" w:hAnsi="Times New Roman"/>
-          <w:color w:val="000000"/>
-          <w:sz w:val="18"/>
-          <w:szCs w:val="18"/>
-        </w:rPr>
-        <w:t xml:space="preserve">命题3：一次unknown观察不应计入成功数或失败数。代码只对outcome等于success或failure的记录进行相应计数，unknown可以保留观察和版本记录，但不能据此增加支持样本。由此可避免资料断开或停止未确认时把缺失结果解释为成功。未知次数上升仍会降低任务完成率，因此unknown是诚实记录不确定性的代价，不是可以从评测分母中移走的无效样本。</w:t>
-      </w:r>
-    </w:p>
-    <w:p>
-      <w:pPr>
-        <w:spacing w:after="50" w:line="260" w:lineRule="auto"/>
-        <w:ind w:firstLine="360"/>
-      </w:pPr>
-      <w:r>
-        <w:rPr>
-          <w:rFonts w:ascii="Times New Roman" w:cs="Times New Roman" w:eastAsia="宋体" w:hAnsi="Times New Roman"/>
-          <w:color w:val="000000"/>
-          <w:sz w:val="18"/>
-          <w:szCs w:val="18"/>
-        </w:rPr>
-        <w:t xml:space="preserve">过程闭环成立还需要宿主实际执行行动、返回可靠观察并在下一轮使用记录。数据库写入成功只能证明保存完成；主张在多个任务上有效需要外部结果，长期收益需要跨轮对照。本文将可执行闭环与认识正确性分开论证：前者由接口、事务和恢复控制验证，后者只在给定实验任务族内报告结果。</w:t>
+        <w:t xml:space="preserve">做梦是对已有实践材料进行离线整理的过程。DreamRunner.run在材料数量、新材料、间隔和预算满足门槛后生成来源快照；提炼、抽象与假设正文由宿主提供，系统不从文本自动推导规律。distill保留原材料引用，abstract保留支持、反例及适用条件，propose检查来源是否仍有效。验证动作经过schedule和start后才能接收supported或rejected结果，证据需通过服务核验。supported只产生candidate；后续实践接口仍需累计成功才能进入warm。验证并不保证任意任务上的正确性，其作用是把可检验假设与未经检验的概括分开。</w:t>
+      </w:r>
+    </w:p>
+    <w:p>
+      <w:pPr>
+        <w:pStyle w:val="Heading3"/>
+        <w:keepNext/>
+        <w:keepLines/>
+        <w:spacing w:after="80" w:before="120"/>
+      </w:pPr>
+      <w:r>
+        <w:rPr>
+          <w:rFonts w:ascii="Times New Roman" w:cs="Times New Roman" w:eastAsia="黑体" w:hAnsi="Times New Roman"/>
+          <w:b/>
+          <w:bCs/>
+          <w:color w:val="000000"/>
+          <w:sz w:val="20"/>
+          <w:szCs w:val="20"/>
+        </w:rPr>
+        <w:t xml:space="preserve">算法7 做梦形成与验证后复用</w:t>
+      </w:r>
+    </w:p>
+    <w:p>
+      <w:pPr>
+        <w:spacing w:after="0" w:before="0" w:line="220"/>
+        <w:ind w:firstLine="360"/>
+      </w:pPr>
+      <w:r>
+        <w:rPr>
+          <w:rFonts w:ascii="Times New Roman" w:cs="Times New Roman" w:eastAsia="宋体" w:hAnsi="Times New Roman"/>
+          <w:color w:val="000000"/>
+          <w:sz w:val="16"/>
+          <w:szCs w:val="16"/>
+        </w:rPr>
+        <w:t xml:space="preserve">01  INPUT: 实践材料、宿主提出的候选规律、验证预算与后续任务</w:t>
+      </w:r>
+    </w:p>
+    <w:p>
+      <w:pPr>
+        <w:spacing w:after="0" w:before="0" w:line="220"/>
+        <w:ind w:firstLine="360"/>
+      </w:pPr>
+      <w:r>
+        <w:rPr>
+          <w:rFonts w:ascii="Times New Roman" w:cs="Times New Roman" w:eastAsia="宋体" w:hAnsi="Times New Roman"/>
+          <w:color w:val="000000"/>
+          <w:sz w:val="16"/>
+          <w:szCs w:val="16"/>
+        </w:rPr>
+        <w:t xml:space="preserve">02  OUTPUT: supported/rejected/unknown、候选经验与后续实践记录</w:t>
+      </w:r>
+    </w:p>
+    <w:p>
+      <w:pPr>
+        <w:spacing w:after="0" w:before="0" w:line="220"/>
+        <w:ind w:firstLine="360"/>
+      </w:pPr>
+      <w:r>
+        <w:rPr>
+          <w:rFonts w:ascii="Times New Roman" w:cs="Times New Roman" w:eastAsia="宋体" w:hAnsi="Times New Roman"/>
+          <w:color w:val="000000"/>
+          <w:sz w:val="16"/>
+          <w:szCs w:val="16"/>
+        </w:rPr>
+        <w:t xml:space="preserve">03  检查新材料、间隔与预算；不满足则跳过本次整理</w:t>
+      </w:r>
+    </w:p>
+    <w:p>
+      <w:pPr>
+        <w:spacing w:after="0" w:before="0" w:line="220"/>
+        <w:ind w:firstLine="360"/>
+      </w:pPr>
+      <w:r>
+        <w:rPr>
+          <w:rFonts w:ascii="Times New Roman" w:cs="Times New Roman" w:eastAsia="宋体" w:hAnsi="Times New Roman"/>
+          <w:color w:val="000000"/>
+          <w:sz w:val="16"/>
+          <w:szCs w:val="16"/>
+        </w:rPr>
+        <w:t xml:space="preserve">04  固定来源快照；由宿主提炼摘要、抽象条件并提出假设</w:t>
+      </w:r>
+    </w:p>
+    <w:p>
+      <w:pPr>
+        <w:spacing w:after="0" w:before="0" w:line="220"/>
+        <w:ind w:firstLine="360"/>
+      </w:pPr>
+      <w:r>
+        <w:rPr>
+          <w:rFonts w:ascii="Times New Roman" w:cs="Times New Roman" w:eastAsia="宋体" w:hAnsi="Times New Roman"/>
+          <w:color w:val="000000"/>
+          <w:sz w:val="16"/>
+          <w:szCs w:val="16"/>
+        </w:rPr>
+        <w:t xml:space="preserve">05  安排验证；授权且来源仍有效时启动动作</w:t>
+      </w:r>
+    </w:p>
+    <w:p>
+      <w:pPr>
+        <w:spacing w:after="0" w:before="0" w:line="220"/>
+        <w:ind w:firstLine="360"/>
+      </w:pPr>
+      <w:r>
+        <w:rPr>
+          <w:rFonts w:ascii="Times New Roman" w:cs="Times New Roman" w:eastAsia="宋体" w:hAnsi="Times New Roman"/>
+          <w:color w:val="000000"/>
+          <w:sz w:val="16"/>
+          <w:szCs w:val="16"/>
+        </w:rPr>
+        <w:t xml:space="preserve">06  执行与训练样本不同的验证输入；保存观察及证据</w:t>
+      </w:r>
+    </w:p>
+    <w:p>
+      <w:pPr>
+        <w:spacing w:after="0" w:before="0" w:line="220"/>
+        <w:ind w:firstLine="360"/>
+      </w:pPr>
+      <w:r>
+        <w:rPr>
+          <w:rFonts w:ascii="Times New Roman" w:cs="Times New Roman" w:eastAsia="宋体" w:hAnsi="Times New Roman"/>
+          <w:color w:val="000000"/>
+          <w:sz w:val="16"/>
+          <w:szCs w:val="16"/>
+        </w:rPr>
+        <w:t xml:space="preserve">07  IF 存在反例: 记录rejected；后续任务回退来源</w:t>
+      </w:r>
+    </w:p>
+    <w:p>
+      <w:pPr>
+        <w:spacing w:after="0" w:before="0" w:line="220"/>
+        <w:ind w:firstLine="360"/>
+      </w:pPr>
+      <w:r>
+        <w:rPr>
+          <w:rFonts w:ascii="Times New Roman" w:cs="Times New Roman" w:eastAsia="宋体" w:hAnsi="Times New Roman"/>
+          <w:color w:val="000000"/>
+          <w:sz w:val="16"/>
+          <w:szCs w:val="16"/>
+        </w:rPr>
+        <w:t xml:space="preserve">08  ELSE IF 证据不足: 记录unknown；不当作已验证规律</w:t>
+      </w:r>
+    </w:p>
+    <w:p>
+      <w:pPr>
+        <w:spacing w:after="0" w:before="0" w:line="220"/>
+        <w:ind w:firstLine="360"/>
+      </w:pPr>
+      <w:r>
+        <w:rPr>
+          <w:rFonts w:ascii="Times New Roman" w:cs="Times New Roman" w:eastAsia="宋体" w:hAnsi="Times New Roman"/>
+          <w:color w:val="000000"/>
+          <w:sz w:val="16"/>
+          <w:szCs w:val="16"/>
+        </w:rPr>
+        <w:t xml:space="preserve">09  ELSE: 记录supported并产生candidate</w:t>
+      </w:r>
+    </w:p>
+    <w:p>
+      <w:pPr>
+        <w:spacing w:after="0" w:before="0" w:line="220"/>
+        <w:ind w:firstLine="360"/>
+      </w:pPr>
+      <w:r>
+        <w:rPr>
+          <w:rFonts w:ascii="Times New Roman" w:cs="Times New Roman" w:eastAsia="宋体" w:hAnsi="Times New Roman"/>
+          <w:color w:val="000000"/>
+          <w:sz w:val="16"/>
+          <w:szCs w:val="16"/>
+        </w:rPr>
+        <w:t xml:space="preserve">10  后续任务采用候选时冻结首次结果并写回独立实践反馈</w:t>
+      </w:r>
+    </w:p>
+    <w:p>
+      <w:pPr>
+        <w:spacing w:after="0" w:before="0" w:line="220"/>
+        <w:ind w:firstLine="360"/>
+      </w:pPr>
+      <w:r>
+        <w:rPr>
+          <w:rFonts w:ascii="Times New Roman" w:cs="Times New Roman" w:eastAsia="宋体" w:hAnsi="Times New Roman"/>
+          <w:color w:val="000000"/>
+          <w:sz w:val="16"/>
+          <w:szCs w:val="16"/>
+        </w:rPr>
+        <w:t xml:space="preserve">11  达到生产门槛后进入warm；记录错误时保留反例</w:t>
+      </w:r>
+    </w:p>
+    <w:p>
+      <w:pPr>
+        <w:spacing w:after="0" w:before="0" w:line="220"/>
+        <w:ind w:firstLine="360"/>
+      </w:pPr>
+      <w:r>
+        <w:rPr>
+          <w:rFonts w:ascii="Times New Roman" w:cs="Times New Roman" w:eastAsia="宋体" w:hAnsi="Times New Roman"/>
+          <w:color w:val="000000"/>
+          <w:sz w:val="16"/>
+          <w:szCs w:val="16"/>
+        </w:rPr>
+        <w:t xml:space="preserve">12  RETURN 验证与复用账本；不得将supported解释为普遍有效</w:t>
       </w:r>
     </w:p>
     <w:p>
@@ -3679,7 +3833,86 @@
           <w:sz w:val="22"/>
           <w:szCs w:val="22"/>
         </w:rPr>
-        <w:t xml:space="preserve">H. 复杂度与实现边界</w:t>
+        <w:t xml:space="preserve">H. 有限闭环的条件命题</w:t>
+      </w:r>
+    </w:p>
+    <w:p>
+      <w:pPr>
+        <w:spacing w:after="50" w:line="260" w:lineRule="auto"/>
+        <w:ind w:firstLine="360"/>
+      </w:pPr>
+      <w:r>
+        <w:rPr>
+          <w:rFonts w:ascii="Times New Roman" w:cs="Times New Roman" w:eastAsia="宋体" w:hAnsi="Times New Roman"/>
+          <w:color w:val="000000"/>
+          <w:sz w:val="18"/>
+          <w:szCs w:val="18"/>
+        </w:rPr>
+        <w:t xml:space="preserve">命题1：若每次状态更新都经MemoryStore实践接口，candidate升级前必须存在至少两条通过接口去重的成功观察且无失败。证明直接来自升级分支：程序在事务内读取成功数和失败数，仅在successes≥2、failures=0且旧状态属于candidate或pending_validation时置warm。该命题证明的是程序门槛，无法证明外部证据真实，也无法保证绕过接口的人工写入满足同样条件。两次成功是必要的接口条件，不能作为经验普遍有效的充分条件。</w:t>
+      </w:r>
+    </w:p>
+    <w:p>
+      <w:pPr>
+        <w:spacing w:after="50" w:line="260" w:lineRule="auto"/>
+        <w:ind w:firstLine="360"/>
+      </w:pPr>
+      <w:r>
+        <w:rPr>
+          <w:rFonts w:ascii="Times New Roman" w:cs="Times New Roman" w:eastAsia="宋体" w:hAnsi="Times New Roman"/>
+          <w:color w:val="000000"/>
+          <w:sz w:val="18"/>
+          <w:szCs w:val="18"/>
+        </w:rPr>
+        <w:t xml:space="preserve">命题2：若当前任务版本可确定，且宿主严格执行版本准入，旧版本候选不能直接产生当前版本的已接受结果。证明分两种情况：候选版本匹配时进入正常求解；不匹配时必须重新取证或返回unknown。该条件命题的关键假设是版本识别和准入确实执行；no-version消融移除该假设，因此产生的错误用于说明守卫的作用，不是现实场景永不出错的证明。</w:t>
+      </w:r>
+    </w:p>
+    <w:p>
+      <w:pPr>
+        <w:spacing w:after="50" w:line="260" w:lineRule="auto"/>
+        <w:ind w:firstLine="360"/>
+      </w:pPr>
+      <w:r>
+        <w:rPr>
+          <w:rFonts w:ascii="Times New Roman" w:cs="Times New Roman" w:eastAsia="宋体" w:hAnsi="Times New Roman"/>
+          <w:color w:val="000000"/>
+          <w:sz w:val="18"/>
+          <w:szCs w:val="18"/>
+        </w:rPr>
+        <w:t xml:space="preserve">命题3：一次unknown观察不应计入成功数或失败数。代码只对outcome等于success或failure的记录进行相应计数，unknown可以保留观察和版本记录，但不能据此增加支持样本。由此可避免资料断开或停止未确认时把缺失结果解释为成功。未知次数上升仍会降低任务完成率，因此unknown是诚实记录不确定性的代价，不是可以从评测分母中移走的无效样本。</w:t>
+      </w:r>
+    </w:p>
+    <w:p>
+      <w:pPr>
+        <w:spacing w:after="50" w:line="260" w:lineRule="auto"/>
+        <w:ind w:firstLine="360"/>
+      </w:pPr>
+      <w:r>
+        <w:rPr>
+          <w:rFonts w:ascii="Times New Roman" w:cs="Times New Roman" w:eastAsia="宋体" w:hAnsi="Times New Roman"/>
+          <w:color w:val="000000"/>
+          <w:sz w:val="18"/>
+          <w:szCs w:val="18"/>
+        </w:rPr>
+        <w:t xml:space="preserve">过程闭环成立还需要宿主实际执行行动、返回可靠观察并在下一轮使用记录。数据库写入成功只能证明保存完成；主张在多个任务上有效需要外部结果，长期收益需要跨轮对照。本文将可执行闭环与认识正确性分开论证：前者由接口、事务和恢复控制验证，后者只在给定实验任务族内报告结果。</w:t>
+      </w:r>
+    </w:p>
+    <w:p>
+      <w:pPr>
+        <w:pStyle w:val="Heading2"/>
+        <w:keepNext/>
+        <w:keepLines/>
+        <w:spacing w:after="80" w:before="120"/>
+      </w:pPr>
+      <w:r>
+        <w:rPr>
+          <w:rFonts w:ascii="Times New Roman" w:cs="Times New Roman" w:eastAsia="黑体" w:hAnsi="Times New Roman"/>
+          <w:b/>
+          <w:bCs/>
+          <w:color w:val="000000"/>
+          <w:sz w:val="22"/>
+          <w:szCs w:val="22"/>
+        </w:rPr>
+        <w:t xml:space="preserve">I. 复杂度与实现边界</w:t>
       </w:r>
     </w:p>
     <w:p>
@@ -3946,7 +4179,41 @@
           <w:sz w:val="22"/>
           <w:szCs w:val="22"/>
         </w:rPr>
-        <w:t xml:space="preserve">E. 独立算法控制</w:t>
+        <w:t xml:space="preserve">E. 做梦效果的配对回放设计</w:t>
+      </w:r>
+    </w:p>
+    <w:p>
+      <w:pPr>
+        <w:spacing w:after="50" w:line="260" w:lineRule="auto"/>
+        <w:ind w:firstLine="360"/>
+      </w:pPr>
+      <w:r>
+        <w:rPr>
+          <w:rFonts w:ascii="Times New Roman" w:cs="Times New Roman" w:eastAsia="宋体" w:hAnsi="Times New Roman"/>
+          <w:color w:val="000000"/>
+          <w:sz w:val="18"/>
+          <w:szCs w:val="18"/>
+        </w:rPr>
+        <w:t xml:space="preserve">新增实验以10个种子各生成线性、饱和两类传感器，共20组材料。每组初始观察为x=1、2、3；当前宿主依据相邻差相同提出仿射候选，固定该归纳模板后由Python通过生产dream接口回放。关闭做梦条件逐题取源；未经验证条件直接采用候选；验证条件执行x=5、10两个新探针，有反例则回退来源，无反例则保存candidate并在后续实践中写回。后续测试为x=4、7、9、12，重复4轮，每条件320题。验证输入与测试输入分离；三条件拥有相同初始材料，训练取源各60次。饱和族在x大于6后进入平台，初始三点无法区分两类。该设计用于观察有限材料的过度泛化以及求证成本，不是盲测模型自主发现实验，也不提供独立模型样本。</w:t>
+      </w:r>
+    </w:p>
+    <w:p>
+      <w:pPr>
+        <w:pStyle w:val="Heading2"/>
+        <w:keepNext/>
+        <w:keepLines/>
+        <w:spacing w:after="80" w:before="120"/>
+      </w:pPr>
+      <w:r>
+        <w:rPr>
+          <w:rFonts w:ascii="Times New Roman" w:cs="Times New Roman" w:eastAsia="黑体" w:hAnsi="Times New Roman"/>
+          <w:b/>
+          <w:bCs/>
+          <w:color w:val="000000"/>
+          <w:sz w:val="22"/>
+          <w:szCs w:val="22"/>
+        </w:rPr>
+        <w:t xml:space="preserve">F. 独立算法控制</w:t>
       </w:r>
     </w:p>
     <w:p>
@@ -8461,8 +8728,706 @@
           <w:sz w:val="22"/>
           <w:szCs w:val="22"/>
         </w:rPr>
-        <w:t xml:space="preserve">E. 结果解释</w:t>
-      </w:r>
+        <w:t xml:space="preserve">E. 做梦的后续收益与错误泛化</w:t>
+      </w:r>
+    </w:p>
+    <w:p>
+      <w:pPr>
+        <w:spacing w:after="60" w:before="200"/>
+        <w:jc w:val="center"/>
+      </w:pPr>
+      <w:r>
+        <w:rPr>
+          <w:rFonts w:ascii="Times New Roman" w:cs="Times New Roman" w:eastAsia="宋体" w:hAnsi="Times New Roman"/>
+          <w:color w:val="000000"/>
+          <w:sz w:val="18"/>
+          <w:szCs w:val="18"/>
+        </w:rPr>
+        <w:t xml:space="preserve">表4 做梦候选验证与后续复用的配对结果</w:t>
+      </w:r>
+    </w:p>
+    <w:tbl>
+      <w:tblPr>
+        <w:tblW w:type="dxa" w:w="4640"/>
+        <w:tblBorders>
+          <w:top w:val="single" w:color="auto" w:sz="4"/>
+          <w:left w:val="single" w:color="auto" w:sz="4"/>
+          <w:bottom w:val="single" w:color="auto" w:sz="4"/>
+          <w:right w:val="single" w:color="auto" w:sz="4"/>
+          <w:insideH w:val="single" w:color="auto" w:sz="4"/>
+          <w:insideV w:val="single" w:color="auto" w:sz="4"/>
+        </w:tblBorders>
+      </w:tblPr>
+      <w:tblGrid>
+        <w:gridCol w:w="928"/>
+        <w:gridCol w:w="928"/>
+        <w:gridCol w:w="928"/>
+        <w:gridCol w:w="928"/>
+        <w:gridCol w:w="928"/>
+      </w:tblGrid>
+      <w:tr>
+        <w:tc>
+          <w:tcPr>
+            <w:tcW w:type="dxa" w:w="928"/>
+            <w:tcBorders>
+              <w:top w:val="single" w:color="000000" w:sz="12"/>
+              <w:left w:val="nil" w:sz="0"/>
+              <w:bottom w:val="single" w:color="000000" w:sz="6"/>
+              <w:right w:val="nil" w:sz="0"/>
+            </w:tcBorders>
+            <w:tcMar>
+              <w:top w:type="dxa" w:w="60"/>
+              <w:left w:type="dxa" w:w="100"/>
+              <w:bottom w:type="dxa" w:w="60"/>
+              <w:right w:type="dxa" w:w="100"/>
+            </w:tcMar>
+          </w:tcPr>
+          <w:p>
+            <w:pPr>
+              <w:spacing w:after="0" w:line="320"/>
+              <w:jc w:val="center"/>
+            </w:pPr>
+            <w:r>
+              <w:rPr>
+                <w:rFonts w:ascii="Times New Roman" w:cs="Times New Roman" w:eastAsia="宋体" w:hAnsi="Times New Roman"/>
+                <w:b/>
+                <w:bCs/>
+                <w:color w:val="000000"/>
+                <w:sz w:val="18"/>
+                <w:szCs w:val="18"/>
+              </w:rPr>
+              <w:t xml:space="preserve">条件</w:t>
+            </w:r>
+          </w:p>
+        </w:tc>
+        <w:tc>
+          <w:tcPr>
+            <w:tcW w:type="dxa" w:w="928"/>
+            <w:tcBorders>
+              <w:top w:val="single" w:color="000000" w:sz="12"/>
+              <w:left w:val="nil" w:sz="0"/>
+              <w:bottom w:val="single" w:color="000000" w:sz="6"/>
+              <w:right w:val="nil" w:sz="0"/>
+            </w:tcBorders>
+            <w:tcMar>
+              <w:top w:type="dxa" w:w="60"/>
+              <w:left w:type="dxa" w:w="100"/>
+              <w:bottom w:type="dxa" w:w="60"/>
+              <w:right w:type="dxa" w:w="100"/>
+            </w:tcMar>
+          </w:tcPr>
+          <w:p>
+            <w:pPr>
+              <w:spacing w:after="0" w:line="320"/>
+              <w:jc w:val="center"/>
+            </w:pPr>
+            <w:r>
+              <w:rPr>
+                <w:rFonts w:ascii="Times New Roman" w:cs="Times New Roman" w:eastAsia="宋体" w:hAnsi="Times New Roman"/>
+                <w:b/>
+                <w:bCs/>
+                <w:color w:val="000000"/>
+                <w:sz w:val="18"/>
+                <w:szCs w:val="18"/>
+              </w:rPr>
+              <w:t xml:space="preserve">正确/320</w:t>
+            </w:r>
+          </w:p>
+        </w:tc>
+        <w:tc>
+          <w:tcPr>
+            <w:tcW w:type="dxa" w:w="928"/>
+            <w:tcBorders>
+              <w:top w:val="single" w:color="000000" w:sz="12"/>
+              <w:left w:val="nil" w:sz="0"/>
+              <w:bottom w:val="single" w:color="000000" w:sz="6"/>
+              <w:right w:val="nil" w:sz="0"/>
+            </w:tcBorders>
+            <w:tcMar>
+              <w:top w:type="dxa" w:w="60"/>
+              <w:left w:type="dxa" w:w="100"/>
+              <w:bottom w:type="dxa" w:w="60"/>
+              <w:right w:type="dxa" w:w="100"/>
+            </w:tcMar>
+          </w:tcPr>
+          <w:p>
+            <w:pPr>
+              <w:spacing w:after="0" w:line="320"/>
+              <w:jc w:val="center"/>
+            </w:pPr>
+            <w:r>
+              <w:rPr>
+                <w:rFonts w:ascii="Times New Roman" w:cs="Times New Roman" w:eastAsia="宋体" w:hAnsi="Times New Roman"/>
+                <w:b/>
+                <w:bCs/>
+                <w:color w:val="000000"/>
+                <w:sz w:val="18"/>
+                <w:szCs w:val="18"/>
+              </w:rPr>
+              <w:t xml:space="preserve">错误</w:t>
+            </w:r>
+          </w:p>
+        </w:tc>
+        <w:tc>
+          <w:tcPr>
+            <w:tcW w:type="dxa" w:w="928"/>
+            <w:tcBorders>
+              <w:top w:val="single" w:color="000000" w:sz="12"/>
+              <w:left w:val="nil" w:sz="0"/>
+              <w:bottom w:val="single" w:color="000000" w:sz="6"/>
+              <w:right w:val="nil" w:sz="0"/>
+            </w:tcBorders>
+            <w:tcMar>
+              <w:top w:type="dxa" w:w="60"/>
+              <w:left w:type="dxa" w:w="100"/>
+              <w:bottom w:type="dxa" w:w="60"/>
+              <w:right w:type="dxa" w:w="100"/>
+            </w:tcMar>
+          </w:tcPr>
+          <w:p>
+            <w:pPr>
+              <w:spacing w:after="0" w:line="320"/>
+              <w:jc w:val="center"/>
+            </w:pPr>
+            <w:r>
+              <w:rPr>
+                <w:rFonts w:ascii="Times New Roman" w:cs="Times New Roman" w:eastAsia="宋体" w:hAnsi="Times New Roman"/>
+                <w:b/>
+                <w:bCs/>
+                <w:color w:val="000000"/>
+                <w:sz w:val="18"/>
+                <w:szCs w:val="18"/>
+              </w:rPr>
+              <w:t xml:space="preserve">后续读源</w:t>
+            </w:r>
+          </w:p>
+        </w:tc>
+        <w:tc>
+          <w:tcPr>
+            <w:tcW w:type="dxa" w:w="928"/>
+            <w:tcBorders>
+              <w:top w:val="single" w:color="000000" w:sz="12"/>
+              <w:left w:val="nil" w:sz="0"/>
+              <w:bottom w:val="single" w:color="000000" w:sz="6"/>
+              <w:right w:val="nil" w:sz="0"/>
+            </w:tcBorders>
+            <w:tcMar>
+              <w:top w:type="dxa" w:w="60"/>
+              <w:left w:type="dxa" w:w="100"/>
+              <w:bottom w:type="dxa" w:w="60"/>
+              <w:right w:type="dxa" w:w="100"/>
+            </w:tcMar>
+          </w:tcPr>
+          <w:p>
+            <w:pPr>
+              <w:spacing w:after="0" w:line="320"/>
+              <w:jc w:val="center"/>
+            </w:pPr>
+            <w:r>
+              <w:rPr>
+                <w:rFonts w:ascii="Times New Roman" w:cs="Times New Roman" w:eastAsia="宋体" w:hAnsi="Times New Roman"/>
+                <w:b/>
+                <w:bCs/>
+                <w:color w:val="000000"/>
+                <w:sz w:val="18"/>
+                <w:szCs w:val="18"/>
+              </w:rPr>
+              <w:t xml:space="preserve">验证访问</w:t>
+            </w:r>
+          </w:p>
+        </w:tc>
+      </w:tr>
+      <w:tr>
+        <w:tc>
+          <w:tcPr>
+            <w:tcW w:type="dxa" w:w="928"/>
+            <w:tcBorders>
+              <w:top w:val="single" w:color="000000" w:sz="6"/>
+              <w:left w:val="nil" w:sz="0"/>
+              <w:bottom w:val="nil" w:sz="0"/>
+              <w:right w:val="nil" w:sz="0"/>
+            </w:tcBorders>
+            <w:tcMar>
+              <w:top w:type="dxa" w:w="60"/>
+              <w:left w:type="dxa" w:w="100"/>
+              <w:bottom w:type="dxa" w:w="60"/>
+              <w:right w:type="dxa" w:w="100"/>
+            </w:tcMar>
+          </w:tcPr>
+          <w:p>
+            <w:pPr>
+              <w:spacing w:after="0" w:line="320"/>
+              <w:jc w:val="center"/>
+            </w:pPr>
+            <w:r>
+              <w:rPr>
+                <w:rFonts w:ascii="Times New Roman" w:cs="Times New Roman" w:eastAsia="宋体" w:hAnsi="Times New Roman"/>
+                <w:color w:val="000000"/>
+                <w:sz w:val="18"/>
+                <w:szCs w:val="18"/>
+              </w:rPr>
+              <w:t xml:space="preserve">关闭做梦</w:t>
+            </w:r>
+          </w:p>
+        </w:tc>
+        <w:tc>
+          <w:tcPr>
+            <w:tcW w:type="dxa" w:w="928"/>
+            <w:tcBorders>
+              <w:top w:val="single" w:color="000000" w:sz="6"/>
+              <w:left w:val="nil" w:sz="0"/>
+              <w:bottom w:val="nil" w:sz="0"/>
+              <w:right w:val="nil" w:sz="0"/>
+            </w:tcBorders>
+            <w:tcMar>
+              <w:top w:type="dxa" w:w="60"/>
+              <w:left w:type="dxa" w:w="100"/>
+              <w:bottom w:type="dxa" w:w="60"/>
+              <w:right w:type="dxa" w:w="100"/>
+            </w:tcMar>
+          </w:tcPr>
+          <w:p>
+            <w:pPr>
+              <w:spacing w:after="0" w:line="320"/>
+              <w:jc w:val="center"/>
+            </w:pPr>
+            <w:r>
+              <w:rPr>
+                <w:rFonts w:ascii="Times New Roman" w:cs="Times New Roman" w:eastAsia="宋体" w:hAnsi="Times New Roman"/>
+                <w:color w:val="000000"/>
+                <w:sz w:val="18"/>
+                <w:szCs w:val="18"/>
+              </w:rPr>
+              <w:t xml:space="preserve">320</w:t>
+            </w:r>
+          </w:p>
+        </w:tc>
+        <w:tc>
+          <w:tcPr>
+            <w:tcW w:type="dxa" w:w="928"/>
+            <w:tcBorders>
+              <w:top w:val="single" w:color="000000" w:sz="6"/>
+              <w:left w:val="nil" w:sz="0"/>
+              <w:bottom w:val="nil" w:sz="0"/>
+              <w:right w:val="nil" w:sz="0"/>
+            </w:tcBorders>
+            <w:tcMar>
+              <w:top w:type="dxa" w:w="60"/>
+              <w:left w:type="dxa" w:w="100"/>
+              <w:bottom w:type="dxa" w:w="60"/>
+              <w:right w:type="dxa" w:w="100"/>
+            </w:tcMar>
+          </w:tcPr>
+          <w:p>
+            <w:pPr>
+              <w:spacing w:after="0" w:line="320"/>
+              <w:jc w:val="center"/>
+            </w:pPr>
+            <w:r>
+              <w:rPr>
+                <w:rFonts w:ascii="Times New Roman" w:cs="Times New Roman" w:eastAsia="宋体" w:hAnsi="Times New Roman"/>
+                <w:color w:val="000000"/>
+                <w:sz w:val="18"/>
+                <w:szCs w:val="18"/>
+              </w:rPr>
+              <w:t xml:space="preserve">0</w:t>
+            </w:r>
+          </w:p>
+        </w:tc>
+        <w:tc>
+          <w:tcPr>
+            <w:tcW w:type="dxa" w:w="928"/>
+            <w:tcBorders>
+              <w:top w:val="single" w:color="000000" w:sz="6"/>
+              <w:left w:val="nil" w:sz="0"/>
+              <w:bottom w:val="nil" w:sz="0"/>
+              <w:right w:val="nil" w:sz="0"/>
+            </w:tcBorders>
+            <w:tcMar>
+              <w:top w:type="dxa" w:w="60"/>
+              <w:left w:type="dxa" w:w="100"/>
+              <w:bottom w:type="dxa" w:w="60"/>
+              <w:right w:type="dxa" w:w="100"/>
+            </w:tcMar>
+          </w:tcPr>
+          <w:p>
+            <w:pPr>
+              <w:spacing w:after="0" w:line="320"/>
+              <w:jc w:val="center"/>
+            </w:pPr>
+            <w:r>
+              <w:rPr>
+                <w:rFonts w:ascii="Times New Roman" w:cs="Times New Roman" w:eastAsia="宋体" w:hAnsi="Times New Roman"/>
+                <w:color w:val="000000"/>
+                <w:sz w:val="18"/>
+                <w:szCs w:val="18"/>
+              </w:rPr>
+              <w:t xml:space="preserve">320</w:t>
+            </w:r>
+          </w:p>
+        </w:tc>
+        <w:tc>
+          <w:tcPr>
+            <w:tcW w:type="dxa" w:w="928"/>
+            <w:tcBorders>
+              <w:top w:val="single" w:color="000000" w:sz="6"/>
+              <w:left w:val="nil" w:sz="0"/>
+              <w:bottom w:val="nil" w:sz="0"/>
+              <w:right w:val="nil" w:sz="0"/>
+            </w:tcBorders>
+            <w:tcMar>
+              <w:top w:type="dxa" w:w="60"/>
+              <w:left w:type="dxa" w:w="100"/>
+              <w:bottom w:type="dxa" w:w="60"/>
+              <w:right w:type="dxa" w:w="100"/>
+            </w:tcMar>
+          </w:tcPr>
+          <w:p>
+            <w:pPr>
+              <w:spacing w:after="0" w:line="320"/>
+              <w:jc w:val="center"/>
+            </w:pPr>
+            <w:r>
+              <w:rPr>
+                <w:rFonts w:ascii="Times New Roman" w:cs="Times New Roman" w:eastAsia="宋体" w:hAnsi="Times New Roman"/>
+                <w:color w:val="000000"/>
+                <w:sz w:val="18"/>
+                <w:szCs w:val="18"/>
+              </w:rPr>
+              <w:t xml:space="preserve">0</w:t>
+            </w:r>
+          </w:p>
+        </w:tc>
+      </w:tr>
+      <w:tr>
+        <w:tc>
+          <w:tcPr>
+            <w:tcW w:type="dxa" w:w="928"/>
+            <w:tcBorders>
+              <w:top w:val="nil" w:sz="0"/>
+              <w:left w:val="nil" w:sz="0"/>
+              <w:bottom w:val="nil" w:sz="0"/>
+              <w:right w:val="nil" w:sz="0"/>
+            </w:tcBorders>
+            <w:tcMar>
+              <w:top w:type="dxa" w:w="60"/>
+              <w:left w:type="dxa" w:w="100"/>
+              <w:bottom w:type="dxa" w:w="60"/>
+              <w:right w:type="dxa" w:w="100"/>
+            </w:tcMar>
+          </w:tcPr>
+          <w:p>
+            <w:pPr>
+              <w:spacing w:after="0" w:line="320"/>
+              <w:jc w:val="center"/>
+            </w:pPr>
+            <w:r>
+              <w:rPr>
+                <w:rFonts w:ascii="Times New Roman" w:cs="Times New Roman" w:eastAsia="宋体" w:hAnsi="Times New Roman"/>
+                <w:color w:val="000000"/>
+                <w:sz w:val="18"/>
+                <w:szCs w:val="18"/>
+              </w:rPr>
+              <w:t xml:space="preserve">未经验证复用</w:t>
+            </w:r>
+          </w:p>
+        </w:tc>
+        <w:tc>
+          <w:tcPr>
+            <w:tcW w:type="dxa" w:w="928"/>
+            <w:tcBorders>
+              <w:top w:val="nil" w:sz="0"/>
+              <w:left w:val="nil" w:sz="0"/>
+              <w:bottom w:val="nil" w:sz="0"/>
+              <w:right w:val="nil" w:sz="0"/>
+            </w:tcBorders>
+            <w:tcMar>
+              <w:top w:type="dxa" w:w="60"/>
+              <w:left w:type="dxa" w:w="100"/>
+              <w:bottom w:type="dxa" w:w="60"/>
+              <w:right w:type="dxa" w:w="100"/>
+            </w:tcMar>
+          </w:tcPr>
+          <w:p>
+            <w:pPr>
+              <w:spacing w:after="0" w:line="320"/>
+              <w:jc w:val="center"/>
+            </w:pPr>
+            <w:r>
+              <w:rPr>
+                <w:rFonts w:ascii="Times New Roman" w:cs="Times New Roman" w:eastAsia="宋体" w:hAnsi="Times New Roman"/>
+                <w:color w:val="000000"/>
+                <w:sz w:val="18"/>
+                <w:szCs w:val="18"/>
+              </w:rPr>
+              <w:t xml:space="preserve">200</w:t>
+            </w:r>
+          </w:p>
+        </w:tc>
+        <w:tc>
+          <w:tcPr>
+            <w:tcW w:type="dxa" w:w="928"/>
+            <w:tcBorders>
+              <w:top w:val="nil" w:sz="0"/>
+              <w:left w:val="nil" w:sz="0"/>
+              <w:bottom w:val="nil" w:sz="0"/>
+              <w:right w:val="nil" w:sz="0"/>
+            </w:tcBorders>
+            <w:tcMar>
+              <w:top w:type="dxa" w:w="60"/>
+              <w:left w:type="dxa" w:w="100"/>
+              <w:bottom w:type="dxa" w:w="60"/>
+              <w:right w:type="dxa" w:w="100"/>
+            </w:tcMar>
+          </w:tcPr>
+          <w:p>
+            <w:pPr>
+              <w:spacing w:after="0" w:line="320"/>
+              <w:jc w:val="center"/>
+            </w:pPr>
+            <w:r>
+              <w:rPr>
+                <w:rFonts w:ascii="Times New Roman" w:cs="Times New Roman" w:eastAsia="宋体" w:hAnsi="Times New Roman"/>
+                <w:color w:val="000000"/>
+                <w:sz w:val="18"/>
+                <w:szCs w:val="18"/>
+              </w:rPr>
+              <w:t xml:space="preserve">120</w:t>
+            </w:r>
+          </w:p>
+        </w:tc>
+        <w:tc>
+          <w:tcPr>
+            <w:tcW w:type="dxa" w:w="928"/>
+            <w:tcBorders>
+              <w:top w:val="nil" w:sz="0"/>
+              <w:left w:val="nil" w:sz="0"/>
+              <w:bottom w:val="nil" w:sz="0"/>
+              <w:right w:val="nil" w:sz="0"/>
+            </w:tcBorders>
+            <w:tcMar>
+              <w:top w:type="dxa" w:w="60"/>
+              <w:left w:type="dxa" w:w="100"/>
+              <w:bottom w:type="dxa" w:w="60"/>
+              <w:right w:type="dxa" w:w="100"/>
+            </w:tcMar>
+          </w:tcPr>
+          <w:p>
+            <w:pPr>
+              <w:spacing w:after="0" w:line="320"/>
+              <w:jc w:val="center"/>
+            </w:pPr>
+            <w:r>
+              <w:rPr>
+                <w:rFonts w:ascii="Times New Roman" w:cs="Times New Roman" w:eastAsia="宋体" w:hAnsi="Times New Roman"/>
+                <w:color w:val="000000"/>
+                <w:sz w:val="18"/>
+                <w:szCs w:val="18"/>
+              </w:rPr>
+              <w:t xml:space="preserve">0</w:t>
+            </w:r>
+          </w:p>
+        </w:tc>
+        <w:tc>
+          <w:tcPr>
+            <w:tcW w:type="dxa" w:w="928"/>
+            <w:tcBorders>
+              <w:top w:val="nil" w:sz="0"/>
+              <w:left w:val="nil" w:sz="0"/>
+              <w:bottom w:val="nil" w:sz="0"/>
+              <w:right w:val="nil" w:sz="0"/>
+            </w:tcBorders>
+            <w:tcMar>
+              <w:top w:type="dxa" w:w="60"/>
+              <w:left w:type="dxa" w:w="100"/>
+              <w:bottom w:type="dxa" w:w="60"/>
+              <w:right w:type="dxa" w:w="100"/>
+            </w:tcMar>
+          </w:tcPr>
+          <w:p>
+            <w:pPr>
+              <w:spacing w:after="0" w:line="320"/>
+              <w:jc w:val="center"/>
+            </w:pPr>
+            <w:r>
+              <w:rPr>
+                <w:rFonts w:ascii="Times New Roman" w:cs="Times New Roman" w:eastAsia="宋体" w:hAnsi="Times New Roman"/>
+                <w:color w:val="000000"/>
+                <w:sz w:val="18"/>
+                <w:szCs w:val="18"/>
+              </w:rPr>
+              <w:t xml:space="preserve">0</w:t>
+            </w:r>
+          </w:p>
+        </w:tc>
+      </w:tr>
+      <w:tr>
+        <w:tc>
+          <w:tcPr>
+            <w:tcW w:type="dxa" w:w="928"/>
+            <w:tcBorders>
+              <w:top w:val="nil" w:sz="0"/>
+              <w:left w:val="nil" w:sz="0"/>
+              <w:bottom w:val="single" w:color="000000" w:sz="12"/>
+              <w:right w:val="nil" w:sz="0"/>
+            </w:tcBorders>
+            <w:tcMar>
+              <w:top w:type="dxa" w:w="60"/>
+              <w:left w:type="dxa" w:w="100"/>
+              <w:bottom w:type="dxa" w:w="60"/>
+              <w:right w:type="dxa" w:w="100"/>
+            </w:tcMar>
+          </w:tcPr>
+          <w:p>
+            <w:pPr>
+              <w:spacing w:after="0" w:line="320"/>
+              <w:jc w:val="center"/>
+            </w:pPr>
+            <w:r>
+              <w:rPr>
+                <w:rFonts w:ascii="Times New Roman" w:cs="Times New Roman" w:eastAsia="宋体" w:hAnsi="Times New Roman"/>
+                <w:color w:val="000000"/>
+                <w:sz w:val="18"/>
+                <w:szCs w:val="18"/>
+              </w:rPr>
+              <w:t xml:space="preserve">验证后复用</w:t>
+            </w:r>
+          </w:p>
+        </w:tc>
+        <w:tc>
+          <w:tcPr>
+            <w:tcW w:type="dxa" w:w="928"/>
+            <w:tcBorders>
+              <w:top w:val="nil" w:sz="0"/>
+              <w:left w:val="nil" w:sz="0"/>
+              <w:bottom w:val="single" w:color="000000" w:sz="12"/>
+              <w:right w:val="nil" w:sz="0"/>
+            </w:tcBorders>
+            <w:tcMar>
+              <w:top w:type="dxa" w:w="60"/>
+              <w:left w:type="dxa" w:w="100"/>
+              <w:bottom w:type="dxa" w:w="60"/>
+              <w:right w:type="dxa" w:w="100"/>
+            </w:tcMar>
+          </w:tcPr>
+          <w:p>
+            <w:pPr>
+              <w:spacing w:after="0" w:line="320"/>
+              <w:jc w:val="center"/>
+            </w:pPr>
+            <w:r>
+              <w:rPr>
+                <w:rFonts w:ascii="Times New Roman" w:cs="Times New Roman" w:eastAsia="宋体" w:hAnsi="Times New Roman"/>
+                <w:color w:val="000000"/>
+                <w:sz w:val="18"/>
+                <w:szCs w:val="18"/>
+              </w:rPr>
+              <w:t xml:space="preserve">320</w:t>
+            </w:r>
+          </w:p>
+        </w:tc>
+        <w:tc>
+          <w:tcPr>
+            <w:tcW w:type="dxa" w:w="928"/>
+            <w:tcBorders>
+              <w:top w:val="nil" w:sz="0"/>
+              <w:left w:val="nil" w:sz="0"/>
+              <w:bottom w:val="single" w:color="000000" w:sz="12"/>
+              <w:right w:val="nil" w:sz="0"/>
+            </w:tcBorders>
+            <w:tcMar>
+              <w:top w:type="dxa" w:w="60"/>
+              <w:left w:type="dxa" w:w="100"/>
+              <w:bottom w:type="dxa" w:w="60"/>
+              <w:right w:type="dxa" w:w="100"/>
+            </w:tcMar>
+          </w:tcPr>
+          <w:p>
+            <w:pPr>
+              <w:spacing w:after="0" w:line="320"/>
+              <w:jc w:val="center"/>
+            </w:pPr>
+            <w:r>
+              <w:rPr>
+                <w:rFonts w:ascii="Times New Roman" w:cs="Times New Roman" w:eastAsia="宋体" w:hAnsi="Times New Roman"/>
+                <w:color w:val="000000"/>
+                <w:sz w:val="18"/>
+                <w:szCs w:val="18"/>
+              </w:rPr>
+              <w:t xml:space="preserve">0</w:t>
+            </w:r>
+          </w:p>
+        </w:tc>
+        <w:tc>
+          <w:tcPr>
+            <w:tcW w:type="dxa" w:w="928"/>
+            <w:tcBorders>
+              <w:top w:val="nil" w:sz="0"/>
+              <w:left w:val="nil" w:sz="0"/>
+              <w:bottom w:val="single" w:color="000000" w:sz="12"/>
+              <w:right w:val="nil" w:sz="0"/>
+            </w:tcBorders>
+            <w:tcMar>
+              <w:top w:type="dxa" w:w="60"/>
+              <w:left w:type="dxa" w:w="100"/>
+              <w:bottom w:type="dxa" w:w="60"/>
+              <w:right w:type="dxa" w:w="100"/>
+            </w:tcMar>
+          </w:tcPr>
+          <w:p>
+            <w:pPr>
+              <w:spacing w:after="0" w:line="320"/>
+              <w:jc w:val="center"/>
+            </w:pPr>
+            <w:r>
+              <w:rPr>
+                <w:rFonts w:ascii="Times New Roman" w:cs="Times New Roman" w:eastAsia="宋体" w:hAnsi="Times New Roman"/>
+                <w:color w:val="000000"/>
+                <w:sz w:val="18"/>
+                <w:szCs w:val="18"/>
+              </w:rPr>
+              <w:t xml:space="preserve">160</w:t>
+            </w:r>
+          </w:p>
+        </w:tc>
+        <w:tc>
+          <w:tcPr>
+            <w:tcW w:type="dxa" w:w="928"/>
+            <w:tcBorders>
+              <w:top w:val="nil" w:sz="0"/>
+              <w:left w:val="nil" w:sz="0"/>
+              <w:bottom w:val="single" w:color="000000" w:sz="12"/>
+              <w:right w:val="nil" w:sz="0"/>
+            </w:tcBorders>
+            <w:tcMar>
+              <w:top w:type="dxa" w:w="60"/>
+              <w:left w:type="dxa" w:w="100"/>
+              <w:bottom w:type="dxa" w:w="60"/>
+              <w:right w:type="dxa" w:w="100"/>
+            </w:tcMar>
+          </w:tcPr>
+          <w:p>
+            <w:pPr>
+              <w:spacing w:after="0" w:line="320"/>
+              <w:jc w:val="center"/>
+            </w:pPr>
+            <w:r>
+              <w:rPr>
+                <w:rFonts w:ascii="Times New Roman" w:cs="Times New Roman" w:eastAsia="宋体" w:hAnsi="Times New Roman"/>
+                <w:color w:val="000000"/>
+                <w:sz w:val="18"/>
+                <w:szCs w:val="18"/>
+              </w:rPr>
+              <w:t xml:space="preserve">40</w:t>
+            </w:r>
+          </w:p>
+        </w:tc>
+      </w:tr>
+    </w:tbl>
+    <w:p>
+      <w:pPr>
+        <w:spacing w:after="0" w:before="200" w:line="20" w:lineRule="exact"/>
+      </w:pPr>
     </w:p>
     <w:p>
       <w:pPr>
@@ -8476,46 +9441,7 @@
           <w:sz w:val="18"/>
           <w:szCs w:val="18"/>
         </w:rPr>
-        <w:t xml:space="preserve">主实验支持“已知规则可以在条件匹配时复用”的工程结论，没有证明经验主张如何由实践自动生成。B1只在首轮缓存规则，后续遇到新版本仍可读取来源，但不再缓存新规则；它的局限是重复取证，而非必然输出旧版本错误。候选形成、验证门槛和失败争议由另一项接口控制覆盖，不能将两项独立控制拼接成已经实测的完整端到端收益。Bandit控制的收益来自探索样本分配，与主实验中的实践证据生命周期是不同层次。两组数据不能合并为一个模型效果数字。</w:t>
-      </w:r>
-    </w:p>
-    <w:p>
-      <w:pPr>
-        <w:pStyle w:val="Heading1"/>
-        <w:keepNext/>
-        <w:keepLines/>
-        <w:spacing w:after="80" w:before="120"/>
-        <w:jc w:val="center"/>
-      </w:pPr>
-      <w:r>
-        <w:rPr>
-          <w:rFonts w:ascii="Times New Roman" w:cs="Times New Roman" w:eastAsia="黑体" w:hAnsi="Times New Roman"/>
-          <w:b/>
-          <w:bCs/>
-          <w:color w:val="000000"/>
-          <w:sz w:val="26"/>
-          <w:szCs w:val="26"/>
-        </w:rPr>
-        <w:t xml:space="preserve">VII. 讨论：从人的实践逻辑到宿主智能体机制</w:t>
-      </w:r>
-    </w:p>
-    <w:p>
-      <w:pPr>
-        <w:pStyle w:val="Heading2"/>
-        <w:keepNext/>
-        <w:keepLines/>
-        <w:spacing w:after="80" w:before="120"/>
-      </w:pPr>
-      <w:r>
-        <w:rPr>
-          <w:rFonts w:ascii="Times New Roman" w:cs="Times New Roman" w:eastAsia="黑体" w:hAnsi="Times New Roman"/>
-          <w:b/>
-          <w:bCs/>
-          <w:color w:val="000000"/>
-          <w:sz w:val="22"/>
-          <w:szCs w:val="22"/>
-        </w:rPr>
-        <w:t xml:space="preserve">A. 这套模型模拟了什么</w:t>
+        <w:t xml:space="preserve">验证条件接受10个线性候选、拒绝10个饱和族候选。线性族在后续160题中复用规则；饱和族160题回退来源。后续读源由320降至160，减少50%；计入40次验证访问后为200，相对320减少37.5%。若同时计入每条件相同的60次训练访问，则从380降至260，减少31.58%。未经验证条件在饱和族每轮三个超出阈值的输入上出错，共10×4×3=120次，表明压缩成规则可能损失边界。验证后复用的正确率与关闭条件相同，收益表现为减少取证，不能称为推理准确率提高。</w:t>
       </w:r>
     </w:p>
     <w:p>
@@ -8530,543 +9456,7 @@
           <w:sz w:val="18"/>
           <w:szCs w:val="18"/>
         </w:rPr>
-        <w:t xml:space="preserve">模型模拟的是人的实践结构，而不是人的全部心理过程。它保留目标、行动、结果、条件、证据、反例、修订和再实践这些可以在工程中观察的部分。毛泽东《实践论》关于认识来源于实践并在实践中检验的思想可作为研究设计的哲学指导</w:t>
-      </w:r>
-      <w:r>
-        <w:rPr>
-          <w:rFonts w:ascii="Times New Roman" w:cs="Times New Roman" w:eastAsia="Times New Roman" w:hAnsi="Times New Roman"/>
-          <w:sz w:val="16"/>
-          <w:szCs w:val="16"/>
-          <w:vertAlign w:val="superscript"/>
-        </w:rPr>
-        <w:t xml:space="preserve">[7]</w:t>
-      </w:r>
-      <w:r>
-        <w:rPr>
-          <w:rFonts w:ascii="Times New Roman" w:cs="Times New Roman" w:eastAsia="宋体" w:hAnsi="Times New Roman"/>
-          <w:color w:val="000000"/>
-          <w:sz w:val="18"/>
-          <w:szCs w:val="18"/>
-        </w:rPr>
-        <w:t xml:space="preserve">，但哲学思想不是程序正确性的证据；程序正确性仍由状态守卫、事务和实验结果支持。已有长期记忆研究也提示恢复时必须携带任务情境，但软件字段与人的记忆不能直接等同</w:t>
-      </w:r>
-      <w:r>
-        <w:rPr>
-          <w:rFonts w:ascii="Times New Roman" w:cs="Times New Roman" w:eastAsia="Times New Roman" w:hAnsi="Times New Roman"/>
-          <w:sz w:val="16"/>
-          <w:szCs w:val="16"/>
-          <w:vertAlign w:val="superscript"/>
-        </w:rPr>
-        <w:t xml:space="preserve">[1-2]</w:t>
-      </w:r>
-      <w:r>
-        <w:rPr>
-          <w:rFonts w:ascii="Times New Roman" w:cs="Times New Roman" w:eastAsia="宋体" w:hAnsi="Times New Roman"/>
-          <w:color w:val="000000"/>
-          <w:sz w:val="18"/>
-          <w:szCs w:val="18"/>
-        </w:rPr>
-        <w:t xml:space="preserve">。</w:t>
-      </w:r>
-    </w:p>
-    <w:p>
-      <w:pPr>
-        <w:pStyle w:val="Heading2"/>
-        <w:keepNext/>
-        <w:keepLines/>
-        <w:spacing w:after="80" w:before="120"/>
-      </w:pPr>
-      <w:r>
-        <w:rPr>
-          <w:rFonts w:ascii="Times New Roman" w:cs="Times New Roman" w:eastAsia="黑体" w:hAnsi="Times New Roman"/>
-          <w:b/>
-          <w:bCs/>
-          <w:color w:val="000000"/>
-          <w:sz w:val="22"/>
-          <w:szCs w:val="22"/>
-        </w:rPr>
-        <w:t xml:space="preserve">B. 贝叶斯不是经验本身</w:t>
-      </w:r>
-    </w:p>
-    <w:p>
-      <w:pPr>
-        <w:spacing w:after="50" w:line="260" w:lineRule="auto"/>
-        <w:ind w:firstLine="360"/>
-      </w:pPr>
-      <w:r>
-        <w:rPr>
-          <w:rFonts w:ascii="Times New Roman" w:cs="Times New Roman" w:eastAsia="宋体" w:hAnsi="Times New Roman"/>
-          <w:color w:val="000000"/>
-          <w:sz w:val="18"/>
-          <w:szCs w:val="18"/>
-        </w:rPr>
-        <w:t xml:space="preserve">时间上下文模型讨论了记忆提取与变化情境的关系</w:t>
-      </w:r>
-      <w:r>
-        <w:rPr>
-          <w:rFonts w:ascii="Times New Roman" w:cs="Times New Roman" w:eastAsia="Times New Roman" w:hAnsi="Times New Roman"/>
-          <w:sz w:val="16"/>
-          <w:szCs w:val="16"/>
-          <w:vertAlign w:val="superscript"/>
-        </w:rPr>
-        <w:t xml:space="preserve">[8]</w:t>
-      </w:r>
-      <w:r>
-        <w:rPr>
-          <w:rFonts w:ascii="Times New Roman" w:cs="Times New Roman" w:eastAsia="宋体" w:hAnsi="Times New Roman"/>
-          <w:color w:val="000000"/>
-          <w:sz w:val="18"/>
-          <w:szCs w:val="18"/>
-        </w:rPr>
-        <w:t xml:space="preserve">，本文仅借此说明恢复应携带环境，而不以认知模型证明SQLite结构等同于人类记忆。Thompson Sampling的教程讨论了根据后验采样进行探索的框架</w:t>
-      </w:r>
-      <w:r>
-        <w:rPr>
-          <w:rFonts w:ascii="Times New Roman" w:cs="Times New Roman" w:eastAsia="Times New Roman" w:hAnsi="Times New Roman"/>
-          <w:sz w:val="16"/>
-          <w:szCs w:val="16"/>
-          <w:vertAlign w:val="superscript"/>
-        </w:rPr>
-        <w:t xml:space="preserve">[9]</w:t>
-      </w:r>
-      <w:r>
-        <w:rPr>
-          <w:rFonts w:ascii="Times New Roman" w:cs="Times New Roman" w:eastAsia="宋体" w:hAnsi="Times New Roman"/>
-          <w:color w:val="000000"/>
-          <w:sz w:val="18"/>
-          <w:szCs w:val="18"/>
-        </w:rPr>
-        <w:t xml:space="preserve">；本文固定两臂控制仅覆盖其中最简单的平稳Bernoulli情形，不能把该结果推广到真实宿主行动的非平稳、部分可观测和延迟反馈环境。</w:t>
-      </w:r>
-    </w:p>
-    <w:p>
-      <w:pPr>
-        <w:spacing w:after="50" w:line="260" w:lineRule="auto"/>
-        <w:ind w:firstLine="360"/>
-      </w:pPr>
-      <w:r>
-        <w:rPr>
-          <w:rFonts w:ascii="Times New Roman" w:cs="Times New Roman" w:eastAsia="宋体" w:hAnsi="Times New Roman"/>
-          <w:color w:val="000000"/>
-          <w:sz w:val="18"/>
-          <w:szCs w:val="18"/>
-        </w:rPr>
-        <w:t xml:space="preserve">Beta后验回答“在当前工作模型下，证据如何改变可信度摘要”，不回答“人是否已经真正理解”，也不替代反例、版本和来源。贝叶斯更新是经验生命周期中的一个数值部件。Thompson Sampling回答“多个待验证行动如何分配探索机会”，不是经验形成的全部，也不是当前项目已经实现的完整强化学习。把局部算法抬成论文主题，会掩盖真正的研究对象。</w:t>
-      </w:r>
-    </w:p>
-    <w:p>
-      <w:pPr>
-        <w:pStyle w:val="Heading2"/>
-        <w:keepNext/>
-        <w:keepLines/>
-        <w:spacing w:after="80" w:before="120"/>
-      </w:pPr>
-      <w:r>
-        <w:rPr>
-          <w:rFonts w:ascii="Times New Roman" w:cs="Times New Roman" w:eastAsia="黑体" w:hAnsi="Times New Roman"/>
-          <w:b/>
-          <w:bCs/>
-          <w:color w:val="000000"/>
-          <w:sz w:val="22"/>
-          <w:szCs w:val="22"/>
-        </w:rPr>
-        <w:t xml:space="preserve">C. 与宿主AI和模型训练的关系</w:t>
-      </w:r>
-    </w:p>
-    <w:p>
-      <w:pPr>
-        <w:spacing w:after="50" w:line="260" w:lineRule="auto"/>
-        <w:ind w:firstLine="360"/>
-      </w:pPr>
-      <w:r>
-        <w:rPr>
-          <w:rFonts w:ascii="Times New Roman" w:cs="Times New Roman" w:eastAsia="宋体" w:hAnsi="Times New Roman"/>
-          <w:color w:val="000000"/>
-          <w:sz w:val="18"/>
-          <w:szCs w:val="18"/>
-        </w:rPr>
-        <w:t xml:space="preserve">运行期经验库改变的是可召回上下文、证据和策略选择，不是模型参数。宿主AI可以读取候选、执行行动、提交反馈，但其自由文本回答必须单独记录首次答案、可见上下文、工具结果和反馈。当前15条同Agent非盲探索不能作为独立模型实验；主实验10080次也没有语言模型调用。经验可成为后训练候选资料，但要改变参数必须有训练前后固定评测、遗忘评估和回滚证据，本文没有把运行期写回称为自进化。</w:t>
-      </w:r>
-    </w:p>
-    <w:p>
-      <w:pPr>
-        <w:pStyle w:val="Heading2"/>
-        <w:keepNext/>
-        <w:keepLines/>
-        <w:spacing w:after="80" w:before="120"/>
-      </w:pPr>
-      <w:r>
-        <w:rPr>
-          <w:rFonts w:ascii="Times New Roman" w:cs="Times New Roman" w:eastAsia="黑体" w:hAnsi="Times New Roman"/>
-          <w:b/>
-          <w:bCs/>
-          <w:color w:val="000000"/>
-          <w:sz w:val="22"/>
-          <w:szCs w:val="22"/>
-        </w:rPr>
-        <w:t xml:space="preserve">D. 有效性威胁</w:t>
-      </w:r>
-    </w:p>
-    <w:p>
-      <w:pPr>
-        <w:spacing w:after="50" w:line="260" w:lineRule="auto"/>
-        <w:ind w:firstLine="360"/>
-      </w:pPr>
-      <w:r>
-        <w:rPr>
-          <w:rFonts w:ascii="Times New Roman" w:cs="Times New Roman" w:eastAsia="宋体" w:hAnsi="Times New Roman"/>
-          <w:color w:val="000000"/>
-          <w:sz w:val="18"/>
-          <w:szCs w:val="18"/>
-        </w:rPr>
-        <w:t xml:space="preserve">任务族是契约化合成任务，确定性求解器降低了模型噪声但也限制了外部有效性；10个种子是统计簇，不能把1440题当1440个独立样本；漂移和断源日程是协议内设定，不代表真实世界分布；本地时延不等于网络调用或模型token成本；同Agent试跑存在先前答案暴露。历史全库回归中的间歇失败和真实junction创建限制仍按原记录保留，不能因本次专项通过而改写。</w:t>
-      </w:r>
-    </w:p>
-    <w:p>
-      <w:pPr>
-        <w:pStyle w:val="Heading1"/>
-        <w:keepNext/>
-        <w:keepLines/>
-        <w:spacing w:after="80" w:before="120"/>
-        <w:jc w:val="center"/>
-      </w:pPr>
-      <w:r>
-        <w:rPr>
-          <w:rFonts w:ascii="Times New Roman" w:cs="Times New Roman" w:eastAsia="黑体" w:hAnsi="Times New Roman"/>
-          <w:b/>
-          <w:bCs/>
-          <w:color w:val="000000"/>
-          <w:sz w:val="26"/>
-          <w:szCs w:val="26"/>
-        </w:rPr>
-        <w:t xml:space="preserve">VIII. 结论与后续工作</w:t>
-      </w:r>
-    </w:p>
-    <w:p>
-      <w:pPr>
-        <w:spacing w:after="50" w:line="260" w:lineRule="auto"/>
-        <w:ind w:firstLine="360"/>
-      </w:pPr>
-      <w:r>
-        <w:rPr>
-          <w:rFonts w:ascii="Times New Roman" w:cs="Times New Roman" w:eastAsia="宋体" w:hAnsi="Times New Roman"/>
-          <w:color w:val="000000"/>
-          <w:sz w:val="18"/>
-          <w:szCs w:val="18"/>
-        </w:rPr>
-        <w:t xml:space="preserve">本文把人的实践经验形成过程明确建模为：目标驱动行动，行动产生观察，观察与预期比较形成反馈，反馈经来源和条件验证后成为候选经验，候选经验通过重复实践和反例检验进入稳定或争议状态，并在版本变化和重启后继续接受验证。补天的数据库、证据、版本链、上下文恢复和反馈接口分别实现了这条过程的可观测环节。</w:t>
-      </w:r>
-    </w:p>
-    <w:p>
-      <w:pPr>
-        <w:spacing w:after="50" w:line="260" w:lineRule="auto"/>
-        <w:ind w:firstLine="360"/>
-      </w:pPr>
-      <w:r>
-        <w:rPr>
-          <w:rFonts w:ascii="Times New Roman" w:cs="Times New Roman" w:eastAsia="宋体" w:hAnsi="Times New Roman"/>
-          <w:color w:val="000000"/>
-          <w:sz w:val="18"/>
-          <w:szCs w:val="18"/>
-        </w:rPr>
-        <w:t xml:space="preserve">实验支持三条限定结论：第一，在契约化任务中，带版本准入的规则复用策略比精确索引基线少81.60%源读取；取消版本准入的对照出现133次旧版本错误；第二，持久化使重启后的经验可以继续参与召回；第三，Beta更新和Thompson控制在合成数值环境中符合既定公式。代价是更多逻辑操作和本地时延。本文不声称模型参数自进化、完整Bayesian RL或普遍语言模型收益。后续应把同一实践流程接入真实宿主AI，按首次答案冻结、客观工具结果、反馈、复用和反例逐轮记录，以检验人的实践模型是否真正改善宿主Agent在同类问题上的任务结果。</w:t>
-      </w:r>
-    </w:p>
-    <w:p>
-      <w:pPr>
-        <w:pStyle w:val="Heading1"/>
-        <w:keepNext/>
-        <w:keepLines/>
-        <w:spacing w:after="80" w:before="120"/>
-        <w:jc w:val="center"/>
-      </w:pPr>
-      <w:r>
-        <w:rPr>
-          <w:rFonts w:ascii="Times New Roman" w:cs="Times New Roman" w:eastAsia="黑体" w:hAnsi="Times New Roman"/>
-          <w:b/>
-          <w:bCs/>
-          <w:color w:val="000000"/>
-          <w:sz w:val="26"/>
-          <w:szCs w:val="26"/>
-        </w:rPr>
-        <w:t xml:space="preserve">参考文献</w:t>
-      </w:r>
-    </w:p>
-    <w:p>
-      <w:pPr>
-        <w:spacing w:after="60" w:line="320"/>
-        <w:ind w:left="420" w:hanging="420"/>
-      </w:pPr>
-      <w:r>
-        <w:rPr>
-          <w:rFonts w:ascii="Times New Roman" w:cs="Times New Roman" w:eastAsia="Times New Roman" w:hAnsi="Times New Roman"/>
-          <w:sz w:val="18"/>
-          <w:szCs w:val="18"/>
-        </w:rPr>
-        <w:t xml:space="preserve">[1] </w:t>
-      </w:r>
-      <w:r>
-        <w:rPr>
-          <w:rFonts w:ascii="Times New Roman" w:cs="Times New Roman" w:eastAsia="宋体" w:hAnsi="Times New Roman"/>
-          <w:color w:val="000000"/>
-          <w:sz w:val="18"/>
-          <w:szCs w:val="18"/>
-        </w:rPr>
-        <w:t xml:space="preserve">Wanjun Zhong, Lianghong Guo, Qiqi Gao, et al. MemoryBank: Enhancing Large Language Models with Long-Term Memory[EB/OL]. arXiv, 2023. http://arxiv.org/pdf/2305.10250v3.</w:t>
-      </w:r>
-    </w:p>
-    <w:p>
-      <w:pPr>
-        <w:spacing w:after="60" w:line="320"/>
-        <w:ind w:left="420" w:hanging="420"/>
-      </w:pPr>
-      <w:r>
-        <w:rPr>
-          <w:rFonts w:ascii="Times New Roman" w:cs="Times New Roman" w:eastAsia="Times New Roman" w:hAnsi="Times New Roman"/>
-          <w:sz w:val="18"/>
-          <w:szCs w:val="18"/>
-        </w:rPr>
-        <w:t xml:space="preserve">[2] </w:t>
-      </w:r>
-      <w:r>
-        <w:rPr>
-          <w:rFonts w:ascii="Times New Roman" w:cs="Times New Roman" w:eastAsia="宋体" w:hAnsi="Times New Roman"/>
-          <w:color w:val="000000"/>
-          <w:sz w:val="18"/>
-          <w:szCs w:val="18"/>
-        </w:rPr>
-        <w:t xml:space="preserve">Di Wu, Hongwei Wang, Wenhao Yu, et al. LongMemEval: Benchmarking Chat Assistants on Long-Term Interactive Memory[EB/OL]. arXiv, 2024. http://arxiv.org/pdf/2410.10813v2.</w:t>
-      </w:r>
-    </w:p>
-    <w:p>
-      <w:pPr>
-        <w:spacing w:after="60" w:line="320"/>
-        <w:ind w:left="420" w:hanging="420"/>
-      </w:pPr>
-      <w:r>
-        <w:rPr>
-          <w:rFonts w:ascii="Times New Roman" w:cs="Times New Roman" w:eastAsia="Times New Roman" w:hAnsi="Times New Roman"/>
-          <w:sz w:val="18"/>
-          <w:szCs w:val="18"/>
-        </w:rPr>
-        <w:t xml:space="preserve">[3] </w:t>
-      </w:r>
-      <w:r>
-        <w:rPr>
-          <w:rFonts w:ascii="Times New Roman" w:cs="Times New Roman" w:eastAsia="宋体" w:hAnsi="Times New Roman"/>
-          <w:color w:val="000000"/>
-          <w:sz w:val="18"/>
-          <w:szCs w:val="18"/>
-        </w:rPr>
-        <w:t xml:space="preserve">M. T. Howard, "Experiential learning – a systematic review and revision of Kolb’s model," Interactive Learning Environments, 2020, doi: 10.1080/10494820.2019.1570279.</w:t>
-      </w:r>
-    </w:p>
-    <w:p>
-      <w:pPr>
-        <w:spacing w:after="60" w:line="320"/>
-        <w:ind w:left="420" w:hanging="420"/>
-      </w:pPr>
-      <w:r>
-        <w:rPr>
-          <w:rFonts w:ascii="Times New Roman" w:cs="Times New Roman" w:eastAsia="Times New Roman" w:hAnsi="Times New Roman"/>
-          <w:sz w:val="18"/>
-          <w:szCs w:val="18"/>
-        </w:rPr>
-        <w:t xml:space="preserve">[4] </w:t>
-      </w:r>
-      <w:r>
-        <w:rPr>
-          <w:rFonts w:ascii="Times New Roman" w:cs="Times New Roman" w:eastAsia="宋体" w:hAnsi="Times New Roman"/>
-          <w:color w:val="000000"/>
-          <w:sz w:val="18"/>
-          <w:szCs w:val="18"/>
-        </w:rPr>
-        <w:t xml:space="preserve">Noah Shinn, Federico Cassano, Edward Berman, et al. Reflexion: Language Agents with Verbal Reinforcement Learning[EB/OL]. arXiv, 2023. http://arxiv.org/pdf/2303.11366v4.</w:t>
-      </w:r>
-    </w:p>
-    <w:p>
-      <w:pPr>
-        <w:spacing w:after="60" w:line="320"/>
-        <w:ind w:left="420" w:hanging="420"/>
-      </w:pPr>
-      <w:r>
-        <w:rPr>
-          <w:rFonts w:ascii="Times New Roman" w:cs="Times New Roman" w:eastAsia="Times New Roman" w:hAnsi="Times New Roman"/>
-          <w:sz w:val="18"/>
-          <w:szCs w:val="18"/>
-        </w:rPr>
-        <w:t xml:space="preserve">[5] </w:t>
-      </w:r>
-      <w:r>
-        <w:rPr>
-          <w:rFonts w:ascii="Times New Roman" w:cs="Times New Roman" w:eastAsia="宋体" w:hAnsi="Times New Roman"/>
-          <w:color w:val="000000"/>
-          <w:sz w:val="18"/>
-          <w:szCs w:val="18"/>
-        </w:rPr>
-        <w:t xml:space="preserve">Guanzhi Wang, Yuqi Xie, Yunfan Jiang, et al. Voyager: An Open-Ended Embodied Agent with Large Language Models[EB/OL]. arXiv, 2023. http://arxiv.org/pdf/2305.16291v2.</w:t>
-      </w:r>
-    </w:p>
-    <w:p>
-      <w:pPr>
-        <w:spacing w:after="60" w:line="320"/>
-        <w:ind w:left="420" w:hanging="420"/>
-      </w:pPr>
-      <w:r>
-        <w:rPr>
-          <w:rFonts w:ascii="Times New Roman" w:cs="Times New Roman" w:eastAsia="Times New Roman" w:hAnsi="Times New Roman"/>
-          <w:sz w:val="18"/>
-          <w:szCs w:val="18"/>
-        </w:rPr>
-        <w:t xml:space="preserve">[6] </w:t>
-      </w:r>
-      <w:r>
-        <w:rPr>
-          <w:rFonts w:ascii="Times New Roman" w:cs="Times New Roman" w:eastAsia="宋体" w:hAnsi="Times New Roman"/>
-          <w:color w:val="000000"/>
-          <w:sz w:val="18"/>
-          <w:szCs w:val="18"/>
-        </w:rPr>
-        <w:t xml:space="preserve">Patrick Lewis, Ethan Perez, Aleksandara Piktus, et al. Retrieval-Augmented Generation for Knowledge-Intensive NLP Tasks[J], 2020.</w:t>
-      </w:r>
-    </w:p>
-    <w:p>
-      <w:pPr>
-        <w:spacing w:after="60" w:line="320"/>
-        <w:ind w:left="420" w:hanging="420"/>
-      </w:pPr>
-      <w:r>
-        <w:rPr>
-          <w:rFonts w:ascii="Times New Roman" w:cs="Times New Roman" w:eastAsia="Times New Roman" w:hAnsi="Times New Roman"/>
-          <w:sz w:val="18"/>
-          <w:szCs w:val="18"/>
-        </w:rPr>
-        <w:t xml:space="preserve">[7] </w:t>
-      </w:r>
-      <w:r>
-        <w:rPr>
-          <w:rFonts w:ascii="Times New Roman" w:cs="Times New Roman" w:eastAsia="宋体" w:hAnsi="Times New Roman"/>
-          <w:color w:val="000000"/>
-          <w:sz w:val="18"/>
-          <w:szCs w:val="18"/>
-        </w:rPr>
-        <w:t xml:space="preserve">毛泽东, ‘实践论,’ 毛泽东选集, 第1卷. 北京: 人民出版社, 1991, pp. 282–297. 原作1937年7月; 高校电子转载核验.</w:t>
-      </w:r>
-    </w:p>
-    <w:p>
-      <w:pPr>
-        <w:spacing w:after="60" w:line="320"/>
-        <w:ind w:left="420" w:hanging="420"/>
-      </w:pPr>
-      <w:r>
-        <w:rPr>
-          <w:rFonts w:ascii="Times New Roman" w:cs="Times New Roman" w:eastAsia="Times New Roman" w:hAnsi="Times New Roman"/>
-          <w:sz w:val="18"/>
-          <w:szCs w:val="18"/>
-        </w:rPr>
-        <w:t xml:space="preserve">[8] </w:t>
-      </w:r>
-      <w:r>
-        <w:rPr>
-          <w:rFonts w:ascii="Times New Roman" w:cs="Times New Roman" w:eastAsia="宋体" w:hAnsi="Times New Roman"/>
-          <w:color w:val="000000"/>
-          <w:sz w:val="18"/>
-          <w:szCs w:val="18"/>
-        </w:rPr>
-        <w:t xml:space="preserve">H. M. W., K. M. J, "A Distributed Representation of Temporal Context," Journal of Mathematical Psychology, 2002, doi: 10.1006/jmps.2001.1388.</w:t>
-      </w:r>
-    </w:p>
-    <w:p>
-      <w:pPr>
-        <w:spacing w:after="60" w:line="320"/>
-        <w:ind w:left="420" w:hanging="420"/>
-      </w:pPr>
-      <w:r>
-        <w:rPr>
-          <w:rFonts w:ascii="Times New Roman" w:cs="Times New Roman" w:eastAsia="Times New Roman" w:hAnsi="Times New Roman"/>
-          <w:sz w:val="18"/>
-          <w:szCs w:val="18"/>
-        </w:rPr>
-        <w:t xml:space="preserve">[9] </w:t>
-      </w:r>
-      <w:r>
-        <w:rPr>
-          <w:rFonts w:ascii="Times New Roman" w:cs="Times New Roman" w:eastAsia="宋体" w:hAnsi="Times New Roman"/>
-          <w:color w:val="000000"/>
-          <w:sz w:val="18"/>
-          <w:szCs w:val="18"/>
-        </w:rPr>
-        <w:t xml:space="preserve">R. D. J., V. R. Benjamin, K. Abbas, O. Ian, W. Zheng, "A Tutorial on Thompson Sampling," 2018, doi: 10.1561/9781680834710.</w:t>
-      </w:r>
-    </w:p>
-    <w:p>
-      <w:pPr>
-        <w:pStyle w:val="Heading1"/>
-        <w:keepNext/>
-        <w:keepLines/>
-        <w:spacing w:after="80" w:before="120"/>
-        <w:jc w:val="center"/>
-      </w:pPr>
-      <w:r>
-        <w:rPr>
-          <w:rFonts w:ascii="Times New Roman" w:cs="Times New Roman" w:eastAsia="黑体" w:hAnsi="Times New Roman"/>
-          <w:b/>
-          <w:bCs/>
-          <w:color w:val="000000"/>
-          <w:sz w:val="26"/>
-          <w:szCs w:val="26"/>
-        </w:rPr>
-        <w:t xml:space="preserve">附录 A：实现映射与复现实验</w:t>
-      </w:r>
-    </w:p>
-    <w:p>
-      <w:pPr>
-        <w:spacing w:after="50" w:line="260" w:lineRule="auto"/>
-        <w:ind w:firstLine="360"/>
-      </w:pPr>
-      <w:r>
-        <w:rPr>
-          <w:rFonts w:ascii="Times New Roman" w:cs="Times New Roman" w:eastAsia="宋体" w:hAnsi="Times New Roman"/>
-          <w:color w:val="000000"/>
-          <w:sz w:val="18"/>
-          <w:szCs w:val="18"/>
-        </w:rPr>
-        <w:t xml:space="preserve">核心实现与正文映射如下：MemoryStore和practice_observations实现经验保存与反馈；MemoryStore.put保存当前版本、父版本和来源事件；record_practice_outcome实现成功、失败和争议转移；compose_context实现候选上下文组装；parse_context负责实体、版本和完整性准入；backup与恢复模块保存服务状态和证据路径；math_models.py实现Beta、信息增益、效用和Thompson控制。逐函数签名、异常和源码散列见《逐模块算法与逻辑附录.md》，不以静态台账代替本文的机制解释。</w:t>
-      </w:r>
-    </w:p>
-    <w:p>
-      <w:pPr>
-        <w:spacing w:after="50" w:line="260" w:lineRule="auto"/>
-        <w:ind w:firstLine="360"/>
-      </w:pPr>
-      <w:r>
-        <w:rPr>
-          <w:rFonts w:ascii="Times New Roman" w:cs="Times New Roman" w:eastAsia="宋体" w:hAnsi="Times New Roman"/>
-          <w:color w:val="000000"/>
-          <w:sz w:val="18"/>
-          <w:szCs w:val="18"/>
-        </w:rPr>
-        <w:t xml:space="preserve">可复现实验文件包括run_multiround_study.py、run_practice_lifecycle_study.py、run_bayesian_bandit_experiments.py及experiment_results目录。主实验模型调用数为0；Bandit控制模型调用数为0；15条同Agent探索记录为非盲、存在上下文携带，不能作为独立样本。当前文档报告的是机制证据，不能替换尚未完成的真实宿主AI确认性实验。</w:t>
-      </w:r>
-    </w:p>
-    <w:p>
-      <w:pPr>
-        <w:pStyle w:val="Heading1"/>
-        <w:keepNext/>
-        <w:keepLines/>
-        <w:spacing w:after="80" w:before="120"/>
-        <w:jc w:val="center"/>
-      </w:pPr>
-      <w:r>
-        <w:rPr>
-          <w:rFonts w:ascii="Times New Roman" w:cs="Times New Roman" w:eastAsia="黑体" w:hAnsi="Times New Roman"/>
-          <w:b/>
-          <w:bCs/>
-          <w:color w:val="000000"/>
-          <w:sz w:val="26"/>
-          <w:szCs w:val="26"/>
-        </w:rPr>
-        <w:t xml:space="preserve">附录 B：实验图表</w:t>
+        <w:t xml:space="preserve">被接受候选通过真实record_practice_outcome写回，第一次成功仍为candidate，第二次成功后进入warm。该路径把做梦候选、工具验证和后续实践连接起来；后续反馈的参考值由同一合成任务生成器计算，评测器仍可访问参考值，不能将其解释成真实部署中的免费外部证据。实验中的归纳模板由宿主预先指定，实际脚本模型调用数为0；同种子重复轮次不视为独立统计样本。结果说明本协议中验证的作用，尚不能估计真实宿主自由归纳的成功率、token成本或跨领域泛化。</w:t>
       </w:r>
     </w:p>
     <w:p>
@@ -9077,7 +9467,7 @@
       <w:r>
         <w:drawing>
           <wp:inline distT="0" distB="0" distL="0" distR="0">
-            <wp:extent cx="2952750" cy="1933575"/>
+            <wp:extent cx="2952750" cy="1847850"/>
             <wp:effectExtent t="0" r="0" b="0" l="0"/>
             <wp:docPr id="1" name="" descr="" title=""/>
             <wp:cNvGraphicFramePr>
@@ -9102,7 +9492,7 @@
                   <pic:spPr bwMode="auto">
                     <a:xfrm>
                       <a:off x="0" y="0"/>
-                      <a:ext cx="2952750" cy="1933575"/>
+                      <a:ext cx="2952750" cy="1847850"/>
                     </a:xfrm>
                     <a:prstGeom prst="rect">
                       <a:avLst/>
@@ -9127,7 +9517,631 @@
           <w:sz w:val="18"/>
           <w:szCs w:val="18"/>
         </w:rPr>
-        <w:t xml:space="preserve">图6 实践过程中的取证、召回和写回操作。</w:t>
+        <w:t xml:space="preserve">图6 做梦三条件的正确任务数、后续读源与验证访问。</w:t>
+      </w:r>
+    </w:p>
+    <w:p>
+      <w:pPr>
+        <w:pStyle w:val="Heading2"/>
+        <w:keepNext/>
+        <w:keepLines/>
+        <w:spacing w:after="80" w:before="120"/>
+      </w:pPr>
+      <w:r>
+        <w:rPr>
+          <w:rFonts w:ascii="Times New Roman" w:cs="Times New Roman" w:eastAsia="黑体" w:hAnsi="Times New Roman"/>
+          <w:b/>
+          <w:bCs/>
+          <w:color w:val="000000"/>
+          <w:sz w:val="22"/>
+          <w:szCs w:val="22"/>
+        </w:rPr>
+        <w:t xml:space="preserve">F. 结果解释</w:t>
+      </w:r>
+    </w:p>
+    <w:p>
+      <w:pPr>
+        <w:spacing w:after="50" w:line="260" w:lineRule="auto"/>
+        <w:ind w:firstLine="360"/>
+      </w:pPr>
+      <w:r>
+        <w:rPr>
+          <w:rFonts w:ascii="Times New Roman" w:cs="Times New Roman" w:eastAsia="宋体" w:hAnsi="Times New Roman"/>
+          <w:color w:val="000000"/>
+          <w:sz w:val="18"/>
+          <w:szCs w:val="18"/>
+        </w:rPr>
+        <w:t xml:space="preserve">主实验支持“已知规则可以在条件匹配时复用”的工程结论，没有证明经验主张如何由实践自动生成。B1只在首轮缓存规则，后续遇到新版本仍可读取来源，但不再缓存新规则；它的局限是重复取证，而非必然输出旧版本错误。候选形成、验证门槛和失败争议由另一项接口控制覆盖，不能将两项独立控制拼接成已经实测的完整端到端收益。Bandit控制的收益来自探索样本分配，与主实验中的实践证据生命周期是不同层次。两组数据不能合并为一个模型效果数字。</w:t>
+      </w:r>
+    </w:p>
+    <w:p>
+      <w:pPr>
+        <w:pStyle w:val="Heading1"/>
+        <w:keepNext/>
+        <w:keepLines/>
+        <w:spacing w:after="80" w:before="120"/>
+        <w:jc w:val="center"/>
+      </w:pPr>
+      <w:r>
+        <w:rPr>
+          <w:rFonts w:ascii="Times New Roman" w:cs="Times New Roman" w:eastAsia="黑体" w:hAnsi="Times New Roman"/>
+          <w:b/>
+          <w:bCs/>
+          <w:color w:val="000000"/>
+          <w:sz w:val="26"/>
+          <w:szCs w:val="26"/>
+        </w:rPr>
+        <w:t xml:space="preserve">VII. 讨论：从人的实践逻辑到宿主智能体机制</w:t>
+      </w:r>
+    </w:p>
+    <w:p>
+      <w:pPr>
+        <w:pStyle w:val="Heading2"/>
+        <w:keepNext/>
+        <w:keepLines/>
+        <w:spacing w:after="80" w:before="120"/>
+      </w:pPr>
+      <w:r>
+        <w:rPr>
+          <w:rFonts w:ascii="Times New Roman" w:cs="Times New Roman" w:eastAsia="黑体" w:hAnsi="Times New Roman"/>
+          <w:b/>
+          <w:bCs/>
+          <w:color w:val="000000"/>
+          <w:sz w:val="22"/>
+          <w:szCs w:val="22"/>
+        </w:rPr>
+        <w:t xml:space="preserve">A. 这套模型模拟了什么</w:t>
+      </w:r>
+    </w:p>
+    <w:p>
+      <w:pPr>
+        <w:spacing w:after="50" w:line="260" w:lineRule="auto"/>
+        <w:ind w:firstLine="360"/>
+      </w:pPr>
+      <w:r>
+        <w:rPr>
+          <w:rFonts w:ascii="Times New Roman" w:cs="Times New Roman" w:eastAsia="宋体" w:hAnsi="Times New Roman"/>
+          <w:color w:val="000000"/>
+          <w:sz w:val="18"/>
+          <w:szCs w:val="18"/>
+        </w:rPr>
+        <w:t xml:space="preserve">模型模拟的是人的实践结构，而不是人的全部心理过程。它保留目标、行动、结果、条件、证据、反例、修订和再实践这些可以在工程中观察的部分。毛泽东《实践论》关于认识来源于实践并在实践中检验的思想可作为研究设计的哲学指导</w:t>
+      </w:r>
+      <w:r>
+        <w:rPr>
+          <w:rFonts w:ascii="Times New Roman" w:cs="Times New Roman" w:eastAsia="Times New Roman" w:hAnsi="Times New Roman"/>
+          <w:sz w:val="16"/>
+          <w:szCs w:val="16"/>
+          <w:vertAlign w:val="superscript"/>
+        </w:rPr>
+        <w:t xml:space="preserve">[7]</w:t>
+      </w:r>
+      <w:r>
+        <w:rPr>
+          <w:rFonts w:ascii="Times New Roman" w:cs="Times New Roman" w:eastAsia="宋体" w:hAnsi="Times New Roman"/>
+          <w:color w:val="000000"/>
+          <w:sz w:val="18"/>
+          <w:szCs w:val="18"/>
+        </w:rPr>
+        <w:t xml:space="preserve">，但哲学思想不是程序正确性的证据；程序正确性仍由状态守卫、事务和实验结果支持。已有长期记忆研究也提示恢复时必须携带任务情境，但软件字段与人的记忆不能直接等同</w:t>
+      </w:r>
+      <w:r>
+        <w:rPr>
+          <w:rFonts w:ascii="Times New Roman" w:cs="Times New Roman" w:eastAsia="Times New Roman" w:hAnsi="Times New Roman"/>
+          <w:sz w:val="16"/>
+          <w:szCs w:val="16"/>
+          <w:vertAlign w:val="superscript"/>
+        </w:rPr>
+        <w:t xml:space="preserve">[1-2]</w:t>
+      </w:r>
+      <w:r>
+        <w:rPr>
+          <w:rFonts w:ascii="Times New Roman" w:cs="Times New Roman" w:eastAsia="宋体" w:hAnsi="Times New Roman"/>
+          <w:color w:val="000000"/>
+          <w:sz w:val="18"/>
+          <w:szCs w:val="18"/>
+        </w:rPr>
+        <w:t xml:space="preserve">。</w:t>
+      </w:r>
+    </w:p>
+    <w:p>
+      <w:pPr>
+        <w:pStyle w:val="Heading2"/>
+        <w:keepNext/>
+        <w:keepLines/>
+        <w:spacing w:after="80" w:before="120"/>
+      </w:pPr>
+      <w:r>
+        <w:rPr>
+          <w:rFonts w:ascii="Times New Roman" w:cs="Times New Roman" w:eastAsia="黑体" w:hAnsi="Times New Roman"/>
+          <w:b/>
+          <w:bCs/>
+          <w:color w:val="000000"/>
+          <w:sz w:val="22"/>
+          <w:szCs w:val="22"/>
+        </w:rPr>
+        <w:t xml:space="preserve">B. 贝叶斯不是经验本身</w:t>
+      </w:r>
+    </w:p>
+    <w:p>
+      <w:pPr>
+        <w:spacing w:after="50" w:line="260" w:lineRule="auto"/>
+        <w:ind w:firstLine="360"/>
+      </w:pPr>
+      <w:r>
+        <w:rPr>
+          <w:rFonts w:ascii="Times New Roman" w:cs="Times New Roman" w:eastAsia="宋体" w:hAnsi="Times New Roman"/>
+          <w:color w:val="000000"/>
+          <w:sz w:val="18"/>
+          <w:szCs w:val="18"/>
+        </w:rPr>
+        <w:t xml:space="preserve">时间上下文模型讨论了记忆提取与变化情境的关系</w:t>
+      </w:r>
+      <w:r>
+        <w:rPr>
+          <w:rFonts w:ascii="Times New Roman" w:cs="Times New Roman" w:eastAsia="Times New Roman" w:hAnsi="Times New Roman"/>
+          <w:sz w:val="16"/>
+          <w:szCs w:val="16"/>
+          <w:vertAlign w:val="superscript"/>
+        </w:rPr>
+        <w:t xml:space="preserve">[8]</w:t>
+      </w:r>
+      <w:r>
+        <w:rPr>
+          <w:rFonts w:ascii="Times New Roman" w:cs="Times New Roman" w:eastAsia="宋体" w:hAnsi="Times New Roman"/>
+          <w:color w:val="000000"/>
+          <w:sz w:val="18"/>
+          <w:szCs w:val="18"/>
+        </w:rPr>
+        <w:t xml:space="preserve">，本文仅借此说明恢复应携带环境，而不以认知模型证明SQLite结构等同于人类记忆。Thompson Sampling的教程讨论了根据后验采样进行探索的框架</w:t>
+      </w:r>
+      <w:r>
+        <w:rPr>
+          <w:rFonts w:ascii="Times New Roman" w:cs="Times New Roman" w:eastAsia="Times New Roman" w:hAnsi="Times New Roman"/>
+          <w:sz w:val="16"/>
+          <w:szCs w:val="16"/>
+          <w:vertAlign w:val="superscript"/>
+        </w:rPr>
+        <w:t xml:space="preserve">[9]</w:t>
+      </w:r>
+      <w:r>
+        <w:rPr>
+          <w:rFonts w:ascii="Times New Roman" w:cs="Times New Roman" w:eastAsia="宋体" w:hAnsi="Times New Roman"/>
+          <w:color w:val="000000"/>
+          <w:sz w:val="18"/>
+          <w:szCs w:val="18"/>
+        </w:rPr>
+        <w:t xml:space="preserve">；本文固定两臂控制仅覆盖其中最简单的平稳Bernoulli情形，不能把该结果推广到真实宿主行动的非平稳、部分可观测和延迟反馈环境。</w:t>
+      </w:r>
+    </w:p>
+    <w:p>
+      <w:pPr>
+        <w:spacing w:after="50" w:line="260" w:lineRule="auto"/>
+        <w:ind w:firstLine="360"/>
+      </w:pPr>
+      <w:r>
+        <w:rPr>
+          <w:rFonts w:ascii="Times New Roman" w:cs="Times New Roman" w:eastAsia="宋体" w:hAnsi="Times New Roman"/>
+          <w:color w:val="000000"/>
+          <w:sz w:val="18"/>
+          <w:szCs w:val="18"/>
+        </w:rPr>
+        <w:t xml:space="preserve">Beta后验回答“在当前工作模型下，证据如何改变可信度摘要”，不回答“人是否已经真正理解”，也不替代反例、版本和来源。贝叶斯更新是经验生命周期中的一个数值部件。Thompson Sampling回答“多个待验证行动如何分配探索机会”，不是经验形成的全部，也不是当前项目已经实现的完整强化学习。因此，探索分配器的性能与经验生命周期的有效性需要分别评估。</w:t>
+      </w:r>
+    </w:p>
+    <w:p>
+      <w:pPr>
+        <w:pStyle w:val="Heading2"/>
+        <w:keepNext/>
+        <w:keepLines/>
+        <w:spacing w:after="80" w:before="120"/>
+      </w:pPr>
+      <w:r>
+        <w:rPr>
+          <w:rFonts w:ascii="Times New Roman" w:cs="Times New Roman" w:eastAsia="黑体" w:hAnsi="Times New Roman"/>
+          <w:b/>
+          <w:bCs/>
+          <w:color w:val="000000"/>
+          <w:sz w:val="22"/>
+          <w:szCs w:val="22"/>
+        </w:rPr>
+        <w:t xml:space="preserve">C. 与宿主AI和模型训练的关系</w:t>
+      </w:r>
+    </w:p>
+    <w:p>
+      <w:pPr>
+        <w:spacing w:after="50" w:line="260" w:lineRule="auto"/>
+        <w:ind w:firstLine="360"/>
+      </w:pPr>
+      <w:r>
+        <w:rPr>
+          <w:rFonts w:ascii="Times New Roman" w:cs="Times New Roman" w:eastAsia="宋体" w:hAnsi="Times New Roman"/>
+          <w:color w:val="000000"/>
+          <w:sz w:val="18"/>
+          <w:szCs w:val="18"/>
+        </w:rPr>
+        <w:t xml:space="preserve">运行期经验库改变的是可召回上下文、证据和策略选择，不是模型参数。宿主AI可以读取候选、执行行动、提交反馈，但其自由文本回答必须单独记录首次答案、可见上下文、工具结果和反馈。当前15条同Agent非盲探索不能作为独立模型实验；主实验10080次也没有语言模型调用。经验可成为后训练候选资料，但要改变参数必须有训练前后固定评测、遗忘评估和回滚证据，本文没有把运行期写回称为自进化。</w:t>
+      </w:r>
+    </w:p>
+    <w:p>
+      <w:pPr>
+        <w:pStyle w:val="Heading2"/>
+        <w:keepNext/>
+        <w:keepLines/>
+        <w:spacing w:after="80" w:before="120"/>
+      </w:pPr>
+      <w:r>
+        <w:rPr>
+          <w:rFonts w:ascii="Times New Roman" w:cs="Times New Roman" w:eastAsia="黑体" w:hAnsi="Times New Roman"/>
+          <w:b/>
+          <w:bCs/>
+          <w:color w:val="000000"/>
+          <w:sz w:val="22"/>
+          <w:szCs w:val="22"/>
+        </w:rPr>
+        <w:t xml:space="preserve">D. 有效性威胁</w:t>
+      </w:r>
+    </w:p>
+    <w:p>
+      <w:pPr>
+        <w:spacing w:after="50" w:line="260" w:lineRule="auto"/>
+        <w:ind w:firstLine="360"/>
+      </w:pPr>
+      <w:r>
+        <w:rPr>
+          <w:rFonts w:ascii="Times New Roman" w:cs="Times New Roman" w:eastAsia="宋体" w:hAnsi="Times New Roman"/>
+          <w:color w:val="000000"/>
+          <w:sz w:val="18"/>
+          <w:szCs w:val="18"/>
+        </w:rPr>
+        <w:t xml:space="preserve">任务族是契约化合成任务，确定性求解器降低了模型噪声但也限制了外部有效性；10个种子是统计簇，不能把1440题当1440个独立样本；漂移和断源日程是协议内设定，不代表真实世界分布；本地时延不等于网络调用或模型token成本；同Agent试跑存在先前答案暴露。接口回归检查用于验证实现行为，不纳入任务收益统计。</w:t>
+      </w:r>
+    </w:p>
+    <w:p>
+      <w:pPr>
+        <w:pStyle w:val="Heading1"/>
+        <w:keepNext/>
+        <w:keepLines/>
+        <w:spacing w:after="80" w:before="120"/>
+        <w:jc w:val="center"/>
+      </w:pPr>
+      <w:r>
+        <w:rPr>
+          <w:rFonts w:ascii="Times New Roman" w:cs="Times New Roman" w:eastAsia="黑体" w:hAnsi="Times New Roman"/>
+          <w:b/>
+          <w:bCs/>
+          <w:color w:val="000000"/>
+          <w:sz w:val="26"/>
+          <w:szCs w:val="26"/>
+        </w:rPr>
+        <w:t xml:space="preserve">VIII. 结论与后续工作</w:t>
+      </w:r>
+    </w:p>
+    <w:p>
+      <w:pPr>
+        <w:spacing w:after="50" w:line="260" w:lineRule="auto"/>
+        <w:ind w:firstLine="360"/>
+      </w:pPr>
+      <w:r>
+        <w:rPr>
+          <w:rFonts w:ascii="Times New Roman" w:cs="Times New Roman" w:eastAsia="宋体" w:hAnsi="Times New Roman"/>
+          <w:color w:val="000000"/>
+          <w:sz w:val="18"/>
+          <w:szCs w:val="18"/>
+        </w:rPr>
+        <w:t xml:space="preserve">本文把人的实践经验形成过程明确建模为：目标驱动行动，行动产生观察，观察与预期比较形成反馈，反馈经来源和条件验证后成为候选经验，候选经验通过重复实践和反例检验进入稳定或争议状态，并在版本变化和重启后继续接受验证。补天的数据库、证据、版本链、上下文恢复和反馈接口分别实现了这条过程的可观测环节。</w:t>
+      </w:r>
+    </w:p>
+    <w:p>
+      <w:pPr>
+        <w:spacing w:after="50" w:line="260" w:lineRule="auto"/>
+        <w:ind w:firstLine="360"/>
+      </w:pPr>
+      <w:r>
+        <w:rPr>
+          <w:rFonts w:ascii="Times New Roman" w:cs="Times New Roman" w:eastAsia="宋体" w:hAnsi="Times New Roman"/>
+          <w:color w:val="000000"/>
+          <w:sz w:val="18"/>
+          <w:szCs w:val="18"/>
+        </w:rPr>
+        <w:t xml:space="preserve">实验支持三条限定结论：第一，在契约化任务中，带版本准入的规则复用策略比精确索引基线少81.60%源读取；取消版本准入的对照出现133次旧版本错误；第二，持久化使重启后的经验可以继续参与召回；第三，Beta更新和Thompson控制在合成数值环境中符合既定公式。新增做梦回放中，验证后复用与关闭条件均完成320题，计入验证后的取证访问减少37.5%；未经验证复用产生120次错误泛化。该结果支持在这两类任务中先求证后复用，不能推广为自由文本自主归纳收益。代价是更多逻辑操作和本地时延。本文不声称模型参数自进化、完整Bayesian RL或普遍语言模型收益。后续应把同一实践流程接入真实宿主AI，按首次答案冻结、客观工具结果、反馈、复用和反例逐轮记录，以检验人的实践模型是否真正改善宿主Agent在同类问题上的任务结果。</w:t>
+      </w:r>
+    </w:p>
+    <w:p>
+      <w:pPr>
+        <w:pStyle w:val="Heading1"/>
+        <w:keepNext/>
+        <w:keepLines/>
+        <w:spacing w:after="80" w:before="120"/>
+        <w:jc w:val="center"/>
+      </w:pPr>
+      <w:r>
+        <w:rPr>
+          <w:rFonts w:ascii="Times New Roman" w:cs="Times New Roman" w:eastAsia="黑体" w:hAnsi="Times New Roman"/>
+          <w:b/>
+          <w:bCs/>
+          <w:color w:val="000000"/>
+          <w:sz w:val="26"/>
+          <w:szCs w:val="26"/>
+        </w:rPr>
+        <w:t xml:space="preserve">参考文献</w:t>
+      </w:r>
+    </w:p>
+    <w:p>
+      <w:pPr>
+        <w:spacing w:after="60" w:line="320"/>
+        <w:ind w:left="420" w:hanging="420"/>
+      </w:pPr>
+      <w:r>
+        <w:rPr>
+          <w:rFonts w:ascii="Times New Roman" w:cs="Times New Roman" w:eastAsia="Times New Roman" w:hAnsi="Times New Roman"/>
+          <w:sz w:val="18"/>
+          <w:szCs w:val="18"/>
+        </w:rPr>
+        <w:t xml:space="preserve">[1] </w:t>
+      </w:r>
+      <w:r>
+        <w:rPr>
+          <w:rFonts w:ascii="Times New Roman" w:cs="Times New Roman" w:eastAsia="宋体" w:hAnsi="Times New Roman"/>
+          <w:color w:val="000000"/>
+          <w:sz w:val="18"/>
+          <w:szCs w:val="18"/>
+        </w:rPr>
+        <w:t xml:space="preserve">Wanjun Zhong, Lianghong Guo, Qiqi Gao, et al. MemoryBank: Enhancing Large Language Models with Long-Term Memory[EB/OL]. arXiv, 2023. http://arxiv.org/pdf/2305.10250v3.</w:t>
+      </w:r>
+    </w:p>
+    <w:p>
+      <w:pPr>
+        <w:spacing w:after="60" w:line="320"/>
+        <w:ind w:left="420" w:hanging="420"/>
+      </w:pPr>
+      <w:r>
+        <w:rPr>
+          <w:rFonts w:ascii="Times New Roman" w:cs="Times New Roman" w:eastAsia="Times New Roman" w:hAnsi="Times New Roman"/>
+          <w:sz w:val="18"/>
+          <w:szCs w:val="18"/>
+        </w:rPr>
+        <w:t xml:space="preserve">[2] </w:t>
+      </w:r>
+      <w:r>
+        <w:rPr>
+          <w:rFonts w:ascii="Times New Roman" w:cs="Times New Roman" w:eastAsia="宋体" w:hAnsi="Times New Roman"/>
+          <w:color w:val="000000"/>
+          <w:sz w:val="18"/>
+          <w:szCs w:val="18"/>
+        </w:rPr>
+        <w:t xml:space="preserve">Di Wu, Hongwei Wang, Wenhao Yu, et al. LongMemEval: Benchmarking Chat Assistants on Long-Term Interactive Memory[EB/OL]. arXiv, 2024. http://arxiv.org/pdf/2410.10813v2.</w:t>
+      </w:r>
+    </w:p>
+    <w:p>
+      <w:pPr>
+        <w:spacing w:after="60" w:line="320"/>
+        <w:ind w:left="420" w:hanging="420"/>
+      </w:pPr>
+      <w:r>
+        <w:rPr>
+          <w:rFonts w:ascii="Times New Roman" w:cs="Times New Roman" w:eastAsia="Times New Roman" w:hAnsi="Times New Roman"/>
+          <w:sz w:val="18"/>
+          <w:szCs w:val="18"/>
+        </w:rPr>
+        <w:t xml:space="preserve">[3] </w:t>
+      </w:r>
+      <w:r>
+        <w:rPr>
+          <w:rFonts w:ascii="Times New Roman" w:cs="Times New Roman" w:eastAsia="宋体" w:hAnsi="Times New Roman"/>
+          <w:color w:val="000000"/>
+          <w:sz w:val="18"/>
+          <w:szCs w:val="18"/>
+        </w:rPr>
+        <w:t xml:space="preserve">M. T. Howard, "Experiential learning – a systematic review and revision of Kolb’s model," Interactive Learning Environments, 2020, doi: 10.1080/10494820.2019.1570279.</w:t>
+      </w:r>
+    </w:p>
+    <w:p>
+      <w:pPr>
+        <w:spacing w:after="60" w:line="320"/>
+        <w:ind w:left="420" w:hanging="420"/>
+      </w:pPr>
+      <w:r>
+        <w:rPr>
+          <w:rFonts w:ascii="Times New Roman" w:cs="Times New Roman" w:eastAsia="Times New Roman" w:hAnsi="Times New Roman"/>
+          <w:sz w:val="18"/>
+          <w:szCs w:val="18"/>
+        </w:rPr>
+        <w:t xml:space="preserve">[4] </w:t>
+      </w:r>
+      <w:r>
+        <w:rPr>
+          <w:rFonts w:ascii="Times New Roman" w:cs="Times New Roman" w:eastAsia="宋体" w:hAnsi="Times New Roman"/>
+          <w:color w:val="000000"/>
+          <w:sz w:val="18"/>
+          <w:szCs w:val="18"/>
+        </w:rPr>
+        <w:t xml:space="preserve">Noah Shinn, Federico Cassano, Edward Berman, et al. Reflexion: Language Agents with Verbal Reinforcement Learning[EB/OL]. arXiv, 2023. http://arxiv.org/pdf/2303.11366v4.</w:t>
+      </w:r>
+    </w:p>
+    <w:p>
+      <w:pPr>
+        <w:spacing w:after="60" w:line="320"/>
+        <w:ind w:left="420" w:hanging="420"/>
+      </w:pPr>
+      <w:r>
+        <w:rPr>
+          <w:rFonts w:ascii="Times New Roman" w:cs="Times New Roman" w:eastAsia="Times New Roman" w:hAnsi="Times New Roman"/>
+          <w:sz w:val="18"/>
+          <w:szCs w:val="18"/>
+        </w:rPr>
+        <w:t xml:space="preserve">[5] </w:t>
+      </w:r>
+      <w:r>
+        <w:rPr>
+          <w:rFonts w:ascii="Times New Roman" w:cs="Times New Roman" w:eastAsia="宋体" w:hAnsi="Times New Roman"/>
+          <w:color w:val="000000"/>
+          <w:sz w:val="18"/>
+          <w:szCs w:val="18"/>
+        </w:rPr>
+        <w:t xml:space="preserve">Guanzhi Wang, Yuqi Xie, Yunfan Jiang, et al. Voyager: An Open-Ended Embodied Agent with Large Language Models[EB/OL]. arXiv, 2023. http://arxiv.org/pdf/2305.16291v2.</w:t>
+      </w:r>
+    </w:p>
+    <w:p>
+      <w:pPr>
+        <w:spacing w:after="60" w:line="320"/>
+        <w:ind w:left="420" w:hanging="420"/>
+      </w:pPr>
+      <w:r>
+        <w:rPr>
+          <w:rFonts w:ascii="Times New Roman" w:cs="Times New Roman" w:eastAsia="Times New Roman" w:hAnsi="Times New Roman"/>
+          <w:sz w:val="18"/>
+          <w:szCs w:val="18"/>
+        </w:rPr>
+        <w:t xml:space="preserve">[6] </w:t>
+      </w:r>
+      <w:r>
+        <w:rPr>
+          <w:rFonts w:ascii="Times New Roman" w:cs="Times New Roman" w:eastAsia="宋体" w:hAnsi="Times New Roman"/>
+          <w:color w:val="000000"/>
+          <w:sz w:val="18"/>
+          <w:szCs w:val="18"/>
+        </w:rPr>
+        <w:t xml:space="preserve">Patrick Lewis, Ethan Perez, Aleksandara Piktus, et al. Retrieval-Augmented Generation for Knowledge-Intensive NLP Tasks[J], 2020.</w:t>
+      </w:r>
+    </w:p>
+    <w:p>
+      <w:pPr>
+        <w:spacing w:after="60" w:line="320"/>
+        <w:ind w:left="420" w:hanging="420"/>
+      </w:pPr>
+      <w:r>
+        <w:rPr>
+          <w:rFonts w:ascii="Times New Roman" w:cs="Times New Roman" w:eastAsia="Times New Roman" w:hAnsi="Times New Roman"/>
+          <w:sz w:val="18"/>
+          <w:szCs w:val="18"/>
+        </w:rPr>
+        <w:t xml:space="preserve">[7] </w:t>
+      </w:r>
+      <w:r>
+        <w:rPr>
+          <w:rFonts w:ascii="Times New Roman" w:cs="Times New Roman" w:eastAsia="宋体" w:hAnsi="Times New Roman"/>
+          <w:color w:val="000000"/>
+          <w:sz w:val="18"/>
+          <w:szCs w:val="18"/>
+        </w:rPr>
+        <w:t xml:space="preserve">毛泽东, ‘实践论,’ 毛泽东选集, 第1卷. 北京: 人民出版社, 1991, pp. 282–297. 原作1937年7月; 高校电子转载核验.</w:t>
+      </w:r>
+    </w:p>
+    <w:p>
+      <w:pPr>
+        <w:spacing w:after="60" w:line="320"/>
+        <w:ind w:left="420" w:hanging="420"/>
+      </w:pPr>
+      <w:r>
+        <w:rPr>
+          <w:rFonts w:ascii="Times New Roman" w:cs="Times New Roman" w:eastAsia="Times New Roman" w:hAnsi="Times New Roman"/>
+          <w:sz w:val="18"/>
+          <w:szCs w:val="18"/>
+        </w:rPr>
+        <w:t xml:space="preserve">[8] </w:t>
+      </w:r>
+      <w:r>
+        <w:rPr>
+          <w:rFonts w:ascii="Times New Roman" w:cs="Times New Roman" w:eastAsia="宋体" w:hAnsi="Times New Roman"/>
+          <w:color w:val="000000"/>
+          <w:sz w:val="18"/>
+          <w:szCs w:val="18"/>
+        </w:rPr>
+        <w:t xml:space="preserve">H. M. W., K. M. J, "A Distributed Representation of Temporal Context," Journal of Mathematical Psychology, 2002, doi: 10.1006/jmps.2001.1388.</w:t>
+      </w:r>
+    </w:p>
+    <w:p>
+      <w:pPr>
+        <w:spacing w:after="60" w:line="320"/>
+        <w:ind w:left="420" w:hanging="420"/>
+      </w:pPr>
+      <w:r>
+        <w:rPr>
+          <w:rFonts w:ascii="Times New Roman" w:cs="Times New Roman" w:eastAsia="Times New Roman" w:hAnsi="Times New Roman"/>
+          <w:sz w:val="18"/>
+          <w:szCs w:val="18"/>
+        </w:rPr>
+        <w:t xml:space="preserve">[9] </w:t>
+      </w:r>
+      <w:r>
+        <w:rPr>
+          <w:rFonts w:ascii="Times New Roman" w:cs="Times New Roman" w:eastAsia="宋体" w:hAnsi="Times New Roman"/>
+          <w:color w:val="000000"/>
+          <w:sz w:val="18"/>
+          <w:szCs w:val="18"/>
+        </w:rPr>
+        <w:t xml:space="preserve">R. D. J., V. R. Benjamin, K. Abbas, O. Ian, W. Zheng, "A Tutorial on Thompson Sampling," 2018, doi: 10.1561/9781680834710.</w:t>
+      </w:r>
+    </w:p>
+    <w:p>
+      <w:pPr>
+        <w:pStyle w:val="Heading1"/>
+        <w:keepNext/>
+        <w:keepLines/>
+        <w:spacing w:after="80" w:before="120"/>
+        <w:jc w:val="center"/>
+      </w:pPr>
+      <w:r>
+        <w:rPr>
+          <w:rFonts w:ascii="Times New Roman" w:cs="Times New Roman" w:eastAsia="黑体" w:hAnsi="Times New Roman"/>
+          <w:b/>
+          <w:bCs/>
+          <w:color w:val="000000"/>
+          <w:sz w:val="26"/>
+          <w:szCs w:val="26"/>
+        </w:rPr>
+        <w:t xml:space="preserve">附录 A：实现映射与复现实验</w:t>
+      </w:r>
+    </w:p>
+    <w:p>
+      <w:pPr>
+        <w:spacing w:after="50" w:line="260" w:lineRule="auto"/>
+        <w:ind w:firstLine="360"/>
+      </w:pPr>
+      <w:r>
+        <w:rPr>
+          <w:rFonts w:ascii="Times New Roman" w:cs="Times New Roman" w:eastAsia="宋体" w:hAnsi="Times New Roman"/>
+          <w:color w:val="000000"/>
+          <w:sz w:val="18"/>
+          <w:szCs w:val="18"/>
+        </w:rPr>
+        <w:t xml:space="preserve">核心实现与正文映射如下：MemoryStore和practice_observations实现经验保存与反馈；MemoryStore.put保存当前版本、父版本和来源事件；record_practice_outcome实现成功、失败和争议转移；compose_context实现候选上下文组装；parse_context负责实体、版本和完整性准入；backup与恢复模块保存服务状态和证据路径；math_models.py实现Beta、信息增益、效用和Thompson控制。逐函数签名、异常和源码散列见《逐模块算法与逻辑附录.md》，不以静态台账代替本文的机制解释。</w:t>
+      </w:r>
+    </w:p>
+    <w:p>
+      <w:pPr>
+        <w:spacing w:after="50" w:line="260" w:lineRule="auto"/>
+        <w:ind w:firstLine="360"/>
+      </w:pPr>
+      <w:r>
+        <w:rPr>
+          <w:rFonts w:ascii="Times New Roman" w:cs="Times New Roman" w:eastAsia="宋体" w:hAnsi="Times New Roman"/>
+          <w:color w:val="000000"/>
+          <w:sz w:val="18"/>
+          <w:szCs w:val="18"/>
+        </w:rPr>
+        <w:t xml:space="preserve">可复现实验文件包括run_multiround_study.py、run_practice_lifecycle_study.py、run_dream_effect_study.py、run_bayesian_bandit_experiments.py及experiment_results目录。主实验模型调用数为0；Bandit控制模型调用数为0；15条同Agent探索记录为非盲、存在上下文携带，不能作为独立样本。当前文档报告的是机制证据，不能替换尚未完成的真实宿主AI确认性实验。</w:t>
+      </w:r>
+    </w:p>
+    <w:p>
+      <w:pPr>
+        <w:pStyle w:val="Heading1"/>
+        <w:keepNext/>
+        <w:keepLines/>
+        <w:spacing w:after="80" w:before="120"/>
+        <w:jc w:val="center"/>
+      </w:pPr>
+      <w:r>
+        <w:rPr>
+          <w:rFonts w:ascii="Times New Roman" w:cs="Times New Roman" w:eastAsia="黑体" w:hAnsi="Times New Roman"/>
+          <w:b/>
+          <w:bCs/>
+          <w:color w:val="000000"/>
+          <w:sz w:val="26"/>
+          <w:szCs w:val="26"/>
+        </w:rPr>
+        <w:t xml:space="preserve">附录 B：实验图表</w:t>
       </w:r>
     </w:p>
     <w:p>
@@ -9138,7 +10152,7 @@
       <w:r>
         <w:drawing>
           <wp:inline distT="0" distB="0" distL="0" distR="0">
-            <wp:extent cx="2952750" cy="2028825"/>
+            <wp:extent cx="2952750" cy="1933575"/>
             <wp:effectExtent t="0" r="0" b="0" l="0"/>
             <wp:docPr id="1" name="" descr="" title=""/>
             <wp:cNvGraphicFramePr>
@@ -9163,6 +10177,67 @@
                   <pic:spPr bwMode="auto">
                     <a:xfrm>
                       <a:off x="0" y="0"/>
+                      <a:ext cx="2952750" cy="1933575"/>
+                    </a:xfrm>
+                    <a:prstGeom prst="rect">
+                      <a:avLst/>
+                    </a:prstGeom>
+                  </pic:spPr>
+                </pic:pic>
+              </a:graphicData>
+            </a:graphic>
+          </wp:inline>
+        </w:drawing>
+      </w:r>
+    </w:p>
+    <w:p>
+      <w:pPr>
+        <w:spacing w:after="50" w:line="260" w:lineRule="auto"/>
+        <w:ind w:firstLine="360"/>
+      </w:pPr>
+      <w:r>
+        <w:rPr>
+          <w:rFonts w:ascii="Times New Roman" w:cs="Times New Roman" w:eastAsia="宋体" w:hAnsi="Times New Roman"/>
+          <w:color w:val="000000"/>
+          <w:sz w:val="18"/>
+          <w:szCs w:val="18"/>
+        </w:rPr>
+        <w:t xml:space="preserve">图7 实践过程中的取证、召回和写回操作。</w:t>
+      </w:r>
+    </w:p>
+    <w:p>
+      <w:pPr>
+        <w:spacing/>
+        <w:jc w:val="center"/>
+      </w:pPr>
+      <w:r>
+        <w:drawing>
+          <wp:inline distT="0" distB="0" distL="0" distR="0">
+            <wp:extent cx="2952750" cy="2028825"/>
+            <wp:effectExtent t="0" r="0" b="0" l="0"/>
+            <wp:docPr id="1" name="" descr="" title=""/>
+            <wp:cNvGraphicFramePr>
+              <a:graphicFrameLocks xmlns:a="http://schemas.openxmlformats.org/drawingml/2006/main" noChangeAspect="1"/>
+            </wp:cNvGraphicFramePr>
+            <a:graphic xmlns:a="http://schemas.openxmlformats.org/drawingml/2006/main">
+              <a:graphicData uri="http://schemas.openxmlformats.org/drawingml/2006/picture">
+                <pic:pic xmlns:pic="http://schemas.openxmlformats.org/drawingml/2006/picture">
+                  <pic:nvPicPr>
+                    <pic:cNvPr id="0" name="" descr=""/>
+                    <pic:cNvPicPr>
+                      <a:picLocks noChangeAspect="1" noChangeArrowheads="1"/>
+                    </pic:cNvPicPr>
+                  </pic:nvPicPr>
+                  <pic:blipFill>
+                    <a:blip r:embed="rId16" cstate="none"/>
+                    <a:srcRect/>
+                    <a:stretch>
+                      <a:fillRect/>
+                    </a:stretch>
+                  </pic:blipFill>
+                  <pic:spPr bwMode="auto">
+                    <a:xfrm>
+                      <a:off x="0" y="0"/>
                       <a:ext cx="2952750" cy="2028825"/>
                     </a:xfrm>
                     <a:prstGeom prst="rect">
@@ -9188,7 +10263,7 @@
           <w:sz w:val="18"/>
           <w:szCs w:val="18"/>
         </w:rPr>
-        <w:t xml:space="preserve">图7 种子簇配对效应。</w:t>
+        <w:t xml:space="preserve">图8 种子簇配对效应。</w:t>
       </w:r>
     </w:p>
     <w:p>

</xml_diff>

<commit_message>
docs: restrict public documentation to the paper and embedded figures
</commit_message>
<xml_diff>
--- a/docs/论文/补天多轮经验机制-IEEE.docx
+++ b/docs/论文/补天多轮经验机制-IEEE.docx
@@ -10106,7 +10106,7 @@
           <w:sz w:val="18"/>
           <w:szCs w:val="18"/>
         </w:rPr>
-        <w:t xml:space="preserve">核心实现与正文映射如下：MemoryStore和practice_observations实现经验保存与反馈；MemoryStore.put保存当前版本、父版本和来源事件；record_practice_outcome实现成功、失败和争议转移；compose_context实现候选上下文组装；parse_context负责实体、版本和完整性准入；backup与恢复模块保存服务状态和证据路径；math_models.py实现Beta、信息增益、效用和Thompson控制。逐函数签名、异常和源码散列见《逐模块算法与逻辑附录.md》，不以静态台账代替本文的机制解释。</w:t>
+        <w:t xml:space="preserve">核心实现与正文映射如下：经验存储负责保存当前版本、父版本和来源事件；实践记录负责处理成功、失败和争议转移；上下文组装与解析负责候选经验召回、实体版本和完整性准入；备份与恢复负责服务状态和证据路径；数学控制部分实现Beta、信息增益、效用和Thompson采样。本文直接给出关键模块、算法、约束和实验口径，不以未公开的静态台账代替机制解释。</w:t>
       </w:r>
     </w:p>
     <w:p>
@@ -10121,7 +10121,7 @@
           <w:sz w:val="18"/>
           <w:szCs w:val="18"/>
         </w:rPr>
-        <w:t xml:space="preserve">可复现实验文件包括run_multiround_study.py、run_practice_lifecycle_study.py、run_dream_effect_study.py、run_bayesian_bandit_experiments.py及experiment_results目录。主实验模型调用数为0；Bandit控制模型调用数为0；15条同Agent探索记录为非盲、存在上下文携带，不能作为独立样本。当前文档报告的是机制证据，不能替换尚未完成的真实宿主AI确认性实验。</w:t>
+        <w:t xml:space="preserve">本文报告的实验由确定性机制回放、生命周期对照、数学控制和做梦效果对照组成；主实验与控制实验均未调用语言模型。做梦效果对照使用宿主预先提供的候选模板，并通过真实的验证与记录接口产生证据，因此不是自主发现或独立模型实验。当前文档报告的是机制证据，不能替换尚未完成的真实宿主 AI 确认性实验。</w:t>
       </w:r>
     </w:p>
     <w:p>

</xml_diff>